<commit_message>
Gutachten Runde 4: auf 25 Seiten inkl. Quellen gekürzt, leere Fußnoten, nur Punkt und Komma
- Text so gekürzt, dass er auch mit Quellen in Musterlänge und ohne
  Silbentrennung höchstens 25 Seiten umfasst
- Fußnoten nur markiert und leer, an Definitionen ergänzt, aus
  Subsumtionssätzen entfernt
- keine Semikolons, Gedankenstriche oder Klammern außer Verweisen
- saubere Ergebnissätze im Gutachtenstil
- Überschrift „I. Anspruch entstanden“, auch im Inhaltsverzeichnis

Co-Authored-By: Claude Opus 5.5 <noreply@anthropic.com>
Claude-Session: https://claude.ai/code/session_01DkCFFMm4LNWVyZmozKU3DH
</commit_message>
<xml_diff>
--- a/Zivilrecht_Hausarbeit_WS_gekuerzt_25_Seiten.docx
+++ b/Zivilrecht_Hausarbeit_WS_gekuerzt_25_Seiten.docx
@@ -381,7 +381,7 @@
           <w:noProof/>
         </w:rPr>
         <w:tab/>
-        <w:t xml:space="preserve">Entstehung des Anspruchs</w:t>
+        <w:t xml:space="preserve">Anspruch entstanden</w:t>
       </w:r>
       <w:r>
         <w:rPr>
@@ -1311,7 +1311,7 @@
         <w:rPr>
           <w:noProof/>
         </w:rPr>
-        <w:t>4</w:t>
+        <w:t>3</w:t>
       </w:r>
       <w:r>
         <w:rPr>
@@ -1491,7 +1491,7 @@
         <w:rPr>
           <w:noProof/>
         </w:rPr>
-        <w:t>5</w:t>
+        <w:t>4</w:t>
       </w:r>
       <w:r>
         <w:rPr>
@@ -1731,7 +1731,7 @@
         <w:rPr>
           <w:noProof/>
         </w:rPr>
-        <w:t>6</w:t>
+        <w:t>5</w:t>
       </w:r>
       <w:r>
         <w:rPr>
@@ -1971,7 +1971,7 @@
         <w:rPr>
           <w:noProof/>
         </w:rPr>
-        <w:t>7</w:t>
+        <w:t>6</w:t>
       </w:r>
       <w:r>
         <w:rPr>
@@ -2151,7 +2151,7 @@
         <w:rPr>
           <w:noProof/>
         </w:rPr>
-        <w:t>8</w:t>
+        <w:t>7</w:t>
       </w:r>
       <w:r>
         <w:rPr>
@@ -2211,7 +2211,7 @@
         <w:rPr>
           <w:noProof/>
         </w:rPr>
-        <w:t>8</w:t>
+        <w:t>7</w:t>
       </w:r>
       <w:r>
         <w:rPr>
@@ -2271,7 +2271,7 @@
         <w:rPr>
           <w:noProof/>
         </w:rPr>
-        <w:t>9</w:t>
+        <w:t>8</w:t>
       </w:r>
       <w:r>
         <w:rPr>
@@ -2331,7 +2331,7 @@
         <w:rPr>
           <w:noProof/>
         </w:rPr>
-        <w:t>9</w:t>
+        <w:t>8</w:t>
       </w:r>
       <w:r>
         <w:rPr>
@@ -2391,7 +2391,7 @@
         <w:rPr>
           <w:noProof/>
         </w:rPr>
-        <w:t>9</w:t>
+        <w:t>8</w:t>
       </w:r>
       <w:r>
         <w:rPr>
@@ -2451,7 +2451,7 @@
         <w:rPr>
           <w:noProof/>
         </w:rPr>
-        <w:t>9</w:t>
+        <w:t>8</w:t>
       </w:r>
       <w:r>
         <w:rPr>
@@ -2631,7 +2631,7 @@
         <w:rPr>
           <w:noProof/>
         </w:rPr>
-        <w:t>10</w:t>
+        <w:t>9</w:t>
       </w:r>
       <w:r>
         <w:rPr>
@@ -2691,7 +2691,7 @@
         <w:rPr>
           <w:noProof/>
         </w:rPr>
-        <w:t>10</w:t>
+        <w:t>9</w:t>
       </w:r>
       <w:r>
         <w:rPr>
@@ -2811,7 +2811,7 @@
         <w:rPr>
           <w:noProof/>
         </w:rPr>
-        <w:t>11</w:t>
+        <w:t>10</w:t>
       </w:r>
       <w:r>
         <w:rPr>
@@ -2871,7 +2871,7 @@
         <w:rPr>
           <w:noProof/>
         </w:rPr>
-        <w:t>11</w:t>
+        <w:t>10</w:t>
       </w:r>
       <w:r>
         <w:rPr>
@@ -2931,7 +2931,7 @@
         <w:rPr>
           <w:noProof/>
         </w:rPr>
-        <w:t>11</w:t>
+        <w:t>10</w:t>
       </w:r>
       <w:r>
         <w:rPr>
@@ -2991,7 +2991,7 @@
         <w:rPr>
           <w:noProof/>
         </w:rPr>
-        <w:t>11</w:t>
+        <w:t>10</w:t>
       </w:r>
       <w:r>
         <w:rPr>
@@ -3051,7 +3051,7 @@
         <w:rPr>
           <w:noProof/>
         </w:rPr>
-        <w:t>11</w:t>
+        <w:t>10</w:t>
       </w:r>
       <w:r>
         <w:rPr>
@@ -3111,7 +3111,7 @@
         <w:rPr>
           <w:noProof/>
         </w:rPr>
-        <w:t>11</w:t>
+        <w:t>10</w:t>
       </w:r>
       <w:r>
         <w:rPr>
@@ -3171,7 +3171,7 @@
         <w:rPr>
           <w:noProof/>
         </w:rPr>
-        <w:t>12</w:t>
+        <w:t>11</w:t>
       </w:r>
       <w:r>
         <w:rPr>
@@ -3231,7 +3231,7 @@
         <w:rPr>
           <w:noProof/>
         </w:rPr>
-        <w:t>12</w:t>
+        <w:t>11</w:t>
       </w:r>
       <w:r>
         <w:rPr>
@@ -3291,7 +3291,7 @@
         <w:rPr>
           <w:noProof/>
         </w:rPr>
-        <w:t>12</w:t>
+        <w:t>11</w:t>
       </w:r>
       <w:r>
         <w:rPr>
@@ -3351,7 +3351,7 @@
         <w:rPr>
           <w:noProof/>
         </w:rPr>
-        <w:t>12</w:t>
+        <w:t>11</w:t>
       </w:r>
       <w:r>
         <w:rPr>
@@ -3411,7 +3411,7 @@
         <w:rPr>
           <w:noProof/>
         </w:rPr>
-        <w:t>12</w:t>
+        <w:t>11</w:t>
       </w:r>
       <w:r>
         <w:rPr>
@@ -3471,7 +3471,7 @@
         <w:rPr>
           <w:noProof/>
         </w:rPr>
-        <w:t>13</w:t>
+        <w:t>11</w:t>
       </w:r>
       <w:r>
         <w:rPr>
@@ -3531,7 +3531,7 @@
         <w:rPr>
           <w:noProof/>
         </w:rPr>
-        <w:t>13</w:t>
+        <w:t>12</w:t>
       </w:r>
       <w:r>
         <w:rPr>
@@ -3591,7 +3591,7 @@
         <w:rPr>
           <w:noProof/>
         </w:rPr>
-        <w:t>13</w:t>
+        <w:t>12</w:t>
       </w:r>
       <w:r>
         <w:rPr>
@@ -3651,7 +3651,7 @@
         <w:rPr>
           <w:noProof/>
         </w:rPr>
-        <w:t>14</w:t>
+        <w:t>13</w:t>
       </w:r>
       <w:r>
         <w:rPr>
@@ -3711,7 +3711,7 @@
         <w:rPr>
           <w:noProof/>
         </w:rPr>
-        <w:t>14</w:t>
+        <w:t>13</w:t>
       </w:r>
       <w:r>
         <w:rPr>
@@ -3771,7 +3771,7 @@
         <w:rPr>
           <w:noProof/>
         </w:rPr>
-        <w:t>15</w:t>
+        <w:t>13</w:t>
       </w:r>
       <w:r>
         <w:rPr>
@@ -3831,7 +3831,7 @@
         <w:rPr>
           <w:noProof/>
         </w:rPr>
-        <w:t>15</w:t>
+        <w:t>14</w:t>
       </w:r>
       <w:r>
         <w:rPr>
@@ -3891,7 +3891,7 @@
         <w:rPr>
           <w:noProof/>
         </w:rPr>
-        <w:t>15</w:t>
+        <w:t>14</w:t>
       </w:r>
       <w:r>
         <w:rPr>
@@ -3951,7 +3951,7 @@
         <w:rPr>
           <w:noProof/>
         </w:rPr>
-        <w:t>15</w:t>
+        <w:t>14</w:t>
       </w:r>
       <w:r>
         <w:rPr>
@@ -4011,7 +4011,7 @@
         <w:rPr>
           <w:noProof/>
         </w:rPr>
-        <w:t>16</w:t>
+        <w:t>14</w:t>
       </w:r>
       <w:r>
         <w:rPr>
@@ -4071,7 +4071,7 @@
         <w:rPr>
           <w:noProof/>
         </w:rPr>
-        <w:t>16</w:t>
+        <w:t>15</w:t>
       </w:r>
       <w:r>
         <w:rPr>
@@ -4131,7 +4131,7 @@
         <w:rPr>
           <w:noProof/>
         </w:rPr>
-        <w:t>16</w:t>
+        <w:t>15</w:t>
       </w:r>
       <w:r>
         <w:rPr>
@@ -4191,7 +4191,7 @@
         <w:rPr>
           <w:noProof/>
         </w:rPr>
-        <w:t>17</w:t>
+        <w:t>15</w:t>
       </w:r>
       <w:r>
         <w:rPr>
@@ -4251,7 +4251,7 @@
         <w:rPr>
           <w:noProof/>
         </w:rPr>
-        <w:t>17</w:t>
+        <w:t>16</w:t>
       </w:r>
       <w:r>
         <w:rPr>
@@ -4311,7 +4311,7 @@
         <w:rPr>
           <w:noProof/>
         </w:rPr>
-        <w:t>17</w:t>
+        <w:t>16</w:t>
       </w:r>
       <w:r>
         <w:rPr>
@@ -4371,7 +4371,7 @@
         <w:rPr>
           <w:noProof/>
         </w:rPr>
-        <w:t>17</w:t>
+        <w:t>16</w:t>
       </w:r>
       <w:r>
         <w:rPr>
@@ -4431,7 +4431,7 @@
         <w:rPr>
           <w:noProof/>
         </w:rPr>
-        <w:t>17</w:t>
+        <w:t>16</w:t>
       </w:r>
       <w:r>
         <w:rPr>
@@ -4491,7 +4491,7 @@
         <w:rPr>
           <w:noProof/>
         </w:rPr>
-        <w:t>18</w:t>
+        <w:t>16</w:t>
       </w:r>
       <w:r>
         <w:rPr>
@@ -4551,7 +4551,7 @@
         <w:rPr>
           <w:noProof/>
         </w:rPr>
-        <w:t>18</w:t>
+        <w:t>16</w:t>
       </w:r>
       <w:r>
         <w:rPr>
@@ -4611,7 +4611,7 @@
         <w:rPr>
           <w:noProof/>
         </w:rPr>
-        <w:t>18</w:t>
+        <w:t>16</w:t>
       </w:r>
       <w:r>
         <w:rPr>
@@ -4671,7 +4671,7 @@
         <w:rPr>
           <w:noProof/>
         </w:rPr>
-        <w:t>18</w:t>
+        <w:t>17</w:t>
       </w:r>
       <w:r>
         <w:rPr>
@@ -4701,7 +4701,7 @@
           <w:noProof/>
         </w:rPr>
         <w:tab/>
-        <w:t xml:space="preserve">Entstehung des Rückzahlungsanspruchs</w:t>
+        <w:t xml:space="preserve">Rückzahlungsanspruch entstanden</w:t>
       </w:r>
       <w:r>
         <w:rPr>
@@ -4731,7 +4731,7 @@
         <w:rPr>
           <w:noProof/>
         </w:rPr>
-        <w:t>18</w:t>
+        <w:t>17</w:t>
       </w:r>
       <w:r>
         <w:rPr>
@@ -4791,7 +4791,7 @@
         <w:rPr>
           <w:noProof/>
         </w:rPr>
-        <w:t>18</w:t>
+        <w:t>17</w:t>
       </w:r>
       <w:r>
         <w:rPr>
@@ -4851,7 +4851,7 @@
         <w:rPr>
           <w:noProof/>
         </w:rPr>
-        <w:t>18</w:t>
+        <w:t>17</w:t>
       </w:r>
       <w:r>
         <w:rPr>
@@ -4911,7 +4911,7 @@
         <w:rPr>
           <w:noProof/>
         </w:rPr>
-        <w:t>18</w:t>
+        <w:t>17</w:t>
       </w:r>
       <w:r>
         <w:rPr>
@@ -4971,7 +4971,7 @@
         <w:rPr>
           <w:noProof/>
         </w:rPr>
-        <w:t>19</w:t>
+        <w:t>17</w:t>
       </w:r>
       <w:r>
         <w:rPr>
@@ -5001,7 +5001,7 @@
           <w:noProof/>
         </w:rPr>
         <w:tab/>
-        <w:t xml:space="preserve">Erlöschen durch Aufrechnung, § 389 BGB</w:t>
+        <w:t xml:space="preserve">Rückzahlungsanspruch erloschen, § 389 BGB</w:t>
       </w:r>
       <w:r>
         <w:rPr>
@@ -5031,7 +5031,7 @@
         <w:rPr>
           <w:noProof/>
         </w:rPr>
-        <w:t>19</w:t>
+        <w:t>17</w:t>
       </w:r>
       <w:r>
         <w:rPr>
@@ -5091,7 +5091,7 @@
         <w:rPr>
           <w:noProof/>
         </w:rPr>
-        <w:t>19</w:t>
+        <w:t>17</w:t>
       </w:r>
       <w:r>
         <w:rPr>
@@ -5151,7 +5151,7 @@
         <w:rPr>
           <w:noProof/>
         </w:rPr>
-        <w:t>19</w:t>
+        <w:t>17</w:t>
       </w:r>
       <w:r>
         <w:rPr>
@@ -5211,7 +5211,7 @@
         <w:rPr>
           <w:noProof/>
         </w:rPr>
-        <w:t>19</w:t>
+        <w:t>18</w:t>
       </w:r>
       <w:r>
         <w:rPr>
@@ -5271,7 +5271,7 @@
         <w:rPr>
           <w:noProof/>
         </w:rPr>
-        <w:t>19</w:t>
+        <w:t>18</w:t>
       </w:r>
       <w:r>
         <w:rPr>
@@ -5331,7 +5331,7 @@
         <w:rPr>
           <w:noProof/>
         </w:rPr>
-        <w:t>19</w:t>
+        <w:t>18</w:t>
       </w:r>
       <w:r>
         <w:rPr>
@@ -5391,7 +5391,7 @@
         <w:rPr>
           <w:noProof/>
         </w:rPr>
-        <w:t>19</w:t>
+        <w:t>18</w:t>
       </w:r>
       <w:r>
         <w:rPr>
@@ -5451,7 +5451,7 @@
         <w:rPr>
           <w:noProof/>
         </w:rPr>
-        <w:t>20</w:t>
+        <w:t>19</w:t>
       </w:r>
       <w:r>
         <w:rPr>
@@ -5511,7 +5511,7 @@
         <w:rPr>
           <w:noProof/>
         </w:rPr>
-        <w:t>20</w:t>
+        <w:t>19</w:t>
       </w:r>
       <w:r>
         <w:rPr>
@@ -5571,7 +5571,7 @@
         <w:rPr>
           <w:noProof/>
         </w:rPr>
-        <w:t>20</w:t>
+        <w:t>19</w:t>
       </w:r>
       <w:r>
         <w:rPr>
@@ -5631,7 +5631,7 @@
         <w:rPr>
           <w:noProof/>
         </w:rPr>
-        <w:t>20</w:t>
+        <w:t>19</w:t>
       </w:r>
       <w:r>
         <w:rPr>
@@ -5691,7 +5691,7 @@
         <w:rPr>
           <w:noProof/>
         </w:rPr>
-        <w:t>21</w:t>
+        <w:t>19</w:t>
       </w:r>
       <w:r>
         <w:rPr>
@@ -5751,7 +5751,7 @@
         <w:rPr>
           <w:noProof/>
         </w:rPr>
-        <w:t>21</w:t>
+        <w:t>20</w:t>
       </w:r>
       <w:r>
         <w:rPr>
@@ -5811,7 +5811,7 @@
         <w:rPr>
           <w:noProof/>
         </w:rPr>
-        <w:t>22</w:t>
+        <w:t>20</w:t>
       </w:r>
       <w:r>
         <w:rPr>
@@ -5871,7 +5871,7 @@
         <w:rPr>
           <w:noProof/>
         </w:rPr>
-        <w:t>22</w:t>
+        <w:t>21</w:t>
       </w:r>
       <w:r>
         <w:rPr>
@@ -5931,7 +5931,7 @@
         <w:rPr>
           <w:noProof/>
         </w:rPr>
-        <w:t>22</w:t>
+        <w:t>21</w:t>
       </w:r>
       <w:r>
         <w:rPr>
@@ -5991,7 +5991,7 @@
         <w:rPr>
           <w:noProof/>
         </w:rPr>
-        <w:t>22</w:t>
+        <w:t>21</w:t>
       </w:r>
       <w:r>
         <w:rPr>
@@ -6051,7 +6051,7 @@
         <w:rPr>
           <w:noProof/>
         </w:rPr>
-        <w:t>22</w:t>
+        <w:t>21</w:t>
       </w:r>
       <w:r>
         <w:rPr>
@@ -6111,7 +6111,7 @@
         <w:rPr>
           <w:noProof/>
         </w:rPr>
-        <w:t>22</w:t>
+        <w:t>21</w:t>
       </w:r>
       <w:r>
         <w:rPr>
@@ -6171,7 +6171,7 @@
         <w:rPr>
           <w:noProof/>
         </w:rPr>
-        <w:t>22</w:t>
+        <w:t>21</w:t>
       </w:r>
       <w:r>
         <w:rPr>
@@ -6231,7 +6231,7 @@
         <w:rPr>
           <w:noProof/>
         </w:rPr>
-        <w:t>23</w:t>
+        <w:t>21</w:t>
       </w:r>
       <w:r>
         <w:rPr>
@@ -6291,7 +6291,7 @@
         <w:rPr>
           <w:noProof/>
         </w:rPr>
-        <w:t>23</w:t>
+        <w:t>21</w:t>
       </w:r>
       <w:r>
         <w:rPr>
@@ -6351,7 +6351,7 @@
         <w:rPr>
           <w:noProof/>
         </w:rPr>
-        <w:t>23</w:t>
+        <w:t>22</w:t>
       </w:r>
       <w:r>
         <w:rPr>
@@ -6411,7 +6411,7 @@
         <w:rPr>
           <w:noProof/>
         </w:rPr>
-        <w:t>23</w:t>
+        <w:t>22</w:t>
       </w:r>
       <w:r>
         <w:rPr>
@@ -6471,7 +6471,7 @@
         <w:rPr>
           <w:noProof/>
         </w:rPr>
-        <w:t>24</w:t>
+        <w:t>22</w:t>
       </w:r>
       <w:r>
         <w:rPr>
@@ -6531,7 +6531,7 @@
         <w:rPr>
           <w:noProof/>
         </w:rPr>
-        <w:t>24</w:t>
+        <w:t>22</w:t>
       </w:r>
       <w:r>
         <w:rPr>
@@ -6591,7 +6591,7 @@
         <w:rPr>
           <w:noProof/>
         </w:rPr>
-        <w:t>24</w:t>
+        <w:t>22</w:t>
       </w:r>
       <w:r>
         <w:rPr>
@@ -6651,7 +6651,7 @@
         <w:rPr>
           <w:noProof/>
         </w:rPr>
-        <w:t>24</w:t>
+        <w:t>23</w:t>
       </w:r>
       <w:r>
         <w:rPr>
@@ -6711,7 +6711,67 @@
         <w:rPr>
           <w:noProof/>
         </w:rPr>
-        <w:t>24</w:t>
+        <w:t>23</w:t>
+      </w:r>
+      <w:r>
+        <w:rPr>
+          <w:noProof/>
+        </w:rPr>
+        <w:fldChar w:fldCharType="end"/>
+      </w:r>
+    </w:p>
+    <w:p>
+      <w:pPr>
+        <w:pStyle w:val="Verzeichnis3"/>
+        <w:tabs>
+          <w:tab w:val="left" w:pos="908"/>
+          <w:tab w:val="right" w:leader="dot" w:pos="9062"/>
+        </w:tabs>
+        <w:ind w:left="908" w:right="567" w:hanging="454"/>
+        <w:jc w:val="left"/>
+      </w:pPr>
+      <w:r>
+        <w:rPr>
+          <w:noProof/>
+        </w:rPr>
+        <w:t xml:space="preserve">5.</w:t>
+      </w:r>
+      <w:r>
+        <w:rPr>
+          <w:noProof/>
+        </w:rPr>
+        <w:tab/>
+        <w:t xml:space="preserve">Zwischenergebnis zur Beeinträchtigung</w:t>
+      </w:r>
+      <w:r>
+        <w:rPr>
+          <w:noProof/>
+        </w:rPr>
+        <w:tab/>
+      </w:r>
+      <w:r>
+        <w:rPr>
+          <w:noProof/>
+        </w:rPr>
+        <w:fldChar w:fldCharType="begin"/>
+      </w:r>
+      <w:r>
+        <w:rPr>
+          <w:noProof/>
+        </w:rPr>
+        <w:instrText xml:space="preserve"> PAGEREF _TocG108 \h </w:instrText>
+      </w:r>
+      <w:r>
+        <w:rPr>
+          <w:noProof/>
+        </w:rPr>
+        <w:fldChar w:fldCharType="separate"/>
+      </w:r>
+      <w:r>
+        <w:rPr>
+          <w:noProof/>
+        </w:rPr>
+        <w:t>23</w:t>
       </w:r>
       <w:r>
         <w:rPr>
@@ -6759,7 +6819,7 @@
         <w:rPr>
           <w:noProof/>
         </w:rPr>
-        <w:instrText xml:space="preserve"> PAGEREF _TocG108 \h </w:instrText>
+        <w:instrText xml:space="preserve"> PAGEREF _TocG109 \h </w:instrText>
       </w:r>
       <w:r>
         <w:rPr>
@@ -6771,7 +6831,7 @@
         <w:rPr>
           <w:noProof/>
         </w:rPr>
-        <w:t>25</w:t>
+        <w:t>23</w:t>
       </w:r>
       <w:r>
         <w:rPr>
@@ -6819,7 +6879,7 @@
         <w:rPr>
           <w:noProof/>
         </w:rPr>
-        <w:instrText xml:space="preserve"> PAGEREF _TocG109 \h </w:instrText>
+        <w:instrText xml:space="preserve"> PAGEREF _TocG110 \h </w:instrText>
       </w:r>
       <w:r>
         <w:rPr>
@@ -6831,7 +6891,7 @@
         <w:rPr>
           <w:noProof/>
         </w:rPr>
-        <w:t>25</w:t>
+        <w:t>24</w:t>
       </w:r>
       <w:r>
         <w:rPr>
@@ -6879,7 +6939,7 @@
         <w:rPr>
           <w:noProof/>
         </w:rPr>
-        <w:instrText xml:space="preserve"> PAGEREF _TocG110 \h </w:instrText>
+        <w:instrText xml:space="preserve"> PAGEREF _TocG111 \h </w:instrText>
       </w:r>
       <w:r>
         <w:rPr>
@@ -6891,7 +6951,7 @@
         <w:rPr>
           <w:noProof/>
         </w:rPr>
-        <w:t>25</w:t>
+        <w:t>24</w:t>
       </w:r>
       <w:r>
         <w:rPr>
@@ -7461,7 +7521,7 @@
     </w:p>
     <w:p>
       <w:r>
-        <w:t xml:space="preserve">A könnte gegen K einen Anspruch auf Zahlung eines Maklerlohns in Höhe von 30.000 € aus § 652 I 1 haben. Dies setzt einen wirksamen Maklervertrag, eine Nachweis- oder Vermittlungsleistung der A und den Abschluss des Hauptvertrags infolge dieser Tätigkeit voraus.</w:t>
+        <w:t xml:space="preserve">A könnte gegen K einen Anspruch auf Maklerlohn in Höhe von 30.000 € aus § 652 I 1 haben. Voraussetzung sind ein wirksamer Maklervertrag, eine Nachweis- oder Vermittlungsleistung der A und der hierauf beruhende Abschluss des Hauptvertrags.</w:t>
       </w:r>
     </w:p>
     <w:p>
@@ -7477,7 +7537,7 @@
           <w:b/>
           <w:bCs/>
         </w:rPr>
-        <w:t xml:space="preserve">I. Entstehung des Anspruchs</w:t>
+        <w:t xml:space="preserve">I. Anspruch entstanden</w:t>
       </w:r>
       <w:bookmarkEnd w:id="5002"/>
     </w:p>
@@ -7527,7 +7587,7 @@
     </w:p>
     <w:p>
       <w:r>
-        <w:t xml:space="preserve">Ein Vertrag kommt durch zwei inhaltlich übereinstimmende Willenserklärungen, Angebot und Annahme, gem. §§ 145 ff. zustande.</w:t>
+        <w:t xml:space="preserve">Ein Vertrag setzt zwei übereinstimmende Willenserklärungen, Angebot und Annahme, voraus, §§ 145 ff.</w:t>
       </w:r>
       <w:r>
         <w:rPr>
@@ -7555,7 +7615,7 @@
     </w:p>
     <w:p>
       <w:r>
-        <w:t xml:space="preserve">Zunächst könnte bereits das von A erstellte Exposé ein Angebot i.S.d. § 145 darstellen. Ein Angebot ist eine empfangsbedürftige Willenserklärung, die alle vertragswesentlichen Bestandteile enthält.</w:t>
+        <w:t xml:space="preserve">Bereits das Exposé der A könnte ein Angebot i.S.d. § 145 sein. Ein Angebot ist eine empfangsbedürftige Willenserklärung, die alle wesentlichen Vertragsbestandteile enthält.</w:t>
       </w:r>
       <w:r>
         <w:rPr>
@@ -7564,7 +7624,7 @@
         <w:footnoteReference w:id="4"/>
       </w:r>
       <w:r>
-        <w:t xml:space="preserve"> Maßgeblich ist, ob aus Sicht eines objektiven Empfängers ein Rechtsbindungswille erkennbar ist, §§ 133, 157.</w:t>
+        <w:t xml:space="preserve"> Maßgeblich ist, ob ein objektiver Empfänger einen Rechtsbindungswillen erkennen kann, §§ 133, 157.</w:t>
       </w:r>
       <w:r>
         <w:rPr>
@@ -7573,13 +7633,7 @@
         <w:footnoteReference w:id="5"/>
       </w:r>
       <w:r>
-        <w:t xml:space="preserve"> Das Exposé weist zwar auf die Käuferprovision von 3 % hin, richtet sich aber an einen unbestimmten Kreis potenzieller Käufer, sodass A sich erkennbar nicht gegenüber jedem Leser binden wollte. Es ist daher lediglich eine invitatio ad offerendum.</w:t>
-      </w:r>
-      <w:r>
-        <w:rPr>
-          <w:rStyle w:val="Funotenzeichen"/>
-        </w:rPr>
-        <w:footnoteReference w:id="6"/>
+        <w:t xml:space="preserve"> Das Exposé nennt zwar die Käuferprovision von 3 %, richtet sich aber an einen unbestimmten Kreis möglicher Käufer. A wollte sich daher erkennbar nicht gegenüber jedem Leser binden. Das Exposé ist folglich nur eine invitatio ad offerendum.</w:t>
       </w:r>
     </w:p>
     <w:p>
@@ -7601,7 +7655,7 @@
     </w:p>
     <w:p>
       <w:r>
-        <w:t xml:space="preserve">Angebot und Annahme könnten jedoch in den Geschäftsräumen der A erklärt worden sein. Nachdem sich K auf das Exposé hin bei A gemeldet hatte, schlossen beide dort schriftlich einen Maklervertrag und gaben damit übereinstimmende Willenserklärungen ab.</w:t>
+        <w:t xml:space="preserve">Angebot und Annahme könnten aber in den Geschäftsräumen der A erklärt worden sein. Nachdem sich K auf das Exposé hin gemeldet hatte, schlossen A und K dort schriftlich einen Maklervertrag. Eine Einigung liegt somit vor.</w:t>
       </w:r>
     </w:p>
     <w:p>
@@ -7623,7 +7677,7 @@
     </w:p>
     <w:p>
       <w:r>
-        <w:t xml:space="preserve">Die formularmäßige Käuferprovision von 3 % müsste nach Maßgabe der §§ 305 ff. wirksamer Vertragsbestandteil geworden sein.</w:t>
+        <w:t xml:space="preserve">Die formularmäßige Käuferprovision von 3 % müsste nach den §§ 305 ff. wirksam Vertragsbestandteil geworden sein.</w:t>
       </w:r>
     </w:p>
     <w:p>
@@ -7645,16 +7699,16 @@
     </w:p>
     <w:p>
       <w:r>
-        <w:t xml:space="preserve">Zunächst müssten die §§ 305 ff. anwendbar sein; eine Bereichsausnahme nach § 310 IV greift nicht. Bei Verbraucherverträgen, also Verträgen zwischen einem Unternehmer und einem Verbraucher, gelten sie zudem mit den Maßgaben des § 310 III.</w:t>
-      </w:r>
-      <w:r>
-        <w:rPr>
-          <w:rStyle w:val="Funotenzeichen"/>
-        </w:rPr>
-        <w:footnoteReference w:id="7"/>
-      </w:r>
-      <w:r>
-        <w:t xml:space="preserve"> A handelt als gewerbliche Maklerin und damit als Unternehmerin i.S.d. § 14. K verfolgt mit dem Grundstückserwerb private Wohnzwecke und ist somit Verbraucherin i.S.d. § 13. Ein Verbrauchervertrag liegt vor.</w:t>
+        <w:t xml:space="preserve">Zunächst müssten die §§ 305 ff. anwendbar sein. Eine Bereichsausnahme nach § 310 IV greift nicht. Bei Verträgen zwischen einem Unternehmer und einem Verbraucher gelten sie mit den Maßgaben des § 310 III.</w:t>
+      </w:r>
+      <w:r>
+        <w:rPr>
+          <w:rStyle w:val="Funotenzeichen"/>
+        </w:rPr>
+        <w:footnoteReference w:id="6"/>
+      </w:r>
+      <w:r>
+        <w:t xml:space="preserve"> A handelt als gewerbliche Maklerin und ist damit Unternehmerin i.S.d. § 14. K erwirbt das Grundstück zu privaten Wohnzwecken und ist somit Verbraucherin i.S.d. § 13. Es liegt folglich ein Verbrauchervertrag vor.</w:t>
       </w:r>
     </w:p>
     <w:p>
@@ -7676,16 +7730,16 @@
     </w:p>
     <w:p>
       <w:r>
-        <w:t xml:space="preserve">Die Provisionsklausel müsste eine AGB sein. Erfasst sind nach § 305 I 1 vorformulierte Vertragsbedingungen, die für eine Vielzahl von Verträgen bestimmt sind und von einer Partei bei Vertragsschluss gestellt werden.</w:t>
-      </w:r>
-      <w:r>
-        <w:rPr>
-          <w:rStyle w:val="Funotenzeichen"/>
-        </w:rPr>
-        <w:footnoteReference w:id="8"/>
-      </w:r>
-      <w:r>
-        <w:t xml:space="preserve"> Das Formular, das A seit Langem standardmäßig für ihre Kunden verwendet, enthält die vorformulierte Käuferprovision von 3 %, die nicht individuell ausgehandelt wurde. Die Provisionsklausel ist somit eine AGB; jedenfalls gilt sie gem. § 310 III Nr. 1 als von A gestellt.</w:t>
+        <w:t xml:space="preserve">Die Provisionsklausel müsste eine AGB sein. AGB sind gem. § 305 I 1 alle für eine Vielzahl von Verträgen vorformulierten Vertragsbedingungen, die eine Vertragspartei der anderen bei Vertragsschluss stellt.</w:t>
+      </w:r>
+      <w:r>
+        <w:rPr>
+          <w:rStyle w:val="Funotenzeichen"/>
+        </w:rPr>
+        <w:footnoteReference w:id="7"/>
+      </w:r>
+      <w:r>
+        <w:t xml:space="preserve"> A verwendet das Formular mit der vorformulierten Käuferprovision von 3 % seit Langem für ihre Kunden. Ausgehandelt wurde die Klausel nicht. Sie ist somit eine AGB und gilt zudem gem. § 310 III Nr. 1 als von A gestellt.</w:t>
       </w:r>
     </w:p>
     <w:p>
@@ -7707,7 +7761,16 @@
     </w:p>
     <w:p>
       <w:r>
-        <w:t xml:space="preserve">Die Klausel müsste ferner gem. § 305 II wirksam in den Vertrag einbezogen worden sein. Dafür muss der Verwender bei Vertragsschluss auf die AGB hinweisen und der anderen Partei die Möglichkeit verschaffen, in zumutbarer Weise von ihrem Inhalt Kenntnis zu nehmen; zudem muss diese mit ihrer Geltung einverstanden sein.</w:t>
+        <w:t xml:space="preserve">Die Klausel müsste gem. § 305 II in den Vertrag einbezogen worden sein. Dafür muss der Verwender bei Vertragsschluss auf die AGB hinweisen und der anderen Partei die zumutbare Kenntnisnahme ermöglichen.</w:t>
+      </w:r>
+      <w:r>
+        <w:rPr>
+          <w:rStyle w:val="Funotenzeichen"/>
+        </w:rPr>
+        <w:footnoteReference w:id="8"/>
+      </w:r>
+      <w:r>
+        <w:t xml:space="preserve"> Diese muss zudem mit der Geltung einverstanden sein.</w:t>
       </w:r>
       <w:r>
         <w:rPr>
@@ -7716,7 +7779,7 @@
         <w:footnoteReference w:id="9"/>
       </w:r>
       <w:r>
-        <w:t xml:space="preserve"> Die Klausel war unmittelbar im Text des schriftlichen Formularvertrags enthalten, den A der K vorlegte. K konnte sie daher zur Kenntnis nehmen und erklärte sich durch den Vertragsschluss mit ihr einverstanden; sie ist einbezogen.</w:t>
+        <w:t xml:space="preserve"> Die Klausel stand im Formularvertrag, den A der K vorlegte. K konnte sie daher zur Kenntnis nehmen und war durch den Vertragsschluss mit ihr einverstanden. Die Klausel ist somit einbezogen.</w:t>
       </w:r>
     </w:p>
     <w:p>
@@ -7738,7 +7801,7 @@
     </w:p>
     <w:p>
       <w:r>
-        <w:t xml:space="preserve">Eine von der Klausel abweichende, gem. § 305b vorrangige Individualabrede zwischen A und K ist nicht ersichtlich.</w:t>
+        <w:t xml:space="preserve">Eine vorrangige Individualabrede i.S.d. § 305b ist nicht ersichtlich.</w:t>
       </w:r>
     </w:p>
     <w:p>
@@ -7760,7 +7823,7 @@
     </w:p>
     <w:p>
       <w:r>
-        <w:t xml:space="preserve">Die Klausel dürfte nicht überraschend i.S.d. § 305c I sein. Dies setzt voraus, dass sie objektiv ungewöhnlich ist und der Vertragspartner subjektiv nicht mit ihr rechnen musste.</w:t>
+        <w:t xml:space="preserve">Die Klausel dürfte nicht überraschend i.S.d. § 305c I sein. Das setzt voraus, dass sie objektiv ungewöhnlich ist und der Vertragspartner subjektiv nicht mit ihr rechnen musste.</w:t>
       </w:r>
       <w:r>
         <w:rPr>
@@ -7769,7 +7832,7 @@
         <w:footnoteReference w:id="10"/>
       </w:r>
       <w:r>
-        <w:t xml:space="preserve"> Objektiv ungewöhnlich ist sie, wenn sie deutlich von dem abweicht, was im redlichen Geschäftsverkehr üblicherweise zu erwarten ist.</w:t>
+        <w:t xml:space="preserve"> Objektiv ungewöhnlich ist eine Klausel, die deutlich von dem abweicht, was im redlichen Geschäftsverkehr üblich ist.</w:t>
       </w:r>
       <w:r>
         <w:rPr>
@@ -7787,7 +7850,7 @@
         <w:footnoteReference w:id="12"/>
       </w:r>
       <w:r>
-        <w:t xml:space="preserve"> Die Käuferprovision von 3 % ist marktüblich. Zudem hatte A bereits im Exposé, das K gründlich gelesen hatte, deutlich auf ihre Doppeltätigkeit und die Käuferprovision hingewiesen. K musste daher mit der Klausel rechnen; sie ist nicht überraschend.</w:t>
+        <w:t xml:space="preserve"> Eine Käuferprovision von 3 % ist marktüblich. Zudem hatte A im Exposé, das K gründlich gelesen hatte, deutlich auf die Käuferprovision hingewiesen. K musste somit mit der Klausel rechnen. Sie ist folglich nicht überraschend.</w:t>
       </w:r>
     </w:p>
     <w:p>
@@ -7809,7 +7872,7 @@
     </w:p>
     <w:p>
       <w:r>
-        <w:t xml:space="preserve">Die Klausel müsste schließlich einer Inhaltskontrolle standhalten. Gem. § 307 III 1 unterliegen AGB dieser nur, soweit sie von Rechtsvorschriften abweichen oder diese ergänzen.</w:t>
+        <w:t xml:space="preserve">Die Klausel müsste schließlich der Inhaltskontrolle standhalten. Dieser unterliegen AGB gem. § 307 III 1 nur, soweit sie von Rechtsvorschriften abweichen oder diese ergänzen.</w:t>
       </w:r>
       <w:r>
         <w:rPr>
@@ -7818,7 +7881,7 @@
         <w:footnoteReference w:id="13"/>
       </w:r>
       <w:r>
-        <w:t xml:space="preserve"> Preisabreden über die Hauptleistung sind mangels gesetzlicher Preisvorgaben grundsätzlich kontrollfrei.</w:t>
+        <w:t xml:space="preserve"> Preisabreden über die Hauptleistung sind daher grundsätzlich kontrollfrei.</w:t>
       </w:r>
       <w:r>
         <w:rPr>
@@ -7827,7 +7890,7 @@
         <w:footnoteReference w:id="14"/>
       </w:r>
       <w:r>
-        <w:t xml:space="preserve"> Da die Höhe der Maklerprovision gesetzlich nicht festgelegt ist, stellt die Käuferprovision von 3 % eine kontrollfreie Preisabrede dar. Anwendbar bleibt nach § 307 III 2 allerdings das Transparenzgebot des § 307 I 2, wonach AGB klar und verständlich formuliert sein müssen.</w:t>
+        <w:t xml:space="preserve"> Die Höhe der Maklerprovision ist gesetzlich nicht festgelegt, sodass die Käuferprovision von 3 % eine kontrollfreie Preisabrede ist. Gem. § 307 III 2 bleibt aber das Transparenzgebot des § 307 I 2 anwendbar, wonach AGB klar und verständlich sein müssen.</w:t>
       </w:r>
       <w:r>
         <w:rPr>
@@ -7836,7 +7899,7 @@
         <w:footnoteReference w:id="15"/>
       </w:r>
       <w:r>
-        <w:t xml:space="preserve"> Für K war eindeutig erkennbar, dass sie bei Abschluss des Kaufvertrags 3 % des Kaufpreises schuldet. Dass die Verkäuferprovision im Formular fehlt, berührt nicht die Klarheit der Käuferprovision, sondern allein die Überprüfbarkeit des § 656c I (dazu unter II.). Ein Verstoß gegen das Transparenzgebot liegt nicht vor.</w:t>
+        <w:t xml:space="preserve"> Für K war eindeutig erkennbar, dass sie bei Abschluss des Kaufvertrags 3 % des Kaufpreises schuldet. Dass die Verkäuferprovision im Formular fehlt, betrifft nicht die Klarheit der Käuferprovision, sondern nur die Überprüfbarkeit des § 656c I (dazu unter II.). Ein Verstoß gegen das Transparenzgebot liegt folglich nicht vor.</w:t>
       </w:r>
     </w:p>
     <w:p>
@@ -7858,7 +7921,7 @@
     </w:p>
     <w:p>
       <w:r>
-        <w:t xml:space="preserve">Die Provisionsklausel ist wirksamer Vertragsbestandteil geworden.</w:t>
+        <w:t xml:space="preserve">Die Provisionsklausel ist somit wirksamer Vertragsbestandteil.</w:t>
       </w:r>
     </w:p>
     <w:p>
@@ -7880,7 +7943,7 @@
     </w:p>
     <w:p>
       <w:r>
-        <w:t xml:space="preserve">Weiterhin könnten die besonderen Vorschriften der §§ 656a ff. auf den Maklervertrag anwendbar sein.</w:t>
+        <w:t xml:space="preserve">Weiterhin könnten die §§ 656a ff. anwendbar sein.</w:t>
       </w:r>
     </w:p>
     <w:p>
@@ -7902,7 +7965,7 @@
     </w:p>
     <w:p>
       <w:r>
-        <w:t xml:space="preserve">K müsste Verbraucherin sein, da die §§ 656c, 656d gem. § 656b nur gelten, wenn der Käufer einer Wohnung oder eines Einfamilienhauses Verbraucher i.S.d. § 13 ist.</w:t>
+        <w:t xml:space="preserve">K müsste Verbraucherin sein. Gem. § 656b gelten die §§ 656c, 656d nur, wenn der Käufer einer Wohnung oder eines Einfamilienhauses Verbraucher ist.</w:t>
       </w:r>
       <w:r>
         <w:rPr>
@@ -7911,7 +7974,7 @@
         <w:footnoteReference w:id="16"/>
       </w:r>
       <w:r>
-        <w:t xml:space="preserve"> Da K das Grundstück zu privaten Wohnzwecken erwirbt, ist dies der Fall (s.o.).</w:t>
+        <w:t xml:space="preserve"> Als private Erwerberin ist K somit Verbraucherin.</w:t>
       </w:r>
     </w:p>
     <w:p>
@@ -7933,7 +7996,7 @@
     </w:p>
     <w:p>
       <w:r>
-        <w:t xml:space="preserve">Zudem müsste das Kaufobjekt ein Einfamilienhaus sein. Fraglich ist, ob die Doppelhaushälfte trotz der vermieteten Einliegerwohnung und des Werkstattanbaus noch als solches anzusehen ist. Ein Einfamilienhaus i.S.d. §§ 656a ff. ist ein Gebäude, das in erster Linie den Wohnzwecken der Mitglieder eines einzelnen Haushalts dient;</w:t>
+        <w:t xml:space="preserve">Zudem müsste das Kaufobjekt ein Einfamilienhaus sein. Fraglich ist, ob die Doppelhaushälfte trotz der vermieteten Einliegerwohnung und des Werkstattanbaus noch als solches anzusehen ist. Ein Einfamilienhaus i.S.d. §§ 656a ff. ist ein Gebäude, das in erster Linie den Wohnzwecken der Mitglieder eines einzelnen Haushalts dient.</w:t>
       </w:r>
       <w:r>
         <w:rPr>
@@ -7942,7 +8005,7 @@
         <w:footnoteReference w:id="17"/>
       </w:r>
       <w:r>
-        <w:t xml:space="preserve"> hierunter können auch Doppelhaushälften fallen.</w:t>
+        <w:t xml:space="preserve"> Hierunter können auch Doppelhaushälften fallen.</w:t>
       </w:r>
       <w:r>
         <w:rPr>
@@ -7969,7 +8032,7 @@
         <w:footnoteReference w:id="20"/>
       </w:r>
       <w:r>
-        <w:t xml:space="preserve"> Nach anderer Ansicht ist der konkrete, für den Makler erkennbare Erwerbszweck des Käufers maßgeblich; angeführt wird insbesondere der Verbraucherschutzzweck der §§ 656a ff.</w:t>
+        <w:t xml:space="preserve"> Nach anderer Ansicht ist der konkrete, für den Makler erkennbare Erwerbszweck des Käufers maßgeblich. Angeführt wird vor allem der Verbraucherschutzzweck der §§ 656a ff.</w:t>
       </w:r>
       <w:r>
         <w:rPr>
@@ -7978,16 +8041,7 @@
         <w:footnoteReference w:id="21"/>
       </w:r>
       <w:r>
-        <w:t xml:space="preserve"> Der Streit kann dahinstehen, wenn beide Ansichten zum gleichen Ergebnis führen. Nach objektiver Betrachtung steht die Wohnnutzung der Doppelhaushälfte im Vordergrund. Die vermietete Einliegerwohnung ist ausdrücklich untergeordnet und der Werkstattanbau lediglich klein, sodass beide gegenüber der Nutzung durch einen Haushalt zurücktreten.</w:t>
-      </w:r>
-      <w:r>
-        <w:rPr>
-          <w:rStyle w:val="Funotenzeichen"/>
-        </w:rPr>
-        <w:footnoteReference w:id="22"/>
-      </w:r>
-      <w:r>
-        <w:t xml:space="preserve"> Auch nach dem Erwerbszweck liegt ein Einfamilienhaus vor, da K das Objekt zu privaten Wohnzwecken erwerben möchte. Dieser Zweck war für A bei einer privaten Interessentin, die eine Doppelhaushälfte erwerben will, auch erkennbar. Das Kaufobjekt ist somit ein Einfamilienhaus i.S.d. §§ 656a ff.</w:t>
+        <w:t xml:space="preserve"> Objektiv steht die Wohnnutzung der Doppelhaushälfte im Vordergrund. Die vermietete Einliegerwohnung ist ausdrücklich untergeordnet und der Werkstattanbau nur klein, sodass beide hinter der Nutzung durch einen Haushalt zurücktreten. Auch nach dem Erwerbszweck liegt ein Einfamilienhaus vor, da K das Objekt zu privaten Wohnzwecken erwerben möchte. Dies war für A bei einer privaten Interessentin, die eine Doppelhaushälfte erwerben will, auch erkennbar. Da beide Ansichten zum selben Ergebnis führen, kann der Streit dahinstehen. Das Kaufobjekt ist somit ein Einfamilienhaus i.S.d. §§ 656a ff.</w:t>
       </w:r>
     </w:p>
     <w:p>
@@ -8009,7 +8063,7 @@
     </w:p>
     <w:p>
       <w:r>
-        <w:t xml:space="preserve">Der Anwendungsbereich der §§ 656a ff. ist eröffnet.</w:t>
+        <w:t xml:space="preserve">Der Anwendungsbereich der §§ 656a ff. ist somit eröffnet.</w:t>
       </w:r>
     </w:p>
     <w:p>
@@ -8031,7 +8085,7 @@
     </w:p>
     <w:p>
       <w:r>
-        <w:t xml:space="preserve">Der Maklervertrag müsste den Anforderungen der §§ 656a ff. genügen.</w:t>
+        <w:t xml:space="preserve">Der Maklervertrag müsste die Vorgaben der §§ 656a ff. einhalten.</w:t>
       </w:r>
     </w:p>
     <w:p>
@@ -8053,7 +8107,16 @@
     </w:p>
     <w:p>
       <w:r>
-        <w:t xml:space="preserve">Der Maklervertrag müsste gem. § 656a in Textform i.S.d. § 126b geschlossen worden sein.</w:t>
+        <w:t xml:space="preserve">Der Maklervertrag müsste gem. § 656a in Textform geschlossen worden sein.</w:t>
+      </w:r>
+      <w:r>
+        <w:rPr>
+          <w:rStyle w:val="Funotenzeichen"/>
+        </w:rPr>
+        <w:footnoteReference w:id="22"/>
+      </w:r>
+      <w:r>
+        <w:t xml:space="preserve"> Diese erfordert gem. § 126b eine lesbare Erklärung, die die Person des Erklärenden nennt und auf einem dauerhaften Datenträger abgegeben wird.</w:t>
       </w:r>
       <w:r>
         <w:rPr>
@@ -8062,7 +8125,7 @@
         <w:footnoteReference w:id="23"/>
       </w:r>
       <w:r>
-        <w:t xml:space="preserve"> Erforderlich ist eine lesbare Erklärung, die die Person des Erklärenden nennt und auf einem dauerhaften Datenträger abgegeben wird.</w:t>
+        <w:t xml:space="preserve"> A und K schlossen den Vertrag schriftlich. Die strengere Schriftform wahrt zugleich die Textform.</w:t>
       </w:r>
       <w:r>
         <w:rPr>
@@ -8071,7 +8134,7 @@
         <w:footnoteReference w:id="24"/>
       </w:r>
       <w:r>
-        <w:t xml:space="preserve"> Der Maklervertrag zwischen A und K wurde schriftlich abgeschlossen. Die strengere Schriftform wahrt zugleich die Textform; § 656a ist eingehalten.</w:t>
+        <w:t xml:space="preserve"> Die Form des § 656a ist somit gewahrt.</w:t>
       </w:r>
     </w:p>
     <w:p>
@@ -8093,7 +8156,7 @@
     </w:p>
     <w:p>
       <w:r>
-        <w:t xml:space="preserve">Da A für beide Seiten tätig wurde, müsste sie zudem § 656c I 1 beachtet haben. Lässt sich ein Makler von beiden Parteien des Kaufvertrags einen Maklerlohn versprechen, darf dies danach nur in gleicher Höhe erfolgen (Halbteilungsgrundsatz).</w:t>
+        <w:t xml:space="preserve">Da A für beide Seiten tätig wurde, müsste sie zudem den Halbteilungsgrundsatz des § 656c I 1 beachtet haben. Danach darf sich ein Makler, der für beide Parteien des Kaufvertrags tätig wird, von beiden nur einen Maklerlohn in gleicher Höhe versprechen lassen.</w:t>
       </w:r>
       <w:r>
         <w:rPr>
@@ -8102,7 +8165,7 @@
         <w:footnoteReference w:id="25"/>
       </w:r>
       <w:r>
-        <w:t xml:space="preserve"> Eine gleichzeitige Beauftragung ist nicht erforderlich; es genügt, dass der Makler nacheinander für beide Seiten tätig wird.</w:t>
+        <w:t xml:space="preserve"> Er muss dabei nicht gleichzeitig von beiden Seiten beauftragt werden, sondern kann auch nacheinander für sie tätig werden.</w:t>
       </w:r>
       <w:r>
         <w:rPr>
@@ -8111,7 +8174,7 @@
         <w:footnoteReference w:id="26"/>
       </w:r>
       <w:r>
-        <w:t xml:space="preserve"> A wurde zunächst von V und anschließend, wie im Exposé angekündigt, von K beauftragt und vereinbarte mit beiden eine Provision von jeweils 3 % des Kaufpreises. § 656c I 1 ist damit eingehalten. K kann dies mangels Kenntnis des Vertrags zwischen A und V allerdings nicht überprüfen (dazu unter II.).</w:t>
+        <w:t xml:space="preserve"> A wurde zunächst von V und dann, wie im Exposé angekündigt, von K beauftragt und vereinbarte mit beiden jeweils 3 % des Kaufpreises. Die Vorgabe des § 656c I 1 ist somit eingehalten. Überprüfen kann K dies mangels Kenntnis des Vertrags mit V aber nicht (dazu unter II.).</w:t>
       </w:r>
     </w:p>
     <w:p>
@@ -8133,7 +8196,7 @@
     </w:p>
     <w:p>
       <w:r>
-        <w:t xml:space="preserve">Die Vorgaben der §§ 656a ff. sind gewahrt.</w:t>
+        <w:t xml:space="preserve">Die Vorgaben der §§ 656a ff. sind somit gewahrt.</w:t>
       </w:r>
     </w:p>
     <w:p>
@@ -8155,7 +8218,7 @@
     </w:p>
     <w:p>
       <w:r>
-        <w:t xml:space="preserve">Die Erklärung der K, sie wolle an den Maklervertrag nicht mehr gebunden sein, könnte ein Widerruf gem. § 355 I sein. Dieser setzt ein gesetzliches Widerrufsrecht voraus. Ein solches steht dem Verbraucher gem. § 312g I nur bei außerhalb von Geschäftsräumen geschlossenen Verträgen (§ 312b) und bei Fernabsatzverträgen (§ 312c) zu.</w:t>
+        <w:t xml:space="preserve">Die Erklärung der K, sie wolle an den Maklervertrag nicht mehr gebunden sein, könnte ein Widerruf gem. § 355 I sein. Dieser setzt ein gesetzliches Widerrufsrecht voraus.</w:t>
       </w:r>
       <w:r>
         <w:rPr>
@@ -8164,7 +8227,16 @@
         <w:footnoteReference w:id="27"/>
       </w:r>
       <w:r>
-        <w:t xml:space="preserve"> A und K schlossen den Maklervertrag bei gleichzeitiger Anwesenheit in den Geschäftsräumen der A, nachdem sich K auf das Exposé hin selbst an A gewandt hatte; auch § 312b I 1 Nr. 3 greift daher nicht, und ein Fernabsatzvertrag scheidet ebenfalls aus. K steht somit kein Widerrufsrecht zu.</w:t>
+        <w:t xml:space="preserve"> Ein solches hat der Verbraucher gem. § 312g I nur bei außerhalb von Geschäftsräumen geschlossenen Verträgen nach § 312b und bei Fernabsatzverträgen nach § 312c.</w:t>
+      </w:r>
+      <w:r>
+        <w:rPr>
+          <w:rStyle w:val="Funotenzeichen"/>
+        </w:rPr>
+        <w:footnoteReference w:id="28"/>
+      </w:r>
+      <w:r>
+        <w:t xml:space="preserve"> A und K schlossen den Vertrag bei gleichzeitiger Anwesenheit in den Geschäftsräumen der A, nachdem sich K auf das Exposé hin selbst an A gewandt hatte. Weder § 312b I 1 Nr. 3 noch § 312c greift daher ein. K steht somit kein Widerrufsrecht zu.</w:t>
       </w:r>
     </w:p>
     <w:p>
@@ -8192,10 +8264,10 @@
         <w:rPr>
           <w:rStyle w:val="Funotenzeichen"/>
         </w:rPr>
-        <w:footnoteReference w:id="28"/>
-      </w:r>
-      <w:r>
-        <w:t xml:space="preserve"> K gab ihre Erklärung erst ab, nachdem sie das Grundstück von V gekauft und A die Provision verlangt hatte. Eine etwaige Kündigung stünde dem Anspruch daher nicht entgegen.</w:t>
+        <w:footnoteReference w:id="29"/>
+      </w:r>
+      <w:r>
+        <w:t xml:space="preserve"> K gab ihre Erklärung erst nach dem Kaufvertrag mit V und dem Zahlungsverlangen der A ab. Eine etwaige Kündigung stünde dem Anspruch daher nicht entgegen.</w:t>
       </w:r>
     </w:p>
     <w:p>
@@ -8217,7 +8289,7 @@
     </w:p>
     <w:p>
       <w:r>
-        <w:t xml:space="preserve">Schließlich könnte der Maklervertrag gem. § 142 I als von Anfang an nichtig anzusehen sein, wenn K ihre auf seinen Abschluss gerichtete Willenserklärung wirksam angefochten hat.</w:t>
+        <w:t xml:space="preserve">Schließlich könnte der Maklervertrag gem. § 142 I von Anfang an nichtig sein, wenn K ihre Willenserklärung wirksam angefochten hat.</w:t>
       </w:r>
     </w:p>
     <w:p>
@@ -8239,16 +8311,7 @@
     </w:p>
     <w:p>
       <w:r>
-        <w:t xml:space="preserve">Zunächst müsste K die Anfechtung gegenüber A als ihrer Vertragspartnerin erklärt haben, § 143 I, II. Die Erklärung muss nicht ausdrücklich als Anfechtung bezeichnet werden;</w:t>
-      </w:r>
-      <w:r>
-        <w:rPr>
-          <w:rStyle w:val="Funotenzeichen"/>
-        </w:rPr>
-        <w:footnoteReference w:id="29"/>
-      </w:r>
-      <w:r>
-        <w:t xml:space="preserve"> es genügt, dass der Erklärende erkennbar macht, das Geschäft wegen eines Willensmangels nicht gelten lassen zu wollen.</w:t>
+        <w:t xml:space="preserve">Zunächst müsste K die Anfechtung gegenüber A als ihrer Vertragspartnerin erklärt haben, § 143 I, II. Der Begriff Anfechtung muss dabei nicht verwendet werden.</w:t>
       </w:r>
       <w:r>
         <w:rPr>
@@ -8257,7 +8320,16 @@
         <w:footnoteReference w:id="30"/>
       </w:r>
       <w:r>
-        <w:t xml:space="preserve"> Indem K gegenüber A erklärte, sie wolle an den Vertrag nicht mehr gebunden sein, weil sie die Bedeutung der Provisionspflicht nicht gekannt habe, hat sie die Anfechtung erklärt.</w:t>
+        <w:t xml:space="preserve"> Es genügt, dass der Erklärende erkennbar macht, das Geschäft wegen eines Willensmangels nicht gelten lassen zu wollen.</w:t>
+      </w:r>
+      <w:r>
+        <w:rPr>
+          <w:rStyle w:val="Funotenzeichen"/>
+        </w:rPr>
+        <w:footnoteReference w:id="31"/>
+      </w:r>
+      <w:r>
+        <w:t xml:space="preserve"> K erklärte gegenüber A, sie wolle an den Vertrag nicht mehr gebunden sein, weil sie nicht gewusst habe, was die Provisionspflicht bedeute. Damit hat sie die Anfechtung erklärt.</w:t>
       </w:r>
     </w:p>
     <w:p>
@@ -8279,16 +8351,7 @@
     </w:p>
     <w:p>
       <w:r>
-        <w:t xml:space="preserve">Daneben bedarf es eines Anfechtungsgrundes, wobei hier allein ein Irrtum nach § 119 I in Betracht kommt. Ein Erklärungsirrtum gem. § 119 I Alt. 2 liegt vor, wenn der Erklärende eine Erklärung dieses Inhalts überhaupt nicht abgeben wollte, etwa weil er sich verspricht oder verschreibt.</w:t>
-      </w:r>
-      <w:r>
-        <w:rPr>
-          <w:rStyle w:val="Funotenzeichen"/>
-        </w:rPr>
-        <w:footnoteReference w:id="31"/>
-      </w:r>
-      <w:r>
-        <w:t xml:space="preserve"> Bei einem Inhaltsirrtum gem. § 119 I Alt. 1 weiß der Erklärende dagegen, was er äußerlich erklärt, irrt aber über die Bedeutung seiner Erklärung.</w:t>
+        <w:t xml:space="preserve">Weiterhin bedarf es eines Anfechtungsgrundes, hier allein eines Irrtums nach § 119 I. Ein Erklärungsirrtum gem. § 119 I Alt. 2 liegt vor, wenn der Erklärende eine Erklärung dieses Inhalts überhaupt nicht abgeben wollte, etwa weil er sich verschreibt.</w:t>
       </w:r>
       <w:r>
         <w:rPr>
@@ -8297,7 +8360,16 @@
         <w:footnoteReference w:id="32"/>
       </w:r>
       <w:r>
-        <w:t xml:space="preserve"> K hatte das Exposé gründlich gelesen und den Maklervertrag bewusst geschlossen; dass sie sich verschrieben oder etwas anderes erklären wollte, ist nicht ersichtlich. Ein Erklärungsirrtum scheidet aus. Ob ihre Aussage, sie habe nicht gewusst, „was die Provisionspflicht bedeute“, einen Inhaltsirrtum begründet, hängt davon ab, ob ein beachtlicher Rechtsfolgenirrtum vorliegt.</w:t>
+        <w:t xml:space="preserve"> Bei einem Inhaltsirrtum gem. § 119 I Alt. 1 weiß der Erklärende, was er erklärt, irrt aber über die Bedeutung seiner Erklärung.</w:t>
+      </w:r>
+      <w:r>
+        <w:rPr>
+          <w:rStyle w:val="Funotenzeichen"/>
+        </w:rPr>
+        <w:footnoteReference w:id="33"/>
+      </w:r>
+      <w:r>
+        <w:t xml:space="preserve"> K hat den Maklervertrag nach gründlicher Lektüre des Exposés bewusst abgeschlossen. Dass sie sich verschrieben hat, ist nicht ersichtlich. Ein Erklärungsirrtum scheidet somit aus. Ob ihre Aussage, sie habe nicht gewusst, „was die Provisionspflicht bedeute“, einen Inhaltsirrtum begründet, hängt davon ab, ob ein beachtlicher Rechtsfolgenirrtum vorliegt.</w:t>
       </w:r>
     </w:p>
     <w:p>
@@ -8319,13 +8391,13 @@
     </w:p>
     <w:p>
       <w:r>
-        <w:t xml:space="preserve">K könnte einem beachtlichen Rechtsfolgenirrtum unterlegen sein. Ein solcher liegt vor, wenn das Rechtsgeschäft eine wesentlich andere als die vom Erklärenden vorgestellte Rechtsfolge auslöst.</w:t>
-      </w:r>
-      <w:r>
-        <w:rPr>
-          <w:rStyle w:val="Funotenzeichen"/>
-        </w:rPr>
-        <w:footnoteReference w:id="33"/>
+        <w:t xml:space="preserve">K könnte einem beachtlichen Rechtsfolgenirrtum unterlegen sein. Ein solcher liegt vor, wenn das Geschäft eine wesentlich andere als die vorgestellte Rechtsfolge auslöst.</w:t>
+      </w:r>
+      <w:r>
+        <w:rPr>
+          <w:rStyle w:val="Funotenzeichen"/>
+        </w:rPr>
+        <w:footnoteReference w:id="34"/>
       </w:r>
       <w:r>
         <w:t xml:space="preserve"> Problematisch ist, wann ein solcher Irrtum als Inhaltsirrtum beachtlich und wann er bloß unbeachtlicher Motivirrtum ist.</w:t>
@@ -8334,19 +8406,28 @@
         <w:rPr>
           <w:rStyle w:val="Funotenzeichen"/>
         </w:rPr>
-        <w:footnoteReference w:id="34"/>
-      </w:r>
-      <w:r>
-        <w:t xml:space="preserve"> Beachtlich ist er nur, wenn sich die Fehlvorstellung auf eine Rechtsfolge bezieht, die unmittelbarer Inhalt der Erklärung ist. Betrifft sie hingegen Rechtsfolgen, die kraft Gesetzes lediglich mittelbar an das Geschäft anknüpfen, ist sie unbeachtlich.</w:t>
-      </w:r>
-      <w:r>
-        <w:rPr>
-          <w:rStyle w:val="Funotenzeichen"/>
-        </w:rPr>
         <w:footnoteReference w:id="35"/>
       </w:r>
       <w:r>
-        <w:t xml:space="preserve"> K wusste aufgrund des gründlich gelesenen Exposés, dass auch die Käuferseite 3 % des Kaufpreises zu zahlen hat, und unterzeichnete sodann einen Vertrag mit genau dieser Provisionsabrede. Die Zahlungspflicht als unmittelbarer Erklärungsinhalt war ihr also bekannt; ihre erst nach der Zahlungsaufforderung geäußerte Unkenntnis betrifft allenfalls weitere gesetzliche Folgen dieser Verpflichtung. Es liegt daher nur ein unbeachtlicher Motivirrtum vor.</w:t>
+        <w:t xml:space="preserve"> Beachtlich ist er nur, wenn sich die Fehlvorstellung auf eine Rechtsfolge bezieht, die unmittelbarer Inhalt der Erklärung ist.</w:t>
+      </w:r>
+      <w:r>
+        <w:rPr>
+          <w:rStyle w:val="Funotenzeichen"/>
+        </w:rPr>
+        <w:footnoteReference w:id="36"/>
+      </w:r>
+      <w:r>
+        <w:t xml:space="preserve"> Knüpft die Rechtsfolge dagegen nur mittelbar kraft Gesetzes an das Geschäft an, ist der Irrtum unbeachtlich.</w:t>
+      </w:r>
+      <w:r>
+        <w:rPr>
+          <w:rStyle w:val="Funotenzeichen"/>
+        </w:rPr>
+        <w:footnoteReference w:id="37"/>
+      </w:r>
+      <w:r>
+        <w:t xml:space="preserve"> K wusste aus dem Exposé, dass auch die Käuferseite 3 % des Kaufpreises zahlen muss, und schloss dann einen Vertrag mit genau dieser Provisionsabrede. Die Zahlungspflicht als unmittelbarer Erklärungsinhalt war ihr somit bekannt. Ihre erst nach der Zahlungsaufforderung geäußerte Unkenntnis betrifft allenfalls weitere gesetzliche Folgen. Es liegt folglich nur ein unbeachtlicher Motivirrtum vor.</w:t>
       </w:r>
     </w:p>
     <w:p>
@@ -8368,7 +8449,7 @@
     </w:p>
     <w:p>
       <w:r>
-        <w:t xml:space="preserve">Mangels Anfechtungsgrundes ist der Maklervertrag nicht gem. § 142 I nichtig. Zwischen A und K besteht ein wirksamer Maklervertrag.</w:t>
+        <w:t xml:space="preserve">Mangels Anfechtungsgrundes ist der Vertrag nicht gem. § 142 I nichtig. Zwischen A und K besteht somit ein wirksamer Maklervertrag.</w:t>
       </w:r>
     </w:p>
     <w:p>
@@ -8390,25 +8471,7 @@
     </w:p>
     <w:p>
       <w:r>
-        <w:t xml:space="preserve">A müsste ferner die geschuldete Maklerleistung erbracht haben. Hierfür genügt nach § 652 I 1 der Nachweis der Gelegenheit zum Abschluss des Hauptvertrags oder dessen Vermittlung.</w:t>
-      </w:r>
-      <w:r>
-        <w:rPr>
-          <w:rStyle w:val="Funotenzeichen"/>
-        </w:rPr>
-        <w:footnoteReference w:id="36"/>
-      </w:r>
-      <w:r>
-        <w:t xml:space="preserve"> Ein Nachweis liegt vor, wenn der Makler seinem Kunden die konkrete Möglichkeit zum Abschluss des angestrebten Hauptvertrags aufzeigt.</w:t>
-      </w:r>
-      <w:r>
-        <w:rPr>
-          <w:rStyle w:val="Funotenzeichen"/>
-        </w:rPr>
-        <w:footnoteReference w:id="37"/>
-      </w:r>
-      <w:r>
-        <w:t xml:space="preserve"> K nahm das Exposé der A zur Kenntnis, in dem das Grundstück zum Kauf angeboten wurde. Einem Nachweis könnte allerdings entgegenstehen, dass K das Grundstück von Spaziergängen bereits seit Längerem kannte. Die bloße Kenntnis des Objekts ist jedoch von der Kenntnis der konkreten Vertragsgelegenheit zu unterscheiden;</w:t>
+        <w:t xml:space="preserve">A müsste ferner die geschuldete Maklerleistung erbracht haben. Nach § 652 I 1 genügt der Nachweis der Gelegenheit zum Abschluss des Hauptvertrags oder dessen Vermittlung.</w:t>
       </w:r>
       <w:r>
         <w:rPr>
@@ -8417,7 +8480,7 @@
         <w:footnoteReference w:id="38"/>
       </w:r>
       <w:r>
-        <w:t xml:space="preserve"> an Letzterer fehlt es, solange der Kunde nichts von der Verkaufsbereitschaft des Eigentümers weiß.</w:t>
+        <w:t xml:space="preserve"> Ein Nachweis liegt vor, wenn der Makler dem Kunden die konkrete Möglichkeit zum Abschluss des angestrebten Hauptvertrags aufzeigt.</w:t>
       </w:r>
       <w:r>
         <w:rPr>
@@ -8426,7 +8489,25 @@
         <w:footnoteReference w:id="39"/>
       </w:r>
       <w:r>
-        <w:t xml:space="preserve"> Von der Verkaufsabsicht der V und dem Kaufpreis erfuhr K erst durch das Exposé, sodass A ihr die Vertragsgelegenheit nachgewiesen hat.</w:t>
+        <w:t xml:space="preserve"> Einem Nachweis könnte entgegenstehen, dass K das Grundstück von Spaziergängen bereits seit Längerem kannte. Die bloße Kenntnis des Objekts ist aber von der Kenntnis der konkreten Vertragsgelegenheit zu unterscheiden.</w:t>
+      </w:r>
+      <w:r>
+        <w:rPr>
+          <w:rStyle w:val="Funotenzeichen"/>
+        </w:rPr>
+        <w:footnoteReference w:id="40"/>
+      </w:r>
+      <w:r>
+        <w:t xml:space="preserve"> An Letzterer fehlt es, solange der Kunde nichts von der Verkaufsbereitschaft des Eigentümers weiß.</w:t>
+      </w:r>
+      <w:r>
+        <w:rPr>
+          <w:rStyle w:val="Funotenzeichen"/>
+        </w:rPr>
+        <w:footnoteReference w:id="41"/>
+      </w:r>
+      <w:r>
+        <w:t xml:space="preserve"> Von der Verkaufsabsicht der V und dem Kaufpreis erfuhr K erst durch das Exposé der A. A hat ihr die Vertragsgelegenheit somit nachgewiesen.</w:t>
       </w:r>
     </w:p>
     <w:p>
@@ -8448,25 +8529,25 @@
     </w:p>
     <w:p>
       <w:r>
-        <w:t xml:space="preserve">Weiterhin müsste der Hauptvertrag wirksam zustande gekommen sein. Maßgeblich ist der Abschluss des schuldrechtlichen Vertrags;</w:t>
-      </w:r>
-      <w:r>
-        <w:rPr>
-          <w:rStyle w:val="Funotenzeichen"/>
-        </w:rPr>
-        <w:footnoteReference w:id="40"/>
-      </w:r>
-      <w:r>
-        <w:t xml:space="preserve"> auf dessen Durchführung kommt es nicht an.</w:t>
-      </w:r>
-      <w:r>
-        <w:rPr>
-          <w:rStyle w:val="Funotenzeichen"/>
-        </w:rPr>
-        <w:footnoteReference w:id="41"/>
-      </w:r>
-      <w:r>
-        <w:t xml:space="preserve"> Der zwischen V und K über 1.000.000 € geschlossene Grundstückskaufvertrag (§ 433) wurde gem. § 311b I 1 notariell beurkundet und ist wirksam.</w:t>
+        <w:t xml:space="preserve">Weiterhin müsste der Hauptvertrag wirksam zustande gekommen sein. Maßgeblich ist der Abschluss des schuldrechtlichen Vertrags.</w:t>
+      </w:r>
+      <w:r>
+        <w:rPr>
+          <w:rStyle w:val="Funotenzeichen"/>
+        </w:rPr>
+        <w:footnoteReference w:id="42"/>
+      </w:r>
+      <w:r>
+        <w:t xml:space="preserve"> Auf dessen Durchführung kommt es nicht an.</w:t>
+      </w:r>
+      <w:r>
+        <w:rPr>
+          <w:rStyle w:val="Funotenzeichen"/>
+        </w:rPr>
+        <w:footnoteReference w:id="43"/>
+      </w:r>
+      <w:r>
+        <w:t xml:space="preserve"> Der Grundstückskaufvertrag zwischen V und K über 1.000.000 € wurde gem. § 311b I 1 notariell beurkundet und ist somit wirksam.</w:t>
       </w:r>
     </w:p>
     <w:p>
@@ -8494,28 +8575,10 @@
         <w:rPr>
           <w:rStyle w:val="Funotenzeichen"/>
         </w:rPr>
-        <w:footnoteReference w:id="42"/>
-      </w:r>
-      <w:r>
-        <w:t xml:space="preserve"> Eine die Kausalität ausschließende Vorkenntnis bestand nicht, da K zwar das Grundstück, nicht aber die konkrete Verkaufsgelegenheit kannte (s.o.).</w:t>
-      </w:r>
-      <w:r>
-        <w:rPr>
-          <w:rStyle w:val="Funotenzeichen"/>
-        </w:rPr>
-        <w:footnoteReference w:id="43"/>
-      </w:r>
-      <w:r>
-        <w:t xml:space="preserve"> Fraglich ist jedoch, ob der Ursachenzusammenhang dadurch entfallen ist, dass V und K ihre Verhandlungen zunächst abbrachen und erst vier Monate später wieder aufnahmen. Eine bloß vorübergehende Unterbrechung der Verhandlungen genügt hierfür nicht.</w:t>
-      </w:r>
-      <w:r>
-        <w:rPr>
-          <w:rStyle w:val="Funotenzeichen"/>
-        </w:rPr>
         <w:footnoteReference w:id="44"/>
       </w:r>
       <w:r>
-        <w:t xml:space="preserve"> Entscheidend ist, ob zwischen Maklerleistung und Vertragsschluss noch ein angemessener zeitlicher Zusammenhang besteht;</w:t>
+        <w:t xml:space="preserve"> Eine die Kausalität ausschließende Vorkenntnis der K bestand nicht (s.o.). Fraglich ist aber, ob der Ursachenzusammenhang entfallen ist, weil V und K ihre Verhandlungen abbrachen und erst vier Monate später wieder aufnahmen. Eine bloß vorübergehende Unterbrechung genügt hierfür nicht.</w:t>
       </w:r>
       <w:r>
         <w:rPr>
@@ -8524,7 +8587,7 @@
         <w:footnoteReference w:id="45"/>
       </w:r>
       <w:r>
-        <w:t xml:space="preserve"> ein Abstand von bis zu einem Jahr kann dabei noch angemessen sein.</w:t>
+        <w:t xml:space="preserve"> Entscheidend ist, ob zwischen Maklerleistung und Vertragsschluss noch ein angemessener zeitlicher Zusammenhang besteht.</w:t>
       </w:r>
       <w:r>
         <w:rPr>
@@ -8533,7 +8596,16 @@
         <w:footnoteReference w:id="46"/>
       </w:r>
       <w:r>
-        <w:t xml:space="preserve"> Hier lagen lediglich vier Monate zwischen Abbruch und Wiederaufnahme, und der Vertrag kam über genau das nachgewiesene Grundstück zustande; der Ursachenzusammenhang besteht fort.</w:t>
+        <w:t xml:space="preserve"> Ein Abstand von bis zu einem Jahr kann dabei noch angemessen sein.</w:t>
+      </w:r>
+      <w:r>
+        <w:rPr>
+          <w:rStyle w:val="Funotenzeichen"/>
+        </w:rPr>
+        <w:footnoteReference w:id="47"/>
+      </w:r>
+      <w:r>
+        <w:t xml:space="preserve"> Hier lagen nur vier Monate zwischen Abbruch und Wiederaufnahme, und der Vertrag betraf genau das nachgewiesene Grundstück. Der Ursachenzusammenhang besteht somit fort.</w:t>
       </w:r>
     </w:p>
     <w:p>
@@ -8555,7 +8627,7 @@
     </w:p>
     <w:p>
       <w:r>
-        <w:t xml:space="preserve">Schließlich müsste der Anspruch in Höhe von 30.000 € bestehen. A und K vereinbarten 3 % des Kaufpreises von 1.000.000 €, mithin 30.000 €.</w:t>
+        <w:t xml:space="preserve">A und K vereinbarten 3 % des Kaufpreises von 1.000.000 €. Der Anspruch besteht somit in Höhe von 30.000 €.</w:t>
       </w:r>
     </w:p>
     <w:p>
@@ -8577,7 +8649,7 @@
     </w:p>
     <w:p>
       <w:r>
-        <w:t xml:space="preserve">Der Provisionsanspruch der A ist entstanden.</w:t>
+        <w:t xml:space="preserve">Der Provisionsanspruch der A ist somit entstanden.</w:t>
       </w:r>
     </w:p>
     <w:p>
@@ -8599,7 +8671,7 @@
     </w:p>
     <w:p>
       <w:r>
-        <w:t xml:space="preserve">Der Provisionsanspruch müsste zudem durchsetzbar sein. Daran bestehen Zweifel, weil K ihre Zahlung von der Vorlage des Maklervertrags zwischen A und V abhängig macht.</w:t>
+        <w:t xml:space="preserve">Fraglich ist, ob A den Anspruch auch durchsetzen kann, da K die Zahlung von der Vorlage des Vertrags zwischen A und V abhängig macht.</w:t>
       </w:r>
     </w:p>
     <w:p>
@@ -8621,16 +8693,7 @@
     </w:p>
     <w:p>
       <w:r>
-        <w:t xml:space="preserve">K könnte gegen A ein Anspruch auf Auskunft über die mit V vereinbarte Provision aus § 242 zustehen, da sie mangels Kenntnis des Vertrags zwischen A und V nicht überprüfen kann, ob A den Halbteilungsgrundsatz des § 656c I 1 eingehalten hat. § 656c enthält keinen ausdrücklichen Auskunftsanspruch des Maklerkunden, weshalb umstritten ist, ob sich ein solcher aus § 242 ergeben kann.</w:t>
-      </w:r>
-      <w:r>
-        <w:rPr>
-          <w:rStyle w:val="Funotenzeichen"/>
-        </w:rPr>
-        <w:footnoteReference w:id="47"/>
-      </w:r>
-      <w:r>
-        <w:t xml:space="preserve"> Teilweise wird ein solcher Anspruch bejaht, wenn der Maklerkunde zur Kontrolle der Halbteilung auf Informationen des Maklers angewiesen ist.</w:t>
+        <w:t xml:space="preserve">K könnte gegen A aus § 242 ein Anspruch auf Auskunft über die mit V vereinbarte Provision zustehen, da sie ohne Kenntnis dieses Vertrags nicht prüfen kann, ob A den Halbteilungsgrundsatz des § 656c I 1 eingehalten hat. Da § 656c keinen ausdrücklichen Auskunftsanspruch enthält, ist umstritten, ob sich ein solcher aus § 242 ergibt.</w:t>
       </w:r>
       <w:r>
         <w:rPr>
@@ -8639,7 +8702,7 @@
         <w:footnoteReference w:id="48"/>
       </w:r>
       <w:r>
-        <w:t xml:space="preserve"> Nach anderer Ansicht fehlt es mangels gesetzlicher Regelung an einer Grundlage.</w:t>
+        <w:t xml:space="preserve"> Teilweise wird er bejaht, wenn der Maklerkunde zur Kontrolle der Halbteilung auf Informationen des Maklers angewiesen ist.</w:t>
       </w:r>
       <w:r>
         <w:rPr>
@@ -8648,7 +8711,16 @@
         <w:footnoteReference w:id="49"/>
       </w:r>
       <w:r>
-        <w:t xml:space="preserve"> Für die erstgenannte Ansicht spricht, dass K ohne die Information nicht prüfen kann, ob der zwingende § 656c I 1 eingehalten ist, während A die Auskunft ohne unbillige Belastung erteilen kann. K hat daher einen Auskunftsanspruch aus § 242. Mit ihrer bloßen Mitteilung, V habe ebenfalls 3 % geschuldet und gezahlt, hat A zwar Auskunft erteilt; überprüfen kann K diese Behauptung aber nicht. Fraglich ist daher, ob K darüber hinaus Einsicht in den Vertrag verlangen kann.</w:t>
+        <w:t xml:space="preserve"> Nach anderer Ansicht fehlt mangels gesetzlicher Regelung eine Grundlage.</w:t>
+      </w:r>
+      <w:r>
+        <w:rPr>
+          <w:rStyle w:val="Funotenzeichen"/>
+        </w:rPr>
+        <w:footnoteReference w:id="50"/>
+      </w:r>
+      <w:r>
+        <w:t xml:space="preserve"> Für die erste Ansicht spricht, dass K die Einhaltung des zwingenden § 656c I 1 sonst nicht prüfen kann, während A die Auskunft ohne unbillige Belastung erteilen kann. K hat daher einen Auskunftsanspruch aus § 242. Mit der Mitteilung, V habe ebenfalls 3 % geschuldet und gezahlt, hat A zwar Auskunft erteilt. Überprüfen kann K diese Behauptung aber nicht. Fraglich ist daher, ob sie zudem Einsicht in den Vertrag verlangen kann.</w:t>
       </w:r>
     </w:p>
     <w:p>
@@ -8698,10 +8770,10 @@
         <w:rPr>
           <w:rStyle w:val="Funotenzeichen"/>
         </w:rPr>
-        <w:footnoteReference w:id="50"/>
-      </w:r>
-      <w:r>
-        <w:t xml:space="preserve"> A und V schlossen den Maklervertrag schriftlich und hielten darin die Provision der V von 3 % fest. Er ist somit eine Urkunde.</w:t>
+        <w:footnoteReference w:id="51"/>
+      </w:r>
+      <w:r>
+        <w:t xml:space="preserve"> Der schriftliche Vertrag hält die Provision der V von 3 % fest und ist somit eine Urkunde.</w:t>
       </w:r>
     </w:p>
     <w:p>
@@ -8723,16 +8795,7 @@
     </w:p>
     <w:p>
       <w:r>
-        <w:t xml:space="preserve">Die Urkunde müsste ein Rechtsverhältnis beurkunden, an dem K beteiligt ist.</w:t>
-      </w:r>
-      <w:r>
-        <w:rPr>
-          <w:rStyle w:val="Funotenzeichen"/>
-        </w:rPr>
-        <w:footnoteReference w:id="51"/>
-      </w:r>
-      <w:r>
-        <w:t xml:space="preserve"> Problematisch ist, dass K nicht Partei des Vertrags zwischen A und V ist. § 810 Fall 2 verlangt jedoch nicht, dass die Urkunde das Rechtsverhältnis des Anspruchstellers unmittelbar dokumentiert;</w:t>
+        <w:t xml:space="preserve">In der Urkunde müsste ein Rechtsverhältnis beurkundet sein, an dem K beteiligt ist, § 810 Fall 2.</w:t>
       </w:r>
       <w:r>
         <w:rPr>
@@ -8741,7 +8804,7 @@
         <w:footnoteReference w:id="52"/>
       </w:r>
       <w:r>
-        <w:t xml:space="preserve"> es genügt eine objektive und unmittelbare Beziehung der Urkunde zu diesem Rechtsverhältnis.</w:t>
+        <w:t xml:space="preserve"> K ist aber nicht Partei des Vertrags zwischen A und V. Die Urkunde muss das Rechtsverhältnis des Anspruchstellers jedoch nicht selbst dokumentieren.</w:t>
       </w:r>
       <w:r>
         <w:rPr>
@@ -8750,7 +8813,16 @@
         <w:footnoteReference w:id="53"/>
       </w:r>
       <w:r>
-        <w:t xml:space="preserve"> Wegen der Doppeltätigkeit der A hängt die Wirksamkeit der Provisionsabrede zwischen A und K gem. § 656c I 1 davon ab, dass auch V eine Provision in gleicher Höhe versprochen hat. Gerade dies dokumentiert der Vertrag zwischen A und V. Die erforderliche Beziehung zum Rechtsverhältnis zwischen A und K besteht.</w:t>
+        <w:t xml:space="preserve"> Ausreichend ist, dass sie objektiv und unmittelbar mit diesem Rechtsverhältnis zusammenhängt.</w:t>
+      </w:r>
+      <w:r>
+        <w:rPr>
+          <w:rStyle w:val="Funotenzeichen"/>
+        </w:rPr>
+        <w:footnoteReference w:id="54"/>
+      </w:r>
+      <w:r>
+        <w:t xml:space="preserve"> Wegen der Doppeltätigkeit der A hängt die Wirksamkeit der Provisionsabrede mit K gem. § 656c I 1 davon ab, dass V eine Provision in gleicher Höhe versprochen hat. Gerade dies dokumentiert der Vertrag zwischen A und V. Die erforderliche Beziehung besteht somit.</w:t>
       </w:r>
     </w:p>
     <w:p>
@@ -8772,16 +8844,7 @@
     </w:p>
     <w:p>
       <w:r>
-        <w:t xml:space="preserve">Weiterhin bedarf es eines rechtlichen Interesses der K an der Einsichtnahme. Ein solches besteht, wenn die Einsicht zur Förderung, Erhaltung oder Verteidigung rechtlich geschützter Interessen erforderlich ist.</w:t>
-      </w:r>
-      <w:r>
-        <w:rPr>
-          <w:rStyle w:val="Funotenzeichen"/>
-        </w:rPr>
-        <w:footnoteReference w:id="54"/>
-      </w:r>
-      <w:r>
-        <w:t xml:space="preserve"> Eine bloße Ausforschung aufgrund vager Vermutungen genügt hingegen nicht.</w:t>
+        <w:t xml:space="preserve">Weiterhin bedarf es eines rechtlichen Interesses der K an der Einsicht. Ein solches besteht, wenn die Einsicht zur Förderung, Erhaltung oder Verteidigung rechtlich geschützter Interessen erforderlich ist.</w:t>
       </w:r>
       <w:r>
         <w:rPr>
@@ -8790,7 +8853,16 @@
         <w:footnoteReference w:id="55"/>
       </w:r>
       <w:r>
-        <w:t xml:space="preserve"> Ob die Forderung der A über 30.000 € besteht, hängt nach § 656c von der Provisionsabrede mit V ab, die A nicht vorlegt, sondern lediglich behauptet. K will damit keine bloßen Vermutungen ausforschen, sondern eine für ihre eigene Zahlungspflicht erhebliche Voraussetzung überprüfen. Ein rechtliches Interesse liegt vor.</w:t>
+        <w:t xml:space="preserve"> Eine bloße Ausforschung aufgrund vager Vermutungen genügt nicht.</w:t>
+      </w:r>
+      <w:r>
+        <w:rPr>
+          <w:rStyle w:val="Funotenzeichen"/>
+        </w:rPr>
+        <w:footnoteReference w:id="56"/>
+      </w:r>
+      <w:r>
+        <w:t xml:space="preserve"> Ob die Forderung der A über 30.000 € besteht, hängt nach § 656c von der Provisionsabrede mit V ab, die A nur behauptet. K will damit keine Vermutungen ausforschen, sondern eine Voraussetzung ihrer eigenen Zahlungspflicht prüfen. Ein rechtliches Interesse liegt somit vor.</w:t>
       </w:r>
     </w:p>
     <w:p>
@@ -8812,16 +8884,16 @@
     </w:p>
     <w:p>
       <w:r>
-        <w:t xml:space="preserve">Schließlich müsste sich die Urkunde im Besitz der A befinden.</w:t>
-      </w:r>
-      <w:r>
-        <w:rPr>
-          <w:rStyle w:val="Funotenzeichen"/>
-        </w:rPr>
-        <w:footnoteReference w:id="56"/>
-      </w:r>
-      <w:r>
-        <w:t xml:space="preserve"> A ist selbst Partei des Vertrags mit V. Mangels entgegenstehender Anhaltspunkte ist davon auszugehen, dass sie die Urkunde besitzt.</w:t>
+        <w:t xml:space="preserve">Schließlich müsste A die Urkunde besitzen.</w:t>
+      </w:r>
+      <w:r>
+        <w:rPr>
+          <w:rStyle w:val="Funotenzeichen"/>
+        </w:rPr>
+        <w:footnoteReference w:id="57"/>
+      </w:r>
+      <w:r>
+        <w:t xml:space="preserve"> A ist Vertragspartnerin der V und besitzt die Urkunde somit mangels gegenteiliger Anhaltspunkte.</w:t>
       </w:r>
     </w:p>
     <w:p>
@@ -8843,7 +8915,7 @@
     </w:p>
     <w:p>
       <w:r>
-        <w:t xml:space="preserve">K kann von A gem. § 810 Fall 2 die Gestattung der Einsicht in den Maklervertrag zwischen A und V verlangen.</w:t>
+        <w:t xml:space="preserve">K kann somit gem. § 810 Fall 2 Einsicht in den Maklervertrag zwischen A und V verlangen.</w:t>
       </w:r>
     </w:p>
     <w:p>
@@ -8865,7 +8937,16 @@
     </w:p>
     <w:p>
       <w:r>
-        <w:t xml:space="preserve">K könnte die Zahlung gem. § 273 I bis zur Gewährung der Einsicht verweigern. Ihre Erklärung, sie werde allenfalls nach Vorlage des Vertrags mit V zahlen, ist als Geltendmachung dieses Rechts zu verstehen.</w:t>
+        <w:t xml:space="preserve">K könnte die Zahlung gem. § 273 I bis zur Gewährung der Einsicht verweigern. Das Zurückbehaltungsrecht muss als Einrede geltend gemacht werden.</w:t>
+      </w:r>
+      <w:r>
+        <w:rPr>
+          <w:rStyle w:val="Funotenzeichen"/>
+        </w:rPr>
+        <w:footnoteReference w:id="58"/>
+      </w:r>
+      <w:r>
+        <w:t xml:space="preserve"> Dies hat K mit der Erklärung getan, sie werde allenfalls nach Vorlage des Vertrags mit V zahlen.</w:t>
       </w:r>
     </w:p>
     <w:p>
@@ -8887,16 +8968,16 @@
     </w:p>
     <w:p>
       <w:r>
-        <w:t xml:space="preserve">Zunächst müsste K als Schuldnerin der Provision ein Gegenanspruch gegen A als Gläubigerin zustehen.</w:t>
-      </w:r>
-      <w:r>
-        <w:rPr>
-          <w:rStyle w:val="Funotenzeichen"/>
-        </w:rPr>
-        <w:footnoteReference w:id="57"/>
-      </w:r>
-      <w:r>
-        <w:t xml:space="preserve"> Der Provisionsforderung der A aus § 652 I 1 steht der Einsichtsanspruch der K aus § 810 Fall 2 in umgekehrter Richtung gegenüber.</w:t>
+        <w:t xml:space="preserve">Zunächst müsste K als Schuldnerin ein Gegenanspruch gegen die Gläubigerin A zustehen.</w:t>
+      </w:r>
+      <w:r>
+        <w:rPr>
+          <w:rStyle w:val="Funotenzeichen"/>
+        </w:rPr>
+        <w:footnoteReference w:id="59"/>
+      </w:r>
+      <w:r>
+        <w:t xml:space="preserve"> Der Provisionsforderung der A steht der Einsichtsanspruch der K aus § 810 Fall 2 gegenüber. Die Ansprüche sind somit gegenseitig.</w:t>
       </w:r>
     </w:p>
     <w:p>
@@ -8924,19 +9005,19 @@
         <w:rPr>
           <w:rStyle w:val="Funotenzeichen"/>
         </w:rPr>
-        <w:footnoteReference w:id="58"/>
-      </w:r>
-      <w:r>
-        <w:t xml:space="preserve"> Dass beide Ansprüche demselben Vertrag entspringen, ist nicht erforderlich; ausreichend ist ein enger tatsächlicher und wirtschaftlicher Zusammenhang.</w:t>
-      </w:r>
-      <w:r>
-        <w:rPr>
-          <w:rStyle w:val="Funotenzeichen"/>
-        </w:rPr>
-        <w:footnoteReference w:id="59"/>
-      </w:r>
-      <w:r>
-        <w:t xml:space="preserve"> Der Einsichtsanspruch soll gerade klären, ob A die Provision von K nach § 656c I 1 verlangen kann. Beide Ansprüche wurzeln damit in der Doppeltätigkeit der A und hängen eng zusammen.</w:t>
+        <w:footnoteReference w:id="60"/>
+      </w:r>
+      <w:r>
+        <w:t xml:space="preserve"> Ein einheitlicher Vertrag ist nicht erforderlich. Es genügt ein enger tatsächlicher und wirtschaftlicher Zusammenhang.</w:t>
+      </w:r>
+      <w:r>
+        <w:rPr>
+          <w:rStyle w:val="Funotenzeichen"/>
+        </w:rPr>
+        <w:footnoteReference w:id="61"/>
+      </w:r>
+      <w:r>
+        <w:t xml:space="preserve"> Der Einsichtsanspruch soll gerade klären, ob A die Provision von K nach § 656c I 1 verlangen kann. Beide Ansprüche wurzeln in der Doppeltätigkeit der A und sind somit konnex.</w:t>
       </w:r>
     </w:p>
     <w:p>
@@ -8964,10 +9045,10 @@
         <w:rPr>
           <w:rStyle w:val="Funotenzeichen"/>
         </w:rPr>
-        <w:footnoteReference w:id="60"/>
-      </w:r>
-      <w:r>
-        <w:t xml:space="preserve"> Der Einsichtsanspruch der K ist entstanden und mangels abweichender Bestimmung sofort fällig, § 271 I; K hat die Vorlage bereits verlangt. Einreden der A sind nicht ersichtlich.</w:t>
+        <w:footnoteReference w:id="62"/>
+      </w:r>
+      <w:r>
+        <w:t xml:space="preserve"> Der Einsichtsanspruch ist entstanden und gem. § 271 I sofort fällig. Einreden der A sind nicht ersichtlich, sodass er auch durchsetzbar ist.</w:t>
       </w:r>
     </w:p>
     <w:p>
@@ -8989,25 +9070,7 @@
     </w:p>
     <w:p>
       <w:r>
-        <w:t xml:space="preserve">Fraglich ist, welche Wirkung das Zurückbehaltungsrecht hier entfaltet. Grundsätzlich führt es gem. § 274 I nur dazu, dass der Schuldner Zug um Zug gegen Erfüllung des Gegenanspruchs zu leisten hat.</w:t>
-      </w:r>
-      <w:r>
-        <w:rPr>
-          <w:rStyle w:val="Funotenzeichen"/>
-        </w:rPr>
-        <w:footnoteReference w:id="61"/>
-      </w:r>
-      <w:r>
-        <w:t xml:space="preserve"> Anders liegt es ausnahmsweise, wenn Haupt- und Gegenanspruch in einem besonderen Abhängigkeitsverhältnis stehen und der Gegenanspruch gerade der Überprüfung der Hauptforderung dient. Dann kann der Gläubiger die Leistung vorerst überhaupt nicht verlangen, sodass eine Zahlungsklage nicht zu einer Verurteilung Zug um Zug, sondern zur Abweisung führen würde.</w:t>
-      </w:r>
-      <w:r>
-        <w:rPr>
-          <w:rStyle w:val="Funotenzeichen"/>
-        </w:rPr>
-        <w:footnoteReference w:id="62"/>
-      </w:r>
-      <w:r>
-        <w:t xml:space="preserve"> K benötigt die Einsicht, um zu prüfen, ob A § 656c I 1 eingehalten hat. Hätte V keine Provision in gleicher Höhe versprochen, wäre die Provisionsabrede mit K gem. § 656c II 1 unwirksam.</w:t>
+        <w:t xml:space="preserve">Fraglich ist, welche Wirkung das Zurückbehaltungsrecht hier hat. Grundsätzlich muss der Schuldner gem. § 274 I nur Zug um Zug gegen Erfüllung des Gegenanspruchs leisten.</w:t>
       </w:r>
       <w:r>
         <w:rPr>
@@ -9016,7 +9079,16 @@
         <w:footnoteReference w:id="63"/>
       </w:r>
       <w:r>
-        <w:t xml:space="preserve"> A kann die Zahlung daher derzeit nicht verlangen, solange sie K die Einsicht nicht gewährt.</w:t>
+        <w:t xml:space="preserve"> Anders liegt es ausnahmsweise, wenn der Gegenanspruch gerade der Überprüfung der Hauptforderung dient. Dann kann der Gläubiger die Leistung vorerst überhaupt nicht verlangen, sodass eine Zahlungsklage nicht zu einer Verurteilung Zug um Zug, sondern zur Abweisung führen würde.</w:t>
+      </w:r>
+      <w:r>
+        <w:rPr>
+          <w:rStyle w:val="Funotenzeichen"/>
+        </w:rPr>
+        <w:footnoteReference w:id="64"/>
+      </w:r>
+      <w:r>
+        <w:t xml:space="preserve"> K benötigt die Einsicht, um zu prüfen, ob A § 656c I 1 eingehalten hat. Andernfalls wäre die Provisionsabrede mit K gem. § 656c II 1 unwirksam. A kann die Zahlung daher derzeit nicht verlangen, solange sie K die Einsicht nicht gewährt.</w:t>
       </w:r>
     </w:p>
     <w:p>
@@ -9038,7 +9110,7 @@
     </w:p>
     <w:p>
       <w:r>
-        <w:t xml:space="preserve">K steht ein Zurückbehaltungsrecht gem. § 273 I zu.</w:t>
+        <w:t xml:space="preserve">K steht somit ein Zurückbehaltungsrecht gem. § 273 I zu.</w:t>
       </w:r>
     </w:p>
     <w:p>
@@ -9060,7 +9132,7 @@
     </w:p>
     <w:p>
       <w:r>
-        <w:t xml:space="preserve">Der Provisionsanspruch der A gegen K über 30.000 € aus § 652 I 1 ist zwar entstanden. Solange A der K keine Einsicht in den Maklervertrag mit V gewährt, kann sie ihn wegen des Zurückbehaltungsrechts der K aus § 273 I derzeit aber nicht durchsetzen.</w:t>
+        <w:t xml:space="preserve">Der Provisionsanspruch der A gegen K aus § 652 I 1 über 30.000 € ist zwar entstanden. Solange A der K keine Einsicht in den Maklervertrag mit V gewährt, kann sie ihn wegen des Zurückbehaltungsrechts aus § 273 I aber nicht durchsetzen.</w:t>
       </w:r>
     </w:p>
     <w:p>
@@ -9099,7 +9171,7 @@
     </w:p>
     <w:p>
       <w:r>
-        <w:t xml:space="preserve">K könnte von T gem. § 546 I die Räumung und Herausgabe der Einliegerwohnung verlangen. Hierfür müsste zwischen K und T ein Mietverhältnis bestanden haben, das beendet ist.</w:t>
+        <w:t xml:space="preserve">K könnte von T gem. § 546 I die Räumung und Herausgabe der Einliegerwohnung verlangen. Dies setzt ein beendetes Mietverhältnis zwischen K und T voraus.</w:t>
       </w:r>
     </w:p>
     <w:p>
@@ -9121,16 +9193,7 @@
     </w:p>
     <w:p>
       <w:r>
-        <w:t xml:space="preserve">Zunächst müsste zwischen K und T ein Mietverhältnis bestanden haben. T hatte die Wohnung ursprünglich von V gemietet; K könnte aber gem. § 566 I eingetreten sein. Danach tritt der Erwerber vermieteten Wohnraums, der nach der Überlassung veräußert wird, anstelle des Vermieters in das Mietverhältnis ein,</w:t>
-      </w:r>
-      <w:r>
-        <w:rPr>
-          <w:rStyle w:val="Funotenzeichen"/>
-        </w:rPr>
-        <w:footnoteReference w:id="64"/>
-      </w:r>
-      <w:r>
-        <w:t xml:space="preserve"> wobei Veräußerung die Übertragung des Eigentums meint.</w:t>
+        <w:t xml:space="preserve">Zunächst müsste zwischen K und T ein Mietverhältnis bestanden haben. T hatte die Wohnung von V gemietet. K könnte aber gem. § 566 I eingetreten sein. Danach tritt der Erwerber vermieteten Wohnraums, der nach der Überlassung an den Mieter veräußert wird, anstelle des Vermieters in das Mietverhältnis ein.</w:t>
       </w:r>
       <w:r>
         <w:rPr>
@@ -9139,7 +9202,16 @@
         <w:footnoteReference w:id="65"/>
       </w:r>
       <w:r>
-        <w:t xml:space="preserve"> T bewohnte die Wohnung bereits, als K das Grundstück durch Auflassung und Eintragung (§§ 873 I, 925) erwarb. K ist damit in das Mietverhältnis eingetreten.</w:t>
+        <w:t xml:space="preserve"> Veräußerung meint dabei die Übertragung des Eigentums.</w:t>
+      </w:r>
+      <w:r>
+        <w:rPr>
+          <w:rStyle w:val="Funotenzeichen"/>
+        </w:rPr>
+        <w:footnoteReference w:id="66"/>
+      </w:r>
+      <w:r>
+        <w:t xml:space="preserve"> T bewohnte die Wohnung bereits, als K das Grundstück gem. §§ 873 I, 925 durch Auflassung und Eintragung erwarb. K ist somit in das Mietverhältnis eingetreten.</w:t>
       </w:r>
     </w:p>
     <w:p>
@@ -9183,16 +9255,7 @@
     </w:p>
     <w:p>
       <w:r>
-        <w:t xml:space="preserve">Das Mietverhältnis könnte bereits durch die fristlose Kündigung beendet worden sein. Diese setzt gem. § 543 I 1 einen wichtigen Grund voraus. Ein solcher liegt nach § 543 I 2 vor, wenn dem Kündigenden unter Berücksichtigung der Umstände des Einzelfalls und der Interessen beider Vertragsparteien die Fortsetzung des Mietverhältnisses bis zu dessen regulärer Beendigung nicht zuzumuten ist.</w:t>
-      </w:r>
-      <w:r>
-        <w:rPr>
-          <w:rStyle w:val="Funotenzeichen"/>
-        </w:rPr>
-        <w:footnoteReference w:id="66"/>
-      </w:r>
-      <w:r>
-        <w:t xml:space="preserve"> Für den Zahlungsverzug enthält § 543 II 1 Nr. 3 besondere Kündigungstatbestände.</w:t>
+        <w:t xml:space="preserve">Das Mietverhältnis könnte durch die fristlose Kündigung beendet worden sein. Diese setzt gem. § 543 I 1 einen wichtigen Grund voraus. Ein solcher liegt gem. § 543 I 2 vor, wenn dem Kündigenden unter Abwägung aller Umstände die Fortsetzung des Mietverhältnisses bis zu seinem regulären Ende nicht zuzumuten ist.</w:t>
       </w:r>
       <w:r>
         <w:rPr>
@@ -9201,7 +9264,16 @@
         <w:footnoteReference w:id="67"/>
       </w:r>
       <w:r>
-        <w:t xml:space="preserve"> Die schriftlich (§ 568 I) erklärte Kündigung nennt mit den zutreffend bezifferten Rückständen zugleich ihren Grund, § 569 IV.</w:t>
+        <w:t xml:space="preserve"> Für den Zahlungsverzug regelt § 543 II 1 Nr. 3 besondere Kündigungsgründe.</w:t>
+      </w:r>
+      <w:r>
+        <w:rPr>
+          <w:rStyle w:val="Funotenzeichen"/>
+        </w:rPr>
+        <w:footnoteReference w:id="68"/>
+      </w:r>
+      <w:r>
+        <w:t xml:space="preserve"> Die gem. § 568 I schriftlich erklärte Kündigung nennt mit den bezifferten Rückständen zugleich ihren Grund, § 569 IV.</w:t>
       </w:r>
     </w:p>
     <w:p>
@@ -9223,16 +9295,7 @@
     </w:p>
     <w:p>
       <w:r>
-        <w:t xml:space="preserve">Zunächst müsste T mit der Miete in Rückstand geraten sein. Dies wäre nicht der Fall, wenn sie gem. § 536 I zur Minderung wegen des Kindergartenlärms berechtigt war. Ein Mangel i.S.d. § 536 I ist jede für den Mieter nachteilige Abweichung der tatsächlichen von der vertraglich vereinbarten Beschaffenheit, die die Tauglichkeit zum vertragsgemäßen Gebrauch beeinträchtigt.</w:t>
-      </w:r>
-      <w:r>
-        <w:rPr>
-          <w:rStyle w:val="Funotenzeichen"/>
-        </w:rPr>
-        <w:footnoteReference w:id="68"/>
-      </w:r>
-      <w:r>
-        <w:t xml:space="preserve"> Auch von einem Nachbargrundstück ausgehende Geräusche können einen Mangel begründen.</w:t>
+        <w:t xml:space="preserve">Zunächst müsste T mit der Miete in Rückstand geraten sein. Dies wäre nicht der Fall, wenn sie gem. § 536 I wegen des Kindergartenlärms zur Minderung berechtigt war. Ein Mangel ist jede für den Mieter nachteilige Abweichung der tatsächlichen von der vereinbarten Beschaffenheit, welche die Tauglichkeit zum vertragsgemäßen Gebrauch beeinträchtigt.</w:t>
       </w:r>
       <w:r>
         <w:rPr>
@@ -9241,7 +9304,7 @@
         <w:footnoteReference w:id="69"/>
       </w:r>
       <w:r>
-        <w:t xml:space="preserve"> Fehlt eine Beschaffenheitsvereinbarung, ist nach den Umständen des Einzelfalls zu bestimmen, welche Belastung der Mieter hinzunehmen hat.</w:t>
+        <w:t xml:space="preserve"> Auch Geräusche von einem Nachbargrundstück können einen Mangel begründen.</w:t>
       </w:r>
       <w:r>
         <w:rPr>
@@ -9250,7 +9313,7 @@
         <w:footnoteReference w:id="70"/>
       </w:r>
       <w:r>
-        <w:t xml:space="preserve"> Muss der Vermieter die Immissionen selbst gem. § 906 entschädigungslos dulden, begründen sie regelmäßig keinen Mangel.</w:t>
+        <w:t xml:space="preserve"> Fehlt eine Beschaffenheitsvereinbarung, ist nach den Umständen des Einzelfalls zu bestimmen, welche Belastung der Mieter hinnehmen muss.</w:t>
       </w:r>
       <w:r>
         <w:rPr>
@@ -9259,7 +9322,7 @@
         <w:footnoteReference w:id="71"/>
       </w:r>
       <w:r>
-        <w:t xml:space="preserve"> Eine besondere Vereinbarung zwischen V und T über die Geräuschbelastung ist nicht ersichtlich. Der Kindergarten war bereits bei Einzug der T in Betrieb und hält seit jeher sämtliche Immissionsrichtwerte ein, sodass nach § 906 I 2 in der Regel nur eine unwesentliche Beeinträchtigung vorliegt. Die Geräusche sind daher als zulässige Immissionen hinzunehmen; ein Mangel liegt nicht vor.</w:t>
+        <w:t xml:space="preserve"> Muss der Vermieter die Immissionen selbst gem. § 906 entschädigungslos dulden, liegt regelmäßig kein Mangel vor.</w:t>
       </w:r>
       <w:r>
         <w:rPr>
@@ -9268,7 +9331,7 @@
         <w:footnoteReference w:id="72"/>
       </w:r>
       <w:r>
-        <w:t xml:space="preserve"> Selbst bei Annahme eines Mangels wäre die Minderung gem. § 536b S. 1 ausgeschlossen, da der Mieter, der den Mangel bei Vertragsschluss kennt, keine Rechte aus §§ 536, 536a hat.</w:t>
+        <w:t xml:space="preserve"> Eine Vereinbarung zwischen V und T über die Geräuschbelastung ist nicht ersichtlich. Der Kindergarten war bereits vor dem Einzug der T in Betrieb und hält seit jeher alle Immissionsrichtwerte ein, sodass gem. § 906 I 2 in der Regel nur eine unwesentliche Beeinträchtigung vorliegt. Die Geräusche sind folglich hinzunehmen und begründen keinen Mangel. Zudem hat der Mieter gem. § 536b keine Rechte aus §§ 536, 536a, wenn er den Mangel bei Vertragsschluss kennt oder die Mietsache in Kenntnis des Mangels vorbehaltlos annimmt.</w:t>
       </w:r>
       <w:r>
         <w:rPr>
@@ -9277,7 +9340,7 @@
         <w:footnoteReference w:id="73"/>
       </w:r>
       <w:r>
-        <w:t xml:space="preserve"> T kannte den Betrieb des Kindergartens bereits bei ihrem Einzug. Ob sie ein Minderungsrecht zudem durch die vierjährige vorbehaltlose Zahlung verloren hätte, kann offenbleiben. T schuldete somit die volle Miete; durch die Kürzung um 40 % entstanden Rückstände.</w:t>
+        <w:t xml:space="preserve"> T kannte den Kindergarten bereits bei ihrem Einzug, sodass eine Minderung auch danach ausgeschlossen wäre. Ob sie ein Minderungsrecht zudem durch die vierjährige vorbehaltlose Zahlung verloren hätte, kann offenbleiben. T schuldete somit die volle Miete, sodass durch die Kürzung um 40 % Rückstände entstanden.</w:t>
       </w:r>
     </w:p>
     <w:p>
@@ -9299,7 +9362,7 @@
     </w:p>
     <w:p>
       <w:r>
-        <w:t xml:space="preserve">T müsste in dem von § 543 II 1 Nr. 3 lit. b vorausgesetzten Umfang in Verzug geraten sein. Danach muss der Mieter in einem Zeitraum, der sich über mehr als zwei Termine erstreckt, mit einem Betrag in Verzug sein, der die Miete für zwei Monate erreicht.</w:t>
+        <w:t xml:space="preserve">T müsste in dem von § 543 II 1 Nr. 3 lit. b vorausgesetzten Umfang in Verzug sein. Danach muss der Mieter in einem Zeitraum, der sich über mehr als zwei Termine erstreckt, mit einem Betrag in Verzug sein, der die Miete für zwei Monate erreicht.</w:t>
       </w:r>
       <w:r>
         <w:rPr>
@@ -9308,7 +9371,7 @@
         <w:footnoteReference w:id="74"/>
       </w:r>
       <w:r>
-        <w:t xml:space="preserve"> Die Miete ist gem. § 556b I spätestens bis zum dritten Werktag des Monats zu entrichten, sodass es gem. § 286 II Nr. 1 keiner Mahnung bedurfte.</w:t>
+        <w:t xml:space="preserve"> Da die Miete gem. § 556b I bis zum dritten Werktag des Monats zu entrichten ist, bedurfte es gem. § 286 II Nr. 1 keiner Mahnung.</w:t>
       </w:r>
       <w:r>
         <w:rPr>
@@ -9317,7 +9380,7 @@
         <w:footnoteReference w:id="75"/>
       </w:r>
       <w:r>
-        <w:t xml:space="preserve"> Ihr Irrtum über ein Minderungsrecht schließt das Vertretenmüssen (§ 286 IV) nicht aus, da ein Rechtsirrtum nur bei Unvermeidbarkeit entlastet, wofür nichts ersichtlich ist.</w:t>
+        <w:t xml:space="preserve"> Ein Rechtsirrtum schließt das Vertretenmüssen nach § 286 IV nur aus, wenn er unvermeidbar war.</w:t>
       </w:r>
       <w:r>
         <w:rPr>
@@ -9326,7 +9389,7 @@
         <w:footnoteReference w:id="76"/>
       </w:r>
       <w:r>
-        <w:t xml:space="preserve"> Nach dem Eigentumsübergang zahlte T an K sechs Monate lang jeweils nur 60 % der Miete. Maßgeblich sind allein diese Rückstände, da K gem. § 566 I nur in die während der Dauer ihres Eigentums entstehenden Rechte eintritt; frühere Rückstände stehen weiterhin V zu.</w:t>
+        <w:t xml:space="preserve"> Dafür ist hinsichtlich des vermeintlichen Minderungsrechts der T nichts ersichtlich. Nach dem Eigentumsübergang zahlte T an K sechs Monate lang nur 60 % der Miete. Maßgeblich sind allein diese Rückstände, da K gem. § 566 I nur in die während der Dauer ihres Eigentums entstehenden Rechte eintritt. Frühere Rückstände stehen weiterhin V zu.</w:t>
       </w:r>
       <w:r>
         <w:rPr>
@@ -9335,7 +9398,7 @@
         <w:footnoteReference w:id="77"/>
       </w:r>
       <w:r>
-        <w:t xml:space="preserve"> Der Rückstand erstreckt sich damit über mehr als zwei Termine und beläuft sich auf 6 × 40 % = 2,4 Monatsmieten. Dass K die Rückstände zunächst sechs Monate auflaufen ließ, steht der Kündigung nicht entgegen, da die §§ 543, 569 die Kündigung wegen Zahlungsverzugs abschließend regeln und § 314 III daher keine Anwendung findet.</w:t>
+        <w:t xml:space="preserve"> Der Rückstand erstreckt sich somit über mehr als zwei Termine und beträgt 6 × 40 % = 2,4 Monatsmieten. Dass K die Rückstände sechs Monate auflaufen ließ, schadet nicht, da die §§ 543, 569 die Kündigung wegen Zahlungsverzugs abschließend regeln und § 314 III daher nicht anwendbar ist.</w:t>
       </w:r>
       <w:r>
         <w:rPr>
@@ -9344,7 +9407,7 @@
         <w:footnoteReference w:id="78"/>
       </w:r>
       <w:r>
-        <w:t xml:space="preserve"> Die Voraussetzungen des § 543 II 1 Nr. 3 lit. b liegen vor.</w:t>
+        <w:t xml:space="preserve"> Die Voraussetzungen des § 543 II 1 Nr. 3 lit. b liegen folglich vor.</w:t>
       </w:r>
     </w:p>
     <w:p>
@@ -9366,7 +9429,7 @@
     </w:p>
     <w:p>
       <w:r>
-        <w:t xml:space="preserve">Einer Abmahnung, die § 543 III 1 grundsätzlich verlangt,</w:t>
+        <w:t xml:space="preserve">Eine Abmahnung, die § 543 III 1 grundsätzlich verlangt,</w:t>
       </w:r>
       <w:r>
         <w:rPr>
@@ -9375,7 +9438,7 @@
         <w:footnoteReference w:id="79"/>
       </w:r>
       <w:r>
-        <w:t xml:space="preserve"> bedurfte es gem. § 543 III 2 Nr. 3 bei Zahlungsverzug nicht.</w:t>
+        <w:t xml:space="preserve"> war gem. § 543 III 2 Nr. 3 bei Zahlungsverzug entbehrlich.</w:t>
       </w:r>
       <w:r>
         <w:rPr>
@@ -9403,7 +9466,7 @@
     </w:p>
     <w:p>
       <w:r>
-        <w:t xml:space="preserve">Die Kündigung könnte jedoch gem. § 569 III Nr. 2 S. 1 unwirksam geworden sein. Danach wird eine auf § 543 II 1 Nr. 3 gestützte Kündigung unwirksam, wenn der Vermieter hinsichtlich der fälligen Miete und der fälligen Entschädigung nach § 546a I befriedigt wird.</w:t>
+        <w:t xml:space="preserve">Die Kündigung könnte jedoch gem. § 569 III Nr. 2 S. 1 unwirksam geworden sein. Danach wird eine auf § 543 II 1 Nr. 3 gestützte Kündigung unwirksam, wenn der Vermieter spätestens bis zum Ablauf von zwei Monaten nach Rechtshängigkeit des Räumungsanspruchs hinsichtlich der fälligen Miete und der fälligen Entschädigung nach § 546a I befriedigt wird.</w:t>
       </w:r>
       <w:r>
         <w:rPr>
@@ -9412,7 +9475,7 @@
         <w:footnoteReference w:id="81"/>
       </w:r>
       <w:r>
-        <w:t xml:space="preserve"> Dies muss spätestens bis zum Ablauf von zwei Monaten nach Eintritt der Rechtshängigkeit des Räumungsanspruchs geschehen. T beglich sämtliche Rückstände sieben Wochen nach Zustellung der Räumungsklage, mit der die Rechtshängigkeit eintrat (§§ 253 I, 261 I ZPO), und damit innerhalb der Zweimonatsfrist. Mangels gegenteiliger Angaben ist davon auszugehen, dass die Zahlung auch die bis dahin fällige Nutzungsentschädigung nach § 546a I umfasste, sodass K vollständig befriedigt wurde. Ein Ausschluss nach § 569 III Nr. 2 S. 2 ist nicht ersichtlich. Die fristlose Kündigung hat ihre Wirkung damit nachträglich verloren.</w:t>
+        <w:t xml:space="preserve"> Die Rechtshängigkeit tritt gem. §§ 253 I, 261 I ZPO mit Zustellung der Klage ein. T beglich sämtliche Rückstände sieben Wochen nach Zustellung der Räumungsklage und damit innerhalb der Frist. Mangels gegenteiliger Angaben ist davon auszugehen, dass die Zahlung auch die fällige Nutzungsentschädigung nach § 546a I umfasste, sodass K vollständig befriedigt wurde. Ein Ausschluss nach § 569 III Nr. 2 S. 2 ist nicht ersichtlich. Die fristlose Kündigung hat ihre Wirkung somit nachträglich verloren.</w:t>
       </w:r>
     </w:p>
     <w:p>
@@ -9434,7 +9497,7 @@
     </w:p>
     <w:p>
       <w:r>
-        <w:t xml:space="preserve">Das Mietverhältnis könnte aber durch die hilfsweise ausgesprochene ordentliche Kündigung nach § 573 geendet haben.</w:t>
+        <w:t xml:space="preserve">Das Mietverhältnis könnte aber durch die hilfsweise ordentliche Kündigung nach § 573 geendet haben.</w:t>
       </w:r>
     </w:p>
     <w:p>
@@ -9465,7 +9528,7 @@
         <w:footnoteReference w:id="82"/>
       </w:r>
       <w:r>
-        <w:t xml:space="preserve"> Zulässig ist allerdings eine Bedingung, deren Eintritt allein von der rechtlichen Beurteilung abhängt (Rechtsbedingung), weil sie für den Empfänger keine Ungewissheit schafft.</w:t>
+        <w:t xml:space="preserve"> Zulässig ist aber eine Rechtsbedingung, deren Eintritt allein von der rechtlichen Beurteilung abhängt, weil sie für den Empfänger keine Ungewissheit schafft.</w:t>
       </w:r>
       <w:r>
         <w:rPr>
@@ -9474,7 +9537,7 @@
         <w:footnoteReference w:id="83"/>
       </w:r>
       <w:r>
-        <w:t xml:space="preserve"> Die ordentliche Kündigung sollte nur für den Fall gelten, dass die fristlose Kündigung das Mietverhältnis nicht beendet. Für T war damit eindeutig erkennbar, dass K das Mietverhältnis jedenfalls beenden will. Die Bedingung ist zudem eingetreten, da die fristlose Kündigung gem. § 569 III Nr. 2 unwirksam geworden ist.</w:t>
+        <w:t xml:space="preserve"> Die ordentliche Kündigung sollte nur gelten, falls die fristlose Kündigung das Mietverhältnis nicht beendet. Für T war damit klar erkennbar, dass K das Mietverhältnis jedenfalls beenden will. Die Bedingung ist somit zulässig und zudem eingetreten, da die fristlose Kündigung gem. § 569 III Nr. 2 unwirksam geworden ist.</w:t>
       </w:r>
     </w:p>
     <w:p>
@@ -9496,7 +9559,7 @@
     </w:p>
     <w:p>
       <w:r>
-        <w:t xml:space="preserve">K müsste ein berechtigtes Interesse an der Beendigung des Mietverhältnisses gehabt haben, § 573 I 1. Ein solches liegt nach § 573 II Nr. 1 insbesondere vor, wenn der Mieter seine vertraglichen Pflichten schuldhaft nicht unerheblich verletzt hat.</w:t>
+        <w:t xml:space="preserve">K müsste gem. § 573 I 1 ein berechtigtes Interesse an der Beendigung des Mietverhältnisses haben. Ein solches liegt gem. § 573 II Nr. 1 insbesondere vor, wenn der Mieter seine vertraglichen Pflichten schuldhaft nicht unerheblich verletzt hat.</w:t>
       </w:r>
       <w:r>
         <w:rPr>
@@ -9505,7 +9568,7 @@
         <w:footnoteReference w:id="84"/>
       </w:r>
       <w:r>
-        <w:t xml:space="preserve"> T kürzte die Miete über sechs Monate unberechtigt und schuldhaft (s.o.); ein Rückstand von 2,4 Monatsmieten ist nicht unerheblich. K hat daher ein berechtigtes Interesse.</w:t>
+        <w:t xml:space="preserve"> T kürzte die Miete sechs Monate lang unberechtigt und schuldhaft (s.o.). Ein Rückstand von 2,4 Monatsmieten ist nicht unerheblich. K hat somit ein berechtigtes Interesse.</w:t>
       </w:r>
     </w:p>
     <w:p>
@@ -9527,7 +9590,7 @@
     </w:p>
     <w:p>
       <w:r>
-        <w:t xml:space="preserve">Fraglich ist, ob die Nachzahlung auch die ordentliche Kündigung unwirksam macht. § 569 III Nr. 2 ordnet die Unwirksamkeit ausdrücklich nur für die außerordentliche fristlose Kündigung an.</w:t>
+        <w:t xml:space="preserve">Fraglich ist, ob die Nachzahlung auch die ordentliche Kündigung unwirksam macht. Die Vorschrift des § 569 III Nr. 2 betrifft ausdrücklich nur die außerordentliche fristlose Kündigung.</w:t>
       </w:r>
       <w:r>
         <w:rPr>
@@ -9536,7 +9599,7 @@
         <w:footnoteReference w:id="85"/>
       </w:r>
       <w:r>
-        <w:t xml:space="preserve"> Auf eine daneben erklärte ordentliche Kündigung erstreckt sich die Vorschrift nicht.</w:t>
+        <w:t xml:space="preserve"> Auf eine daneben erklärte ordentliche Kündigung erstreckt sie sich nicht.</w:t>
       </w:r>
       <w:r>
         <w:rPr>
@@ -9545,7 +9608,7 @@
         <w:footnoteReference w:id="86"/>
       </w:r>
       <w:r>
-        <w:t xml:space="preserve"> Die rechtzeitige Nachzahlung der T beseitigt die ordentliche Kündigung folglich nicht. Sie kann allenfalls bei der Gewichtung der Pflichtverletzung im Rahmen des § 573 II Nr. 1 zugunsten des Mieters berücksichtigt werden.</w:t>
+        <w:t xml:space="preserve"> Die Nachzahlung kann allenfalls bei der Gewichtung der Pflichtverletzung im Rahmen des § 573 II Nr. 1 zugunsten des Mieters berücksichtigt werden.</w:t>
       </w:r>
       <w:r>
         <w:rPr>
@@ -9554,7 +9617,7 @@
         <w:footnoteReference w:id="87"/>
       </w:r>
       <w:r>
-        <w:t xml:space="preserve"> T hatte die Miete aber sechs Monate lang eigenmächtig gekürzt und erst nach Klageerhebung nachgezahlt, sodass das berechtigte Interesse der K bestehen bleibt.</w:t>
+        <w:t xml:space="preserve"> T hatte die Miete aber sechs Monate lang eigenmächtig gekürzt und erst nach Klageerhebung nachgezahlt. Das berechtigte Interesse der K bleibt daher bestehen.</w:t>
       </w:r>
     </w:p>
     <w:p>
@@ -9576,7 +9639,7 @@
     </w:p>
     <w:p>
       <w:r>
-        <w:t xml:space="preserve">Weiterhin müsste die Kündigungsfrist eingehalten sein. Gem. § 573c I 2 verlängert sich die Frist für den Vermieter nach fünf Jahren seit der Überlassung des Wohnraums um drei Monate.</w:t>
+        <w:t xml:space="preserve">Weiterhin müsste die Kündigungsfrist eingehalten sein. Diese verlängert sich für den Vermieter gem. § 573c I 2 nach fünf Jahren seit der Überlassung um drei Monate.</w:t>
       </w:r>
       <w:r>
         <w:rPr>
@@ -9585,7 +9648,7 @@
         <w:footnoteReference w:id="88"/>
       </w:r>
       <w:r>
-        <w:t xml:space="preserve"> T wohnte bereits seit sechs Jahren in der Wohnung, sodass eine Frist von sechs Monaten galt. Wann die Kündigung genau zuging, ist unbekannt; als K die Räumung acht Monate später erneut verlangte, war die Frist jedenfalls abgelaufen und das Mietverhältnis beendet.</w:t>
+        <w:t xml:space="preserve"> T wohnte seit sechs Jahren in der Wohnung, sodass eine Frist von sechs Monaten galt. Der genaue Zugang der Kündigung ist unbekannt. Als K die Räumung acht Monate später erneut verlangte, war die Frist aber jedenfalls abgelaufen und das Mietverhältnis somit beendet.</w:t>
       </w:r>
     </w:p>
     <w:p>
@@ -9607,7 +9670,7 @@
     </w:p>
     <w:p>
       <w:r>
-        <w:t xml:space="preserve">Die Kündigung müsste zudem formgerecht erklärt und begründet worden sein. Gem. § 568 I bedarf sie der Schriftform, also der eigenhändigen Unterschrift des Kündigenden, § 126 I.</w:t>
+        <w:t xml:space="preserve">Die Kündigung müsste zudem formgerecht erklärt und begründet sein. Gem. § 568 I bedarf sie der Schriftform, also der eigenhändigen Unterschrift, § 126 I.</w:t>
       </w:r>
       <w:r>
         <w:rPr>
@@ -9616,7 +9679,7 @@
         <w:footnoteReference w:id="89"/>
       </w:r>
       <w:r>
-        <w:t xml:space="preserve"> Zudem sind die Gründe für das berechtigte Interesse gem. § 573 III 1 im Kündigungsschreiben anzugeben. K kündigte schriftlich und bezifferte die Rückstände im Schreiben zutreffend; Form und Begründung sind gewahrt.</w:t>
+        <w:t xml:space="preserve"> Die Gründe für das berechtigte Interesse sind gem. § 573 III 1 im Kündigungsschreiben anzugeben. K kündigte schriftlich und bezifferte die Rückstände zutreffend. Form und Begründung sind somit gewahrt.</w:t>
       </w:r>
     </w:p>
     <w:p>
@@ -9638,7 +9701,7 @@
     </w:p>
     <w:p>
       <w:r>
-        <w:t xml:space="preserve">T könnte der Kündigung gem. § 574 I 1 widersprechen und die Fortsetzung des Mietverhältnisses verlangen, wenn dessen Beendigung für sie eine nicht zu rechtfertigende Härte bedeuten würde. Ihren Brief, die Kündigung sei wegen ihres hohen Alters nicht rechtmäßig, kann man als schriftlichen Widerspruch i.S.d. § 574b I 1 auslegen. Ob der Widerspruch bereits nach § 574 I 2 ausgeschlossen ist, weil ein Grund zur fristlosen Kündigung vorlag, kann offenbleiben, wenn es jedenfalls an einer Härte fehlt. Zwar fließt ein hohes Lebensalter in die Abwägung ein;</w:t>
+        <w:t xml:space="preserve">T könnte der Kündigung gem. § 574 I 1 widersprechen und die Fortsetzung des Mietverhältnisses verlangen, wenn dessen Beendigung für sie eine nicht zu rechtfertigende Härte bedeuten würde. Ihren Brief, die Kündigung sei wegen ihres hohen Alters nicht rechtmäßig, kann man als schriftlichen Widerspruch i.S.d. § 574b I 1 auslegen. Ob der Widerspruch schon gem. § 574 I 2 ausgeschlossen ist, weil ein Grund zur fristlosen Kündigung vorlag, kann offenbleiben, wenn es an einer Härte fehlt. Ein hohes Lebensalter fließt zwar in die Abwägung ein,</w:t>
       </w:r>
       <w:r>
         <w:rPr>
@@ -9647,7 +9710,7 @@
         <w:footnoteReference w:id="90"/>
       </w:r>
       <w:r>
-        <w:t xml:space="preserve"> für sich genommen begründet es jedoch keine Härte i.S.d. § 574 I.</w:t>
+        <w:t xml:space="preserve"> begründet für sich genommen aber keine Härte.</w:t>
       </w:r>
       <w:r>
         <w:rPr>
@@ -9665,7 +9728,7 @@
         <w:footnoteReference w:id="92"/>
       </w:r>
       <w:r>
-        <w:t xml:space="preserve"> Bei der 82-jährigen T bestehen weder gesundheitliche Einschränkungen noch sonstige Umstände, die ihr einen Umzug unmöglich oder unzumutbar machen. Eine Härte i.S.d. § 574 I liegt daher nicht vor. Der fehlende Hinweis auf den Sozialwiderspruch (§ 568 II) führt nicht zur Unwirksamkeit der Kündigung,</w:t>
+        <w:t xml:space="preserve"> Bei der 82-jährigen T bestehen weder gesundheitliche Einschränkungen noch sonstige Umstände, die ihr einen Umzug unzumutbar machen. Eine Härte liegt somit nicht vor. Der fehlende Hinweis auf den Sozialwiderspruch nach § 568 II macht die Kündigung nicht unwirksam.</w:t>
       </w:r>
       <w:r>
         <w:rPr>
@@ -9674,7 +9737,7 @@
         <w:footnoteReference w:id="93"/>
       </w:r>
       <w:r>
-        <w:t xml:space="preserve"> sondern hat gem. § 574b II 2 nur zur Folge, dass T den Widerspruch noch im ersten Termin des Räumungsrechtsstreits erklären kann.</w:t>
+        <w:t xml:space="preserve"> Gem. § 574b II 2 kann T den Widerspruch dann aber noch im ersten Termin des Räumungsrechtsstreits erklären.</w:t>
       </w:r>
       <w:r>
         <w:rPr>
@@ -9683,7 +9746,7 @@
         <w:footnoteReference w:id="94"/>
       </w:r>
       <w:r>
-        <w:t xml:space="preserve"> Mangels Härte bliebe ein Widerspruch der T aber in jedem Fall erfolglos.</w:t>
+        <w:t xml:space="preserve"> Mangels Härte bliebe ein Widerspruch der T somit in jedem Fall erfolglos.</w:t>
       </w:r>
     </w:p>
     <w:p>
@@ -9705,7 +9768,7 @@
     </w:p>
     <w:p>
       <w:r>
-        <w:t xml:space="preserve">Die hilfsweise erklärte ordentliche Kündigung ist wirksam und hat das Mietverhältnis mit Ablauf der Kündigungsfrist beendet.</w:t>
+        <w:t xml:space="preserve">Die ordentliche Kündigung hat das Mietverhältnis somit mit Ablauf der Kündigungsfrist beendet.</w:t>
       </w:r>
     </w:p>
     <w:p>
@@ -9727,7 +9790,7 @@
     </w:p>
     <w:p>
       <w:r>
-        <w:t xml:space="preserve">Nach Beendigung des Mietverhältnisses ist T gem. § 546 I verpflichtet, die Einliegerwohnung an K zu räumen und herauszugeben.</w:t>
+        <w:t xml:space="preserve">T ist somit gem. § 546 I verpflichtet, die Einliegerwohnung zu räumen und an K herauszugeben.</w:t>
       </w:r>
     </w:p>
     <w:p>
@@ -9771,7 +9834,7 @@
     </w:p>
     <w:p>
       <w:r>
-        <w:t xml:space="preserve">K müsste Eigentümerin sein. Durch Auflassung und Eintragung (§§ 873 I, 925) erwarb sie das Grundstück und gem. §§ 93, 94 I zugleich das Gebäude samt Einliegerwohnung.</w:t>
+        <w:t xml:space="preserve">K erwarb das Grundstück gem. §§ 873 I, 925 und damit gem. §§ 93, 94 I auch das Gebäude samt Einliegerwohnung. Sie ist somit Eigentümerin.</w:t>
       </w:r>
     </w:p>
     <w:p>
@@ -9793,7 +9856,7 @@
     </w:p>
     <w:p>
       <w:r>
-        <w:t xml:space="preserve">T müsste Besitzerin sein. Als Bewohnerin der Einliegerwohnung übt sie die tatsächliche Gewalt aus und ist unmittelbare Besitzerin, § 854 I.</w:t>
+        <w:t xml:space="preserve">T übt als Bewohnerin die tatsächliche Gewalt über die Wohnung aus und ist somit gem. § 854 I unmittelbare Besitzerin.</w:t>
       </w:r>
     </w:p>
     <w:p>
@@ -9815,7 +9878,16 @@
     </w:p>
     <w:p>
       <w:r>
-        <w:t xml:space="preserve">T dürfte K gegenüber kein Recht zum Besitz zustehen, § 986 I. Ein solches könnte allein aus dem Mietverhältnis folgen, das jedoch beendet ist; T ist daher nicht zum Besitz berechtigt.</w:t>
+        <w:t xml:space="preserve">T dürfte gegenüber K kein Recht zum Besitz haben, § 986 I. Ein Besitzrecht aus einem Mietverhältnis endet mit dessen Beendigung.</w:t>
+      </w:r>
+      <w:r>
+        <w:rPr>
+          <w:rStyle w:val="Funotenzeichen"/>
+        </w:rPr>
+        <w:footnoteReference w:id="95"/>
+      </w:r>
+      <w:r>
+        <w:t xml:space="preserve"> Das Mietverhältnis mit T ist beendet. T hat somit kein Besitzrecht.</w:t>
       </w:r>
     </w:p>
     <w:p>
@@ -9837,7 +9909,7 @@
     </w:p>
     <w:p>
       <w:r>
-        <w:t xml:space="preserve">K kann die Herausgabe der Wohnung auch gem. § 985 verlangen.</w:t>
+        <w:t xml:space="preserve">K kann somit auch gem. § 985 die Herausgabe der Wohnung verlangen.</w:t>
       </w:r>
     </w:p>
     <w:p>
@@ -9859,7 +9931,7 @@
     </w:p>
     <w:p>
       <w:r>
-        <w:t xml:space="preserve">T könnte von K die Rückzahlung der an V geleisteten Kaution in Höhe von 2.000 € aus der Kautionsabrede i.V.m. § 566a S. 1 verlangen.</w:t>
+        <w:t xml:space="preserve">T könnte von K die Rückzahlung der an V gezahlten Kaution von 2.000 € aus der Kautionsabrede i.V.m. § 566a S. 1 verlangen.</w:t>
       </w:r>
     </w:p>
     <w:p>
@@ -9875,7 +9947,7 @@
           <w:b/>
           <w:bCs/>
         </w:rPr>
-        <w:t xml:space="preserve">I. Entstehung des Rückzahlungsanspruchs</w:t>
+        <w:t xml:space="preserve">I. Rückzahlungsanspruch entstanden</w:t>
       </w:r>
       <w:bookmarkEnd w:id="5074"/>
     </w:p>
@@ -9903,16 +9975,16 @@
     </w:p>
     <w:p>
       <w:r>
-        <w:t xml:space="preserve">Erforderlich ist eine wirksame Kautionsabrede zwischen V und T. Die vereinbarte Barkaution von 2.000 € entspricht dem Zweifachen der Nettokaltmiete und hält damit die Höchstgrenze des § 551 I von drei Monatsmieten ohne Betriebskosten ein.</w:t>
-      </w:r>
-      <w:r>
-        <w:rPr>
-          <w:rStyle w:val="Funotenzeichen"/>
-        </w:rPr>
-        <w:footnoteReference w:id="95"/>
-      </w:r>
-      <w:r>
-        <w:t xml:space="preserve"> Die Abrede ist wirksam.</w:t>
+        <w:t xml:space="preserve">Erforderlich ist eine wirksame Kautionsabrede zwischen V und T. Gem. § 551 I darf die Sicherheit höchstens das Dreifache der Monatsmiete ohne Betriebskosten betragen.</w:t>
+      </w:r>
+      <w:r>
+        <w:rPr>
+          <w:rStyle w:val="Funotenzeichen"/>
+        </w:rPr>
+        <w:footnoteReference w:id="96"/>
+      </w:r>
+      <w:r>
+        <w:t xml:space="preserve"> Die Barkaution von 2.000 € entspricht der doppelten Nettokaltmiete. Die Abrede ist somit wirksam.</w:t>
       </w:r>
     </w:p>
     <w:p>
@@ -9934,16 +10006,16 @@
     </w:p>
     <w:p>
       <w:r>
-        <w:t xml:space="preserve">Die Pflicht zur Rückgewähr der Kaution müsste auf K übergegangen sein. Gem. § 566a S. 1 tritt der Erwerber in die Rechte und Pflichten ein, die durch die vom Mieter geleistete Sicherheit begründet worden sind.</w:t>
-      </w:r>
-      <w:r>
-        <w:rPr>
-          <w:rStyle w:val="Funotenzeichen"/>
-        </w:rPr>
-        <w:footnoteReference w:id="96"/>
-      </w:r>
-      <w:r>
-        <w:t xml:space="preserve"> Zur Rückgewähr der von T an V geleisteten Kaution ist daher K verpflichtet, soweit sie diese nicht für eigene Ansprüche verwenden darf.</w:t>
+        <w:t xml:space="preserve">Die Rückgewährpflicht müsste auf K übergegangen sein. Gem. § 566a S. 1 tritt der Erwerber in die Rechte und Pflichten ein, die durch die vom Mieter geleistete Sicherheit begründet worden sind.</w:t>
+      </w:r>
+      <w:r>
+        <w:rPr>
+          <w:rStyle w:val="Funotenzeichen"/>
+        </w:rPr>
+        <w:footnoteReference w:id="97"/>
+      </w:r>
+      <w:r>
+        <w:t xml:space="preserve"> K ist somit zur Rückgewähr der von T an V geleisteten Kaution verpflichtet, soweit sie diese nicht für eigene Ansprüche verwenden darf.</w:t>
       </w:r>
     </w:p>
     <w:p>
@@ -9965,7 +10037,16 @@
     </w:p>
     <w:p>
       <w:r>
-        <w:t xml:space="preserve">Zudem müsste das Mietverhältnis beendet und die Wohnung zurückgegeben sein. Beides ist nach der ordentlichen Kündigung (s. Frage 2) und der Räumung durch T der Fall.</w:t>
+        <w:t xml:space="preserve">Zudem müsste das Mietverhältnis beendet und die Wohnung zurückgegeben sein.</w:t>
+      </w:r>
+      <w:r>
+        <w:rPr>
+          <w:rStyle w:val="Funotenzeichen"/>
+        </w:rPr>
+        <w:footnoteReference w:id="98"/>
+      </w:r>
+      <w:r>
+        <w:t xml:space="preserve"> Beides ist nach der ordentlichen Kündigung (s. Frage 2) und der Räumung durch T der Fall.</w:t>
       </w:r>
     </w:p>
     <w:p>
@@ -9987,7 +10068,7 @@
     </w:p>
     <w:p>
       <w:r>
-        <w:t xml:space="preserve">Der Rückzahlungsanspruch der T ist zunächst entstanden.</w:t>
+        <w:t xml:space="preserve">Der Rückzahlungsanspruch der T ist somit entstanden.</w:t>
       </w:r>
     </w:p>
     <w:p>
@@ -10003,13 +10084,13 @@
           <w:b/>
           <w:bCs/>
         </w:rPr>
-        <w:t xml:space="preserve">II. Erlöschen durch Aufrechnung, § 389 BGB</w:t>
+        <w:t xml:space="preserve">II. Rückzahlungsanspruch erloschen, § 389 BGB</w:t>
       </w:r>
       <w:bookmarkEnd w:id="5079"/>
     </w:p>
     <w:p>
       <w:r>
-        <w:t xml:space="preserve">Der Rückzahlungsanspruch könnte jedoch infolge einer Aufrechnung der K gem. § 389 erloschen sein.</w:t>
+        <w:t xml:space="preserve">Der Anspruch könnte jedoch durch Aufrechnung der K gem. § 389 erloschen sein.</w:t>
       </w:r>
     </w:p>
     <w:p>
@@ -10053,7 +10134,7 @@
     </w:p>
     <w:p>
       <w:r>
-        <w:t xml:space="preserve">Zwischen K und T müsste ein Schuldverhältnis bestanden haben; dies ist das gem. § 566 I übergegangene Mietverhältnis. Da K nur in die während ihres Eigentums entstehenden Rechte eintritt (s. Frage 2), ist mangels gegenteiliger Angaben davon auszugehen, dass T die Schäden in dieser Zeit verursachte; andernfalls stünde der Anspruch der V zu.</w:t>
+        <w:t xml:space="preserve">Zwischen K und T bestand das gem. § 566 I übergegangene Mietverhältnis. Da K nur in die während ihres Eigentums entstehenden Rechte eintritt (s. Frage 2), ist mangels gegenteiliger Angaben davon auszugehen, dass T die Schäden in dieser Zeit verursachte. Andernfalls stünde der Anspruch der V zu.</w:t>
       </w:r>
     </w:p>
     <w:p>
@@ -10075,16 +10156,16 @@
     </w:p>
     <w:p>
       <w:r>
-        <w:t xml:space="preserve">T müsste eine Pflicht aus dem Mietverhältnis verletzt haben. Aus § 241 II folgt für den Mieter die Pflicht, die Mietsache schonend zu behandeln und Beschädigungen zu vermeiden, die über den vertragsgemäßen Gebrauch hinausgehen.</w:t>
-      </w:r>
-      <w:r>
-        <w:rPr>
-          <w:rStyle w:val="Funotenzeichen"/>
-        </w:rPr>
-        <w:footnoteReference w:id="97"/>
-      </w:r>
-      <w:r>
-        <w:t xml:space="preserve"> Durch unsachgemäßen Gebrauch beschädigte T Böden und Türen erheblich und verletzte so ihre Obhutspflicht.</w:t>
+        <w:t xml:space="preserve">T müsste eine Pflicht aus dem Mietverhältnis verletzt haben. Aus § 241 II folgt die Pflicht des Mieters, die Mietsache schonend zu behandeln und Schäden zu vermeiden, die über den vertragsgemäßen Gebrauch hinausgehen.</w:t>
+      </w:r>
+      <w:r>
+        <w:rPr>
+          <w:rStyle w:val="Funotenzeichen"/>
+        </w:rPr>
+        <w:footnoteReference w:id="99"/>
+      </w:r>
+      <w:r>
+        <w:t xml:space="preserve"> Durch unsachgemäßen Gebrauch beschädigte T Böden und Türen erheblich. Sie hat somit ihre Obhutspflicht verletzt.</w:t>
       </w:r>
     </w:p>
     <w:p>
@@ -10106,7 +10187,7 @@
     </w:p>
     <w:p>
       <w:r>
-        <w:t xml:space="preserve">Das Vertretenmüssen der T wird gem. § 280 I 2 vermutet; zudem räumt sie ein, die Schäden pflichtwidrig und schuldhaft verursacht zu haben.</w:t>
+        <w:t xml:space="preserve">Das Vertretenmüssen wird gem. § 280 I 2 vermutet. Zudem räumt T ein, die Schäden pflichtwidrig und schuldhaft verursacht zu haben. Sie hat die Pflichtverletzung somit zu vertreten.</w:t>
       </w:r>
     </w:p>
     <w:p>
@@ -10128,7 +10209,16 @@
     </w:p>
     <w:p>
       <w:r>
-        <w:t xml:space="preserve">Der K müsste durch die Pflichtverletzung ein ersatzfähiger Schaden entstanden sein. Die Beschädigungen an Böden und Türen mindern den Wert der Mietsache; ihre Beseitigung würde 2.000 € kosten.</w:t>
+        <w:t xml:space="preserve">Der K müsste durch die Pflichtverletzung ein ersatzfähiger Schaden entstanden sein. Schaden ist jede unfreiwillige Einbuße an rechtlich geschützten Gütern.</w:t>
+      </w:r>
+      <w:r>
+        <w:rPr>
+          <w:rStyle w:val="Funotenzeichen"/>
+        </w:rPr>
+        <w:footnoteReference w:id="100"/>
+      </w:r>
+      <w:r>
+        <w:t xml:space="preserve"> Die Beschädigungen an Böden und Türen mindern den Wert der Mietsache, ihre Beseitigung würde 2.000 € kosten. Ein Schaden liegt somit vor.</w:t>
       </w:r>
     </w:p>
     <w:p>
@@ -10150,34 +10240,7 @@
     </w:p>
     <w:p>
       <w:r>
-        <w:t xml:space="preserve">Fraglich ist, ob der Anspruch eine vorherige Fristsetzung voraussetzt, wie T einwendet. Eine Fristsetzung ist gem. § 281 I 1 nur erforderlich, wenn wegen der Verletzung einer Leistungspflicht Schadensersatz statt der Leistung verlangt wird.</w:t>
-      </w:r>
-      <w:r>
-        <w:rPr>
-          <w:rStyle w:val="Funotenzeichen"/>
-        </w:rPr>
-        <w:footnoteReference w:id="98"/>
-      </w:r>
-      <w:r>
-        <w:t xml:space="preserve"> Die Pflicht des Mieters, die Mietsache schonend zu behandeln, ist keine Leistungspflicht, sondern eine nicht leistungsbezogene Nebenpflicht i.S.d. § 241 II.</w:t>
-      </w:r>
-      <w:r>
-        <w:rPr>
-          <w:rStyle w:val="Funotenzeichen"/>
-        </w:rPr>
-        <w:footnoteReference w:id="99"/>
-      </w:r>
-      <w:r>
-        <w:t xml:space="preserve"> Ihre Verletzung begründet einen Anspruch auf Schadensersatz neben der Leistung unmittelbar aus § 280 I, für den das Gesetz keine Fristsetzung vorsieht.</w:t>
-      </w:r>
-      <w:r>
-        <w:rPr>
-          <w:rStyle w:val="Funotenzeichen"/>
-        </w:rPr>
-        <w:footnoteReference w:id="100"/>
-      </w:r>
-      <w:r>
-        <w:t xml:space="preserve"> Der Geschädigte kann daher nach seiner Wahl gem. § 249 I Herstellung oder gem. § 249 II 1 sofort den erforderlichen Geldbetrag verlangen, ohne dem Schädiger zuvor Gelegenheit zur eigenen Reparatur geben zu müssen.</w:t>
+        <w:t xml:space="preserve">Fraglich ist, ob der Anspruch, wie T einwendet, eine vorherige Fristsetzung voraussetzt. Eine solche ist gem. § 281 I 1 nur erforderlich, wenn wegen der Verletzung einer Leistungspflicht Schadensersatz statt der Leistung verlangt wird.</w:t>
       </w:r>
       <w:r>
         <w:rPr>
@@ -10186,7 +10249,34 @@
         <w:footnoteReference w:id="101"/>
       </w:r>
       <w:r>
-        <w:t xml:space="preserve"> Da K Ersatz für bereits entstandene Schäden verlangt, bedurfte es keiner Fristsetzung; der Einwand der T greift nicht durch.</w:t>
+        <w:t xml:space="preserve"> Die Pflicht des Mieters zur schonenden Behandlung der Mietsache ist aber eine nicht leistungsbezogene Nebenpflicht i.S.d. § 241 II.</w:t>
+      </w:r>
+      <w:r>
+        <w:rPr>
+          <w:rStyle w:val="Funotenzeichen"/>
+        </w:rPr>
+        <w:footnoteReference w:id="102"/>
+      </w:r>
+      <w:r>
+        <w:t xml:space="preserve"> Ihre Verletzung begründet einen Anspruch auf Schadensersatz neben der Leistung unmittelbar aus § 280 I, für den keine Fristsetzung vorgesehen ist.</w:t>
+      </w:r>
+      <w:r>
+        <w:rPr>
+          <w:rStyle w:val="Funotenzeichen"/>
+        </w:rPr>
+        <w:footnoteReference w:id="103"/>
+      </w:r>
+      <w:r>
+        <w:t xml:space="preserve"> Der Geschädigte kann daher nach seiner Wahl gem. § 249 I Herstellung oder gem. § 249 II 1 sofort den erforderlichen Geldbetrag verlangen, ohne dem Schädiger zuvor Gelegenheit zur Reparatur geben zu müssen.</w:t>
+      </w:r>
+      <w:r>
+        <w:rPr>
+          <w:rStyle w:val="Funotenzeichen"/>
+        </w:rPr>
+        <w:footnoteReference w:id="104"/>
+      </w:r>
+      <w:r>
+        <w:t xml:space="preserve"> K verlangt Ersatz für bereits entstandene Schäden. Einer Fristsetzung bedurfte es somit nicht.</w:t>
       </w:r>
     </w:p>
     <w:p>
@@ -10208,7 +10298,7 @@
     </w:p>
     <w:p>
       <w:r>
-        <w:t xml:space="preserve">K hat gegen T einen Anspruch auf 2.000 € aus §§ 280 I, 241 II.</w:t>
+        <w:t xml:space="preserve">K hat somit gegen T einen Anspruch auf 2.000 € aus §§ 280 I, 241 II.</w:t>
       </w:r>
     </w:p>
     <w:p>
@@ -10230,7 +10320,13 @@
     </w:p>
     <w:p>
       <w:r>
-        <w:t xml:space="preserve">Mit diesem Anspruch könnte K gegen den Kautionsrückzahlungsanspruch der T wirksam aufgerechnet haben. Dies setzt eine Aufrechnungslage i.S.d. § 387, das Fehlen von Ausschlussgründen und eine Aufrechnungserklärung gem. § 388 voraus.</w:t>
+        <w:t xml:space="preserve">Mit diesem Anspruch könnte K gegen den Rückzahlungsanspruch der T aufgerechnet haben. Dies setzt eine Aufrechnungslage i.S.d. § 387, das Fehlen von Ausschlussgründen und eine Aufrechnungserklärung gem. § 388 voraus.</w:t>
+      </w:r>
+      <w:r>
+        <w:rPr>
+          <w:rStyle w:val="Funotenzeichen"/>
+        </w:rPr>
+        <w:footnoteReference w:id="105"/>
       </w:r>
     </w:p>
     <w:p>
@@ -10258,10 +10354,10 @@
         <w:rPr>
           <w:rStyle w:val="Funotenzeichen"/>
         </w:rPr>
-        <w:footnoteReference w:id="102"/>
-      </w:r>
-      <w:r>
-        <w:t xml:space="preserve"> K schuldet T die Kaution, T der K Schadensersatz; die Forderungen sind gegenseitig.</w:t>
+        <w:footnoteReference w:id="106"/>
+      </w:r>
+      <w:r>
+        <w:t xml:space="preserve"> K schuldet T die Kaution, T schuldet K Schadensersatz. Die Forderungen sind somit gegenseitig.</w:t>
       </w:r>
     </w:p>
     <w:p>
@@ -10283,43 +10379,7 @@
     </w:p>
     <w:p>
       <w:r>
-        <w:t xml:space="preserve">Weiterhin müssten Haupt- und Gegenforderung ihrem Gegenstand nach gleichartig sein.</w:t>
-      </w:r>
-      <w:r>
-        <w:rPr>
-          <w:rStyle w:val="Funotenzeichen"/>
-        </w:rPr>
-        <w:footnoteReference w:id="103"/>
-      </w:r>
-      <w:r>
-        <w:t xml:space="preserve"> Der Rückzahlungsanspruch ist auf Geld gerichtet, der Schadensersatzanspruch nach § 249 I hingegen zunächst auf Herstellung.</w:t>
-      </w:r>
-      <w:r>
-        <w:rPr>
-          <w:rStyle w:val="Funotenzeichen"/>
-        </w:rPr>
-        <w:footnoteReference w:id="104"/>
-      </w:r>
-      <w:r>
-        <w:t xml:space="preserve"> Bei der Beschädigung einer Sache kann der Gläubiger allerdings gem. § 249 II 1 statt der Herstellung den dafür erforderlichen Geldbetrag verlangen.</w:t>
-      </w:r>
-      <w:r>
-        <w:rPr>
-          <w:rStyle w:val="Funotenzeichen"/>
-        </w:rPr>
-        <w:footnoteReference w:id="105"/>
-      </w:r>
-      <w:r>
-        <w:t xml:space="preserve"> Diese Ersetzungsbefugnis muss er ausüben, damit der Anspruch als Geldforderung geltend gemacht werden kann.</w:t>
-      </w:r>
-      <w:r>
-        <w:rPr>
-          <w:rStyle w:val="Funotenzeichen"/>
-        </w:rPr>
-        <w:footnoteReference w:id="106"/>
-      </w:r>
-      <w:r>
-        <w:t xml:space="preserve"> Mit ihrer Erklärung, sie behalte die Kaution wegen der Schäden ein, verlangte K Geld statt Reparatur und übte damit die Ersetzungsbefugnis konkludent aus.</w:t>
+        <w:t xml:space="preserve">Weiterhin müssten die Forderungen ihrem Gegenstand nach gleichartig sein.</w:t>
       </w:r>
       <w:r>
         <w:rPr>
@@ -10328,7 +10388,34 @@
         <w:footnoteReference w:id="107"/>
       </w:r>
       <w:r>
-        <w:t xml:space="preserve"> Die Forderungen sind somit gleichartig.</w:t>
+        <w:t xml:space="preserve"> Der Rückzahlungsanspruch ist auf Geld gerichtet, der Schadensersatzanspruch gem. § 249 I hingegen zunächst auf Herstellung.</w:t>
+      </w:r>
+      <w:r>
+        <w:rPr>
+          <w:rStyle w:val="Funotenzeichen"/>
+        </w:rPr>
+        <w:footnoteReference w:id="108"/>
+      </w:r>
+      <w:r>
+        <w:t xml:space="preserve"> Bei Beschädigung einer Sache kann der Gläubiger jedoch gem. § 249 II 1 statt der Herstellung den erforderlichen Geldbetrag verlangen.</w:t>
+      </w:r>
+      <w:r>
+        <w:rPr>
+          <w:rStyle w:val="Funotenzeichen"/>
+        </w:rPr>
+        <w:footnoteReference w:id="109"/>
+      </w:r>
+      <w:r>
+        <w:t xml:space="preserve"> Diese Ersetzungsbefugnis muss er ausüben, um den Anspruch als Geldforderung geltend zu machen.</w:t>
+      </w:r>
+      <w:r>
+        <w:rPr>
+          <w:rStyle w:val="Funotenzeichen"/>
+        </w:rPr>
+        <w:footnoteReference w:id="110"/>
+      </w:r>
+      <w:r>
+        <w:t xml:space="preserve"> Mit der Erklärung, sie behalte die Kaution wegen der Schäden ein, verlangte K Geld statt Reparatur und übte die Ersetzungsbefugnis damit konkludent aus. Die Forderungen sind somit gleichartig.</w:t>
       </w:r>
     </w:p>
     <w:p>
@@ -10356,19 +10443,19 @@
         <w:rPr>
           <w:rStyle w:val="Funotenzeichen"/>
         </w:rPr>
-        <w:footnoteReference w:id="108"/>
-      </w:r>
-      <w:r>
-        <w:t xml:space="preserve"> Der Kautionsrückzahlungsanspruch ist mit Beendigung des Mietverhältnisses erfüllbar. Fällig wird er erst, wenn der Vermieter nach einer angemessenen Prüfungs- und Abrechnungsfrist überblicken kann, ob er die Kaution für eigene Ansprüche benötigt; eine feste Frist besteht nicht.</w:t>
-      </w:r>
-      <w:r>
-        <w:rPr>
-          <w:rStyle w:val="Funotenzeichen"/>
-        </w:rPr>
-        <w:footnoteReference w:id="109"/>
-      </w:r>
-      <w:r>
-        <w:t xml:space="preserve"> Als T die Rückzahlung acht Monate nach Rückgabe verlangte, war diese Frist jedenfalls abgelaufen, zumal K die Schäden bereits bei der Rückgabe festgestellt hatte. Der Schadensersatzanspruch der K war mit Eintritt des Schadens fällig, § 271 I.</w:t>
+        <w:footnoteReference w:id="111"/>
+      </w:r>
+      <w:r>
+        <w:t xml:space="preserve"> Der Rückzahlungsanspruch ist mit Beendigung des Mietverhältnisses erfüllbar. Fällig wird er erst nach einer angemessenen Prüfungs- und Abrechnungsfrist, in der der Vermieter klären kann, ob er die Kaution für eigene Ansprüche benötigt.</w:t>
+      </w:r>
+      <w:r>
+        <w:rPr>
+          <w:rStyle w:val="Funotenzeichen"/>
+        </w:rPr>
+        <w:footnoteReference w:id="112"/>
+      </w:r>
+      <w:r>
+        <w:t xml:space="preserve"> Diese Frist war acht Monate nach Rückgabe jedenfalls abgelaufen, zumal K die Schäden schon bei der Rückgabe festgestellt hatte. Der Schadensersatzanspruch der K war gem. § 271 I mit Eintritt des Schadens fällig. Beide Voraussetzungen liegen somit vor.</w:t>
       </w:r>
     </w:p>
     <w:p>
@@ -10390,31 +10477,31 @@
     </w:p>
     <w:p>
       <w:r>
-        <w:t xml:space="preserve">Die Gegenforderung dürfte zudem nicht einredebehaftet sein. Gem. § 390 kann mit einer Forderung, der eine Einrede entgegensteht, nicht aufgerechnet werden; bereits das Bestehen der Einrede genügt.</w:t>
-      </w:r>
-      <w:r>
-        <w:rPr>
-          <w:rStyle w:val="Funotenzeichen"/>
-        </w:rPr>
-        <w:footnoteReference w:id="110"/>
-      </w:r>
-      <w:r>
-        <w:t xml:space="preserve"> Ersatzansprüche des Vermieters wegen Verschlechterungen der Mietsache verjähren gem. § 548 I 1 in sechs Monaten, beginnend mit der Rückgabe der Mietsache, § 548 I 2.</w:t>
-      </w:r>
-      <w:r>
-        <w:rPr>
-          <w:rStyle w:val="Funotenzeichen"/>
-        </w:rPr>
-        <w:footnoteReference w:id="111"/>
-      </w:r>
-      <w:r>
-        <w:t xml:space="preserve"> Als K acht Monate nach Rückgabe erklärte, die Kaution einzubehalten, war der Anspruch daher verjährt. Gem. § 215 schließt die Verjährung die Aufrechnung jedoch nicht aus, wenn der Anspruch in dem Zeitpunkt noch nicht verjährt war, in dem erstmals aufgerechnet werden konnte.</w:t>
-      </w:r>
-      <w:r>
-        <w:rPr>
-          <w:rStyle w:val="Funotenzeichen"/>
-        </w:rPr>
-        <w:footnoteReference w:id="112"/>
+        <w:t xml:space="preserve">Die Gegenforderung dürfte nicht einredebehaftet sein. Gem. § 390 kann mit einer einredebehafteten Forderung nicht aufgerechnet werden, wobei schon das Bestehen der Einrede genügt.</w:t>
+      </w:r>
+      <w:r>
+        <w:rPr>
+          <w:rStyle w:val="Funotenzeichen"/>
+        </w:rPr>
+        <w:footnoteReference w:id="113"/>
+      </w:r>
+      <w:r>
+        <w:t xml:space="preserve"> Ersatzansprüche des Vermieters wegen Verschlechterungen der Mietsache verjähren gem. § 548 I in sechs Monaten ab Rückgabe der Mietsache.</w:t>
+      </w:r>
+      <w:r>
+        <w:rPr>
+          <w:rStyle w:val="Funotenzeichen"/>
+        </w:rPr>
+        <w:footnoteReference w:id="114"/>
+      </w:r>
+      <w:r>
+        <w:t xml:space="preserve"> Als K acht Monate nach Rückgabe erklärte, die Kaution einzubehalten, war der Anspruch somit verjährt. Gem. § 215 schließt die Verjährung die Aufrechnung aber nicht aus, wenn der Anspruch noch nicht verjährt war, als erstmals aufgerechnet werden konnte.</w:t>
+      </w:r>
+      <w:r>
+        <w:rPr>
+          <w:rStyle w:val="Funotenzeichen"/>
+        </w:rPr>
+        <w:footnoteReference w:id="115"/>
       </w:r>
       <w:r>
         <w:t xml:space="preserve"> Problematisch ist, dass die Forderungen erst durch die Ausübung der Ersetzungsbefugnis gleichartig wurden und K diese erst nach Ablauf der Verjährungsfrist ausübte. Nach ihrem Sicherungszweck ist die Barkautionsabrede aber so auszulegen, dass der Vermieter die Ersetzungsbefugnis erst im Rahmen der Kautionsabrechnung ausüben muss.</w:t>
@@ -10423,19 +10510,19 @@
         <w:rPr>
           <w:rStyle w:val="Funotenzeichen"/>
         </w:rPr>
-        <w:footnoteReference w:id="113"/>
-      </w:r>
-      <w:r>
-        <w:t xml:space="preserve"> Denn die Barkaution dient gerade dazu, dem Vermieter nach Mietende einen unkomplizierten Zugriff zur Befriedigung seiner Ansprüche zu verschaffen.</w:t>
-      </w:r>
-      <w:r>
-        <w:rPr>
-          <w:rStyle w:val="Funotenzeichen"/>
-        </w:rPr>
-        <w:footnoteReference w:id="114"/>
-      </w:r>
-      <w:r>
-        <w:t xml:space="preserve"> Die Forderungen standen sich daher schon bei Rückgabe der Wohnung und damit vor Eintritt der Verjährung aufrechenbar gegenüber; gem. § 215 hindert die Verjährung die Aufrechnung nicht.</w:t>
+        <w:footnoteReference w:id="116"/>
+      </w:r>
+      <w:r>
+        <w:t xml:space="preserve"> Denn die Barkaution soll dem Vermieter nach Mietende einen einfachen Zugriff zur Befriedigung seiner Ansprüche verschaffen.</w:t>
+      </w:r>
+      <w:r>
+        <w:rPr>
+          <w:rStyle w:val="Funotenzeichen"/>
+        </w:rPr>
+        <w:footnoteReference w:id="117"/>
+      </w:r>
+      <w:r>
+        <w:t xml:space="preserve"> Die Forderungen standen sich daher schon bei Rückgabe der Wohnung und damit vor Eintritt der Verjährung aufrechenbar gegenüber. Folglich hindert die Verjährung die Aufrechnung gem. § 215 nicht.</w:t>
       </w:r>
     </w:p>
     <w:p>
@@ -10457,25 +10544,25 @@
     </w:p>
     <w:p>
       <w:r>
-        <w:t xml:space="preserve">K müsste die Aufrechnung gem. § 388 S. 1 gegenüber T erklärt haben. Eine ausdrückliche Bezeichnung als Aufrechnung ist nicht erforderlich;</w:t>
-      </w:r>
-      <w:r>
-        <w:rPr>
-          <w:rStyle w:val="Funotenzeichen"/>
-        </w:rPr>
-        <w:footnoteReference w:id="115"/>
-      </w:r>
-      <w:r>
-        <w:t xml:space="preserve"> es genügt, dass der Wille, die eigene Forderung mit der fremden zu verrechnen, für den Empfänger erkennbar ist.</w:t>
-      </w:r>
-      <w:r>
-        <w:rPr>
-          <w:rStyle w:val="Funotenzeichen"/>
-        </w:rPr>
-        <w:footnoteReference w:id="116"/>
-      </w:r>
-      <w:r>
-        <w:t xml:space="preserve"> Aus Sicht der T (§§ 133, 157) bringt die Erklärung der K, sie behalte die Kaution wegen der Schäden ein, gerade diesen Verrechnungswillen zum Ausdruck; die Aufrechnung ist erklärt.</w:t>
+        <w:t xml:space="preserve">K müsste die Aufrechnung gem. § 388 S. 1 gegenüber T erklärt haben. Der Begriff Aufrechnung muss dabei nicht verwendet werden.</w:t>
+      </w:r>
+      <w:r>
+        <w:rPr>
+          <w:rStyle w:val="Funotenzeichen"/>
+        </w:rPr>
+        <w:footnoteReference w:id="118"/>
+      </w:r>
+      <w:r>
+        <w:t xml:space="preserve"> Es genügt, dass der Wille, die eigene mit der fremden Forderung zu verrechnen, für den Empfänger erkennbar ist.</w:t>
+      </w:r>
+      <w:r>
+        <w:rPr>
+          <w:rStyle w:val="Funotenzeichen"/>
+        </w:rPr>
+        <w:footnoteReference w:id="119"/>
+      </w:r>
+      <w:r>
+        <w:t xml:space="preserve"> Die Erklärung der K, sie behalte die Kaution wegen der Schäden ein, bringt aus Sicht der T gem. §§ 133, 157 gerade diesen Willen zum Ausdruck. Die Aufrechnung ist somit erklärt.</w:t>
       </w:r>
     </w:p>
     <w:p>
@@ -10497,7 +10584,7 @@
     </w:p>
     <w:p>
       <w:r>
-        <w:t xml:space="preserve">Gem. § 389 gelten die Forderungen, soweit sie sich decken, als in dem Zeitpunkt erloschen, in dem sie sich erstmals aufrechenbar gegenüberstanden. Beide betragen 2.000 € und erlöschen daher vollständig.</w:t>
+        <w:t xml:space="preserve">Gem. § 389 erlöschen die Forderungen, soweit sie sich decken, rückwirkend zu dem Zeitpunkt, in dem sie sich erstmals aufrechenbar gegenüberstanden. Beide betragen 2.000 € und erlöschen somit vollständig.</w:t>
       </w:r>
     </w:p>
     <w:p>
@@ -10519,7 +10606,7 @@
     </w:p>
     <w:p>
       <w:r>
-        <w:t xml:space="preserve">Der Rückzahlungsanspruch der T ist durch Aufrechnung erloschen.</w:t>
+        <w:t xml:space="preserve">Der Rückzahlungsanspruch der T ist somit durch Aufrechnung erloschen.</w:t>
       </w:r>
     </w:p>
     <w:p>
@@ -10563,7 +10650,7 @@
     </w:p>
     <w:p>
       <w:r>
-        <w:t xml:space="preserve">N könnte gegen K einen Anspruch auf Beseitigung der auf ihrem Grundstück verbliebenen Teile des Werkstattanbaus aus § 1004 I 1 haben.</w:t>
+        <w:t xml:space="preserve">N könnte von K gem. § 1004 I 1 die Beseitigung der auf ihrem Grundstück verbliebenen Reste des Werkstattanbaus verlangen.</w:t>
       </w:r>
     </w:p>
     <w:p>
@@ -10585,7 +10672,7 @@
     </w:p>
     <w:p>
       <w:r>
-        <w:t xml:space="preserve">N müsste Eigentümerin des beeinträchtigten Grundstücks sein; dies ist hinsichtlich des Nachbargrundstücks der Fall.</w:t>
+        <w:t xml:space="preserve">N ist Eigentümerin des beeinträchtigten Nachbargrundstücks.</w:t>
       </w:r>
     </w:p>
     <w:p>
@@ -10607,25 +10694,25 @@
     </w:p>
     <w:p>
       <w:r>
-        <w:t xml:space="preserve">Ferner müsste das Eigentum der N beeinträchtigt sein. Eine Eigentumsbeeinträchtigung i.S.d. § 1004 I ist jeder dem Inhalt des Eigentums widersprechende Zustand, der nicht in einer Entziehung oder Vorenthaltung des Besitzes besteht;</w:t>
-      </w:r>
-      <w:r>
-        <w:rPr>
-          <w:rStyle w:val="Funotenzeichen"/>
-        </w:rPr>
-        <w:footnoteReference w:id="117"/>
-      </w:r>
-      <w:r>
-        <w:t xml:space="preserve"> die Einwirkung darf nach Dauer und Intensität nicht völlig unerheblich sein.</w:t>
-      </w:r>
-      <w:r>
-        <w:rPr>
-          <w:rStyle w:val="Funotenzeichen"/>
-        </w:rPr>
-        <w:footnoteReference w:id="118"/>
-      </w:r>
-      <w:r>
-        <w:t xml:space="preserve"> Die Reste des Werkstattanbaus nehmen dauerhaft Fläche des Grundstücks der N in Anspruch und schränken ihre Nutzungsmöglichkeit ein. Eine Beeinträchtigung liegt damit grundsätzlich vor. Fraglich ist jedoch, ob N diesen Zustand aufgrund der Vorschriften über den Überbau dulden muss.</w:t>
+        <w:t xml:space="preserve">Ferner müsste das Eigentum der N beeinträchtigt sein. Eine Beeinträchtigung i.S.d. § 1004 I ist jeder dem Inhalt des Eigentums widersprechende Zustand, der nicht in einer Entziehung oder Vorenthaltung des Besitzes besteht.</w:t>
+      </w:r>
+      <w:r>
+        <w:rPr>
+          <w:rStyle w:val="Funotenzeichen"/>
+        </w:rPr>
+        <w:footnoteReference w:id="120"/>
+      </w:r>
+      <w:r>
+        <w:t xml:space="preserve"> Die Einwirkung darf nach Dauer und Intensität nicht völlig unerheblich sein.</w:t>
+      </w:r>
+      <w:r>
+        <w:rPr>
+          <w:rStyle w:val="Funotenzeichen"/>
+        </w:rPr>
+        <w:footnoteReference w:id="121"/>
+      </w:r>
+      <w:r>
+        <w:t xml:space="preserve"> Die Reste des Werkstattanbaus nehmen dauerhaft Fläche des Grundstücks der N in Anspruch und schränken dessen Nutzung ein. Eine Beeinträchtigung liegt somit grundsätzlich vor. Fraglich ist aber, ob N diesen Zustand nach den Vorschriften über den Überbau dulden muss.</w:t>
       </w:r>
     </w:p>
     <w:p>
@@ -10647,7 +10734,13 @@
     </w:p>
     <w:p>
       <w:r>
-        <w:t xml:space="preserve">N könnte zunächst gem. § 912 I zur Duldung verpflichtet gewesen sein. Danach muss der Nachbar einen Überbau dulden, wenn der Eigentümer bei der Errichtung eines Gebäudes ohne Vorsatz oder grobe Fahrlässigkeit über die Grenze gebaut und der Nachbar nicht vor oder sofort nach der Grenzüberschreitung widersprochen hat.</w:t>
+        <w:t xml:space="preserve">N könnte gem. § 912 I zur Duldung verpflichtet gewesen sein. Danach muss der Nachbar einen Überbau dulden, wenn der Eigentümer bei Errichtung eines Gebäudes ohne Vorsatz oder grobe Fahrlässigkeit über die Grenze gebaut und der Nachbar nicht vor oder sofort nach der Grenzüberschreitung widersprochen hat.</w:t>
+      </w:r>
+      <w:r>
+        <w:rPr>
+          <w:rStyle w:val="Funotenzeichen"/>
+        </w:rPr>
+        <w:footnoteReference w:id="122"/>
       </w:r>
     </w:p>
     <w:p>
@@ -10669,13 +10762,13 @@
     </w:p>
     <w:p>
       <w:r>
-        <w:t xml:space="preserve">Zunächst müsste ein Überbau vorliegen. Ein solcher ist gegeben, wenn ein einheitliches Gebäude, das vom Stammgrundstück aus errichtet wird, die Grenze überschreitet und teilweise auf dem Nachbargrundstück steht.</w:t>
-      </w:r>
-      <w:r>
-        <w:rPr>
-          <w:rStyle w:val="Funotenzeichen"/>
-        </w:rPr>
-        <w:footnoteReference w:id="119"/>
+        <w:t xml:space="preserve">Zunächst müsste ein Überbau vorliegen. Ein solcher ist gegeben, wenn ein einheitliches Gebäude, das vom Stammgrundstück aus errichtet wird, die Grenze überschreitet.</w:t>
+      </w:r>
+      <w:r>
+        <w:rPr>
+          <w:rStyle w:val="Funotenzeichen"/>
+        </w:rPr>
+        <w:footnoteReference w:id="123"/>
       </w:r>
       <w:r>
         <w:t xml:space="preserve"> Der Vater der V errichtete als damaliger Eigentümer des Stammgrundstücks den Werkstattanbau, der teilweise auf dem Grundstück der N steht. Damit ist ein Überbau gegeben.</w:t>
@@ -10700,25 +10793,34 @@
     </w:p>
     <w:p>
       <w:r>
-        <w:t xml:space="preserve">Dem Vater der V dürfte hinsichtlich der Grenzüberschreitung weder Vorsatz noch grobe Fahrlässigkeit zur Last fallen.</w:t>
-      </w:r>
-      <w:r>
-        <w:rPr>
-          <w:rStyle w:val="Funotenzeichen"/>
-        </w:rPr>
-        <w:footnoteReference w:id="120"/>
-      </w:r>
-      <w:r>
-        <w:t xml:space="preserve"> Da ihm der Grenzverlauf unbekannt war, handelte er nicht vorsätzlich. Grob fahrlässig handelt, wer die im Verkehr erforderliche Sorgfalt in besonders schwerem Maße verletzt und schon naheliegende Überlegungen nicht anstellt.</w:t>
-      </w:r>
-      <w:r>
-        <w:rPr>
-          <w:rStyle w:val="Funotenzeichen"/>
-        </w:rPr>
-        <w:footnoteReference w:id="121"/>
-      </w:r>
-      <w:r>
-        <w:t xml:space="preserve"> Der Vater der V hatte die verfügbaren Unterlagen sorgfältig geprüft; gleichwohl war die Grenzüberschreitung für ihn nicht erkennbar. Ihm fällt folglich keines von beidem zur Last.</w:t>
+        <w:t xml:space="preserve">Dem Vater der V dürfte weder Vorsatz noch grobe Fahrlässigkeit zur Last fallen.</w:t>
+      </w:r>
+      <w:r>
+        <w:rPr>
+          <w:rStyle w:val="Funotenzeichen"/>
+        </w:rPr>
+        <w:footnoteReference w:id="124"/>
+      </w:r>
+      <w:r>
+        <w:t xml:space="preserve"> Vorsätzlich handelt, wer weiß, dass er über die Grenze baut.</w:t>
+      </w:r>
+      <w:r>
+        <w:rPr>
+          <w:rStyle w:val="Funotenzeichen"/>
+        </w:rPr>
+        <w:footnoteReference w:id="125"/>
+      </w:r>
+      <w:r>
+        <w:t xml:space="preserve"> Dem Vater der V war der Grenzverlauf unbekannt, sodass er nicht vorsätzlich handelte. Grob fahrlässig handelt, wer die im Verkehr erforderliche Sorgfalt in besonders schwerem Maße verletzt und schon naheliegende Überlegungen nicht anstellt.</w:t>
+      </w:r>
+      <w:r>
+        <w:rPr>
+          <w:rStyle w:val="Funotenzeichen"/>
+        </w:rPr>
+        <w:footnoteReference w:id="126"/>
+      </w:r>
+      <w:r>
+        <w:t xml:space="preserve"> Der Vater der V hatte die verfügbaren Unterlagen sorgfältig geprüft, ohne dass die Grenzüberschreitung erkennbar war. Ihm fällt somit auch keine grobe Fahrlässigkeit zur Last.</w:t>
       </w:r>
     </w:p>
     <w:p>
@@ -10746,10 +10848,10 @@
         <w:rPr>
           <w:rStyle w:val="Funotenzeichen"/>
         </w:rPr>
-        <w:footnoteReference w:id="122"/>
-      </w:r>
-      <w:r>
-        <w:t xml:space="preserve"> Sie beobachtete die Errichtung des Anbaus und erkannte bereits währenddessen, dass Teile auf ihrem Grundstück entstanden. Gleichwohl widersprach sie erst zwei Monate nach der Fertigstellung. Ihr Widerspruch war damit nicht rechtzeitig.</w:t>
+        <w:footnoteReference w:id="127"/>
+      </w:r>
+      <w:r>
+        <w:t xml:space="preserve"> Sie erkannte bereits während der Errichtung, dass Teile des Anbaus auf ihrem Grundstück entstanden, widersprach aber erst zwei Monate nach der Fertigstellung. Ihr Widerspruch war somit nicht rechtzeitig.</w:t>
       </w:r>
     </w:p>
     <w:p>
@@ -10771,7 +10873,7 @@
     </w:p>
     <w:p>
       <w:r>
-        <w:t xml:space="preserve">Die Voraussetzungen des § 912 I lagen bei Errichtung des Werkstattanbaus vor.</w:t>
+        <w:t xml:space="preserve">Die Voraussetzungen des § 912 I waren bei Errichtung des Anbaus somit erfüllt.</w:t>
       </w:r>
     </w:p>
     <w:p>
@@ -10793,22 +10895,25 @@
     </w:p>
     <w:p>
       <w:r>
-        <w:t xml:space="preserve">N war daher zur Duldung des Überbaus verpflichtet und ist hierfür gem. § 912 II 1 durch eine Geldrente zu entschädigen.</w:t>
-      </w:r>
-      <w:r>
-        <w:rPr>
-          <w:rStyle w:val="Funotenzeichen"/>
-        </w:rPr>
-        <w:footnoteReference w:id="123"/>
-      </w:r>
-      <w:r>
-        <w:t xml:space="preserve"> Zugleich bleibt der hinübergebaute Gebäudeteil sachenrechtlich dem Stammgrundstück zugeordnet und steht im Eigentum des jeweiligen Eigentümers des Stammgrundstücks.</w:t>
-      </w:r>
-      <w:r>
-        <w:rPr>
-          <w:rStyle w:val="Funotenzeichen"/>
-        </w:rPr>
-        <w:footnoteReference w:id="124"/>
+        <w:t xml:space="preserve">Der Nachbar muss den entschuldigten Überbau dulden und ist gem. § 912 II 1 durch eine Geldrente zu entschädigen.</w:t>
+      </w:r>
+      <w:r>
+        <w:rPr>
+          <w:rStyle w:val="Funotenzeichen"/>
+        </w:rPr>
+        <w:footnoteReference w:id="128"/>
+      </w:r>
+      <w:r>
+        <w:t xml:space="preserve"> Der hinübergebaute Gebäudeteil bleibt zudem dem Stammgrundstück zugeordnet und steht im Eigentum von dessen jeweiligem Eigentümer.</w:t>
+      </w:r>
+      <w:r>
+        <w:rPr>
+          <w:rStyle w:val="Funotenzeichen"/>
+        </w:rPr>
+        <w:footnoteReference w:id="129"/>
+      </w:r>
+      <w:r>
+        <w:t xml:space="preserve"> N war somit zur Duldung verpflichtet.</w:t>
       </w:r>
     </w:p>
     <w:p>
@@ -10836,10 +10941,10 @@
         <w:rPr>
           <w:rStyle w:val="Funotenzeichen"/>
         </w:rPr>
-        <w:footnoteReference w:id="125"/>
-      </w:r>
-      <w:r>
-        <w:t xml:space="preserve"> Dieses ging gem. § 1922 I auf V als Alleinerbin und sodann auf K über, die damit in die Rechtsstellung aus § 912 I einrückte.</w:t>
+        <w:footnoteReference w:id="130"/>
+      </w:r>
+      <w:r>
+        <w:t xml:space="preserve"> Dieses ging gem. § 1922 I auf V als Alleinerbin und sodann auf K über. Die Duldungspflicht wirkte somit auch zugunsten der K.</w:t>
       </w:r>
     </w:p>
     <w:p>
@@ -10861,25 +10966,16 @@
     </w:p>
     <w:p>
       <w:r>
-        <w:t xml:space="preserve">Die Duldungspflicht könnte jedoch durch den Teilabriss erloschen sein. § 912 soll verhindern, dass wirtschaftliche Werte durch die Zerschlagung eines einheitlichen Gebäudes vernichtet werden; geschützt ist also der Bestand des grenzüberschreitenden Gebäudes als wirtschaftliche Einheit.</w:t>
-      </w:r>
-      <w:r>
-        <w:rPr>
-          <w:rStyle w:val="Funotenzeichen"/>
-        </w:rPr>
-        <w:footnoteReference w:id="126"/>
-      </w:r>
-      <w:r>
-        <w:t xml:space="preserve"> K ließ den auf ihrem Grundstück befindlichen Teil des Werkstattanbaus abreißen und hat diese Einheit damit selbst aufgehoben.</w:t>
-      </w:r>
-      <w:r>
-        <w:rPr>
-          <w:rStyle w:val="Funotenzeichen"/>
-        </w:rPr>
-        <w:footnoteReference w:id="127"/>
-      </w:r>
-      <w:r>
-        <w:t xml:space="preserve"> Die auf dem Grundstück der N verbliebenen Reste bilden kein Gebäude mehr, dessen Erhalt § 912 sichern könnte. Mit dem Schutzzweck der Norm ist auch die Duldungspflicht der N entfallen.</w:t>
+        <w:t xml:space="preserve">Die Duldungspflicht könnte jedoch durch den Teilabriss erloschen sein. Die Vorschrift des § 912 soll verhindern, dass wirtschaftliche Werte durch die Zerschlagung eines einheitlichen Gebäudes vernichtet werden. Geschützt ist also der Bestand des grenzüberschreitenden Gebäudes als wirtschaftliche Einheit.</w:t>
+      </w:r>
+      <w:r>
+        <w:rPr>
+          <w:rStyle w:val="Funotenzeichen"/>
+        </w:rPr>
+        <w:footnoteReference w:id="131"/>
+      </w:r>
+      <w:r>
+        <w:t xml:space="preserve"> K ließ den auf ihrem Grundstück stehenden Teil des Anbaus abreißen und hob diese Einheit damit selbst auf. Die verbliebenen Reste bilden kein Gebäude mehr, dessen Erhalt § 912 sichern könnte. Mit dem Schutzzweck der Norm ist somit auch die Duldungspflicht der N entfallen.</w:t>
       </w:r>
     </w:p>
     <w:p>
@@ -10901,34 +10997,34 @@
     </w:p>
     <w:p>
       <w:r>
-        <w:t xml:space="preserve">Fraglich ist weiter, wem die Gebäudereste gehören. K meint, sie gehörten nun der N. Zwar sind fest mit dem Grund und Boden verbundene Gebäude gem. § 94 I grundsätzlich wesentliche Bestandteile des Grundstücks, auf dem sie stehen.</w:t>
-      </w:r>
-      <w:r>
-        <w:rPr>
-          <w:rStyle w:val="Funotenzeichen"/>
-        </w:rPr>
-        <w:footnoteReference w:id="128"/>
-      </w:r>
-      <w:r>
-        <w:t xml:space="preserve"> Beim Überbau gilt aufgrund der §§ 912 ff. jedoch eine abweichende Zuordnung zum Stammgrundstück.</w:t>
-      </w:r>
-      <w:r>
-        <w:rPr>
-          <w:rStyle w:val="Funotenzeichen"/>
-        </w:rPr>
-        <w:footnoteReference w:id="129"/>
-      </w:r>
-      <w:r>
-        <w:t xml:space="preserve"> Der Abriss des auf dem Stammgrundstück stehenden Teils ändert an dieser Zuordnung nichts, sodass die Reste nicht nachträglich Bestandteil des Grundstücks der N werden.</w:t>
-      </w:r>
-      <w:r>
-        <w:rPr>
-          <w:rStyle w:val="Funotenzeichen"/>
-        </w:rPr>
-        <w:footnoteReference w:id="130"/>
-      </w:r>
-      <w:r>
-        <w:t xml:space="preserve"> Die Auffassung der K trifft daher nicht zu; sie ist Eigentümerin der Gebäudereste geblieben.</w:t>
+        <w:t xml:space="preserve">Fraglich ist weiter, wem die Gebäudereste gehören. K meint, sie gehörten nun der N. Gem. § 94 I sind Gebäude zwar wesentliche Bestandteile des Grundstücks, auf dem sie stehen.</w:t>
+      </w:r>
+      <w:r>
+        <w:rPr>
+          <w:rStyle w:val="Funotenzeichen"/>
+        </w:rPr>
+        <w:footnoteReference w:id="132"/>
+      </w:r>
+      <w:r>
+        <w:t xml:space="preserve"> Beim Überbau gilt nach den §§ 912 ff. jedoch eine abweichende Zuordnung zum Stammgrundstück.</w:t>
+      </w:r>
+      <w:r>
+        <w:rPr>
+          <w:rStyle w:val="Funotenzeichen"/>
+        </w:rPr>
+        <w:footnoteReference w:id="133"/>
+      </w:r>
+      <w:r>
+        <w:t xml:space="preserve"> Diese Zuordnung bleibt auch nach Abriss des auf dem Stammgrundstück stehenden Teils bestehen.</w:t>
+      </w:r>
+      <w:r>
+        <w:rPr>
+          <w:rStyle w:val="Funotenzeichen"/>
+        </w:rPr>
+        <w:footnoteReference w:id="134"/>
+      </w:r>
+      <w:r>
+        <w:t xml:space="preserve"> Die Reste sind folglich nicht Bestandteil des Grundstücks der N geworden. Die Auffassung der K trifft somit nicht zu, sie ist Eigentümerin der Gebäudereste geblieben.</w:t>
       </w:r>
     </w:p>
     <w:p>
@@ -10936,7 +11032,7 @@
         <w:keepNext/>
         <w:keepLines/>
         <w:jc w:val="left"/>
-        <w:outlineLvl w:val="2"/>
+        <w:outlineLvl w:val="3"/>
       </w:pPr>
       <w:bookmarkStart w:id="5108" w:name="_TocG108"/>
       <w:r>
@@ -10944,40 +11040,13 @@
           <w:b/>
           <w:bCs/>
         </w:rPr>
-        <w:t xml:space="preserve">III. Verantwortlichkeit der K als Störerin</w:t>
+        <w:t xml:space="preserve">5. Zwischenergebnis zur Beeinträchtigung</w:t>
       </w:r>
       <w:bookmarkEnd w:id="5108"/>
     </w:p>
     <w:p>
       <w:r>
-        <w:t xml:space="preserve">K müsste Störerin sein. Handlungsstörer ist, wer die Beeinträchtigung durch sein Verhalten adäquat verursacht hat;</w:t>
-      </w:r>
-      <w:r>
-        <w:rPr>
-          <w:rStyle w:val="Funotenzeichen"/>
-        </w:rPr>
-        <w:footnoteReference w:id="131"/>
-      </w:r>
-      <w:r>
-        <w:t xml:space="preserve"> als Zustandsstörer haftet dagegen, wer sie nicht selbst herbeigeführt hat, aber durch seinen maßgebenden Willen aufrechterhält.</w:t>
-      </w:r>
-      <w:r>
-        <w:rPr>
-          <w:rStyle w:val="Funotenzeichen"/>
-        </w:rPr>
-        <w:footnoteReference w:id="132"/>
-      </w:r>
-      <w:r>
-        <w:t xml:space="preserve"> Voraussetzung ist, dass er die Störung beseitigen kann und sie ihm zurechenbar ist.</w:t>
-      </w:r>
-      <w:r>
-        <w:rPr>
-          <w:rStyle w:val="Funotenzeichen"/>
-        </w:rPr>
-        <w:footnoteReference w:id="133"/>
-      </w:r>
-      <w:r>
-        <w:t xml:space="preserve"> Zwar hat nicht K, sondern der Vater der V den Anbau errichtet. K ist jedoch Eigentümerin der Gebäudereste und kann diese beseitigen. Zudem hat sie durch den Teilabriss selbst bewirkt, dass aus dem zu duldenden Überbau eine nicht mehr zu duldende Beeinträchtigung wurde, und lässt die Reste bewusst stehen. Die Beeinträchtigung ist ihr daher zurechenbar; K ist jedenfalls Zustandsstörerin.</w:t>
+        <w:t xml:space="preserve">Das Eigentum der N ist somit durch die Gebäudereste beeinträchtigt, ohne dass N diese nach § 912 I dulden muss.</w:t>
       </w:r>
     </w:p>
     <w:p>
@@ -10993,13 +11062,40 @@
           <w:b/>
           <w:bCs/>
         </w:rPr>
-        <w:t xml:space="preserve">IV. Kein Ausschluss nach § 1004 II BGB</w:t>
+        <w:t xml:space="preserve">III. Verantwortlichkeit der K als Störerin</w:t>
       </w:r>
       <w:bookmarkEnd w:id="5109"/>
     </w:p>
     <w:p>
       <w:r>
-        <w:t xml:space="preserve">Schließlich dürfte N nicht zur Duldung verpflichtet sein, § 1004 II. Die Pflicht aus § 912 I ist aber entfallen; andere Gründe fehlen.</w:t>
+        <w:t xml:space="preserve">K müsste Störerin sein. Handlungsstörer ist, wer die Beeinträchtigung durch sein Verhalten adäquat verursacht hat.</w:t>
+      </w:r>
+      <w:r>
+        <w:rPr>
+          <w:rStyle w:val="Funotenzeichen"/>
+        </w:rPr>
+        <w:footnoteReference w:id="135"/>
+      </w:r>
+      <w:r>
+        <w:t xml:space="preserve"> Zustandsstörer ist, wer sie zwar nicht herbeigeführt hat, aber durch seinen maßgebenden Willen aufrechterhält.</w:t>
+      </w:r>
+      <w:r>
+        <w:rPr>
+          <w:rStyle w:val="Funotenzeichen"/>
+        </w:rPr>
+        <w:footnoteReference w:id="136"/>
+      </w:r>
+      <w:r>
+        <w:t xml:space="preserve"> Er muss die Störung beseitigen können und sie muss ihm zurechenbar sein.</w:t>
+      </w:r>
+      <w:r>
+        <w:rPr>
+          <w:rStyle w:val="Funotenzeichen"/>
+        </w:rPr>
+        <w:footnoteReference w:id="137"/>
+      </w:r>
+      <w:r>
+        <w:t xml:space="preserve"> Den Anbau hat zwar nicht K, sondern der Vater der V errichtet. K ist aber Eigentümerin der Reste und kann sie beseitigen. Zudem hat sie durch den Teilabriss selbst bewirkt, dass aus dem zu duldenden Überbau eine nicht mehr zu duldende Beeinträchtigung wurde, und lässt die Reste bewusst stehen. Die Beeinträchtigung ist ihr somit zurechenbar. K ist folglich jedenfalls Zustandsstörerin.</w:t>
       </w:r>
     </w:p>
     <w:p>
@@ -11015,9 +11111,31 @@
           <w:b/>
           <w:bCs/>
         </w:rPr>
+        <w:t xml:space="preserve">IV. Kein Ausschluss nach § 1004 II BGB</w:t>
+      </w:r>
+      <w:bookmarkEnd w:id="5110"/>
+    </w:p>
+    <w:p>
+      <w:r>
+        <w:t xml:space="preserve">Nach Wegfall der Pflicht aus § 912 I ist N somit auch nicht gem. § 1004 II zur Duldung verpflichtet.</w:t>
+      </w:r>
+    </w:p>
+    <w:p>
+      <w:pPr>
+        <w:keepNext/>
+        <w:keepLines/>
+        <w:jc w:val="left"/>
+        <w:outlineLvl w:val="2"/>
+      </w:pPr>
+      <w:bookmarkStart w:id="5111" w:name="_TocG111"/>
+      <w:r>
+        <w:rPr>
+          <w:b/>
+          <w:bCs/>
+        </w:rPr>
         <w:t xml:space="preserve">V. Ergebnis zu Frage 4</w:t>
       </w:r>
-      <w:bookmarkEnd w:id="5110"/>
+      <w:bookmarkEnd w:id="5111"/>
     </w:p>
     <w:p>
       <w:r>
@@ -11317,7 +11435,7 @@
         <w:footnoteRef/>
       </w:r>
       <w:r>
-        <w:t xml:space="preserve"> [Quelle einfügen: Bearbeiter, in: Werk, § … Rn. …; BGH, Urt. v. … – Az. …, Fundstelle …; Bearbeiter, in: Werk, § … Rn. …; Bearbeiter, in: Werk, § … Rn. …]</w:t>
+        <w:t xml:space="preserve"> </w:t>
       </w:r>
     </w:p>
   </w:footnote>
@@ -11333,7 +11451,7 @@
         <w:footnoteRef/>
       </w:r>
       <w:r>
-        <w:t xml:space="preserve"> [Quelle einfügen]</w:t>
+        <w:t xml:space="preserve"> </w:t>
       </w:r>
     </w:p>
   </w:footnote>
@@ -11349,7 +11467,7 @@
         <w:footnoteRef/>
       </w:r>
       <w:r>
-        <w:t xml:space="preserve"> [Quelle einfügen]</w:t>
+        <w:t xml:space="preserve"> </w:t>
       </w:r>
     </w:p>
   </w:footnote>
@@ -11365,7 +11483,7 @@
         <w:footnoteRef/>
       </w:r>
       <w:r>
-        <w:t xml:space="preserve"> [Quelle einfügen]</w:t>
+        <w:t xml:space="preserve"> </w:t>
       </w:r>
     </w:p>
   </w:footnote>
@@ -11381,7 +11499,7 @@
         <w:footnoteRef/>
       </w:r>
       <w:r>
-        <w:t xml:space="preserve"> [Quelle einfügen]</w:t>
+        <w:t xml:space="preserve"> </w:t>
       </w:r>
     </w:p>
   </w:footnote>
@@ -11397,7 +11515,7 @@
         <w:footnoteRef/>
       </w:r>
       <w:r>
-        <w:t xml:space="preserve"> [Quelle einfügen]</w:t>
+        <w:t xml:space="preserve"> </w:t>
       </w:r>
     </w:p>
   </w:footnote>
@@ -11413,7 +11531,7 @@
         <w:footnoteRef/>
       </w:r>
       <w:r>
-        <w:t xml:space="preserve"> [Quelle einfügen]</w:t>
+        <w:t xml:space="preserve"> </w:t>
       </w:r>
     </w:p>
   </w:footnote>
@@ -11429,7 +11547,7 @@
         <w:footnoteRef/>
       </w:r>
       <w:r>
-        <w:t xml:space="preserve"> [Quelle einfügen]</w:t>
+        <w:t xml:space="preserve"> </w:t>
       </w:r>
     </w:p>
   </w:footnote>
@@ -11445,7 +11563,7 @@
         <w:footnoteRef/>
       </w:r>
       <w:r>
-        <w:t xml:space="preserve"> [Quelle einfügen]</w:t>
+        <w:t xml:space="preserve"> </w:t>
       </w:r>
     </w:p>
   </w:footnote>
@@ -11461,7 +11579,7 @@
         <w:footnoteRef/>
       </w:r>
       <w:r>
-        <w:t xml:space="preserve"> [Quelle einfügen]</w:t>
+        <w:t xml:space="preserve"> </w:t>
       </w:r>
     </w:p>
   </w:footnote>
@@ -11477,7 +11595,7 @@
         <w:footnoteRef/>
       </w:r>
       <w:r>
-        <w:t xml:space="preserve"> [Quelle einfügen: Bearbeiter, in: Werk, § … Rn. …; BGH, Urt. v. … – Az. …, Fundstelle …]</w:t>
+        <w:t xml:space="preserve"> </w:t>
       </w:r>
     </w:p>
   </w:footnote>
@@ -11493,7 +11611,7 @@
         <w:footnoteRef/>
       </w:r>
       <w:r>
-        <w:t xml:space="preserve"> [Quelle einfügen: Bearbeiter, in: Werk, § … Rn. …; BGH, Urt. v. … – Az. …, Fundstelle …]</w:t>
+        <w:t xml:space="preserve"> </w:t>
       </w:r>
     </w:p>
   </w:footnote>
@@ -11509,7 +11627,7 @@
         <w:footnoteRef/>
       </w:r>
       <w:r>
-        <w:t xml:space="preserve"> [Quelle einfügen]</w:t>
+        <w:t xml:space="preserve"> </w:t>
       </w:r>
     </w:p>
   </w:footnote>
@@ -11525,7 +11643,7 @@
         <w:footnoteRef/>
       </w:r>
       <w:r>
-        <w:t xml:space="preserve"> [Quelle einfügen]</w:t>
+        <w:t xml:space="preserve"> </w:t>
       </w:r>
     </w:p>
   </w:footnote>
@@ -11541,7 +11659,7 @@
         <w:footnoteRef/>
       </w:r>
       <w:r>
-        <w:t xml:space="preserve"> [Quelle einfügen]</w:t>
+        <w:t xml:space="preserve"> </w:t>
       </w:r>
     </w:p>
   </w:footnote>
@@ -11557,7 +11675,7 @@
         <w:footnoteRef/>
       </w:r>
       <w:r>
-        <w:t xml:space="preserve"> [Quelle einfügen]</w:t>
+        <w:t xml:space="preserve"> </w:t>
       </w:r>
     </w:p>
   </w:footnote>
@@ -11573,7 +11691,7 @@
         <w:footnoteRef/>
       </w:r>
       <w:r>
-        <w:t xml:space="preserve"> [Quelle einfügen]</w:t>
+        <w:t xml:space="preserve"> </w:t>
       </w:r>
     </w:p>
   </w:footnote>
@@ -11589,7 +11707,7 @@
         <w:footnoteRef/>
       </w:r>
       <w:r>
-        <w:t xml:space="preserve"> [Quelle einfügen: Bearbeiter, in: Werk, § … Rn. …; BGH, Urt. v. … – Az. …, Fundstelle …]</w:t>
+        <w:t xml:space="preserve"> </w:t>
       </w:r>
     </w:p>
   </w:footnote>
@@ -11605,7 +11723,7 @@
         <w:footnoteRef/>
       </w:r>
       <w:r>
-        <w:t xml:space="preserve"> [Quelle einfügen]</w:t>
+        <w:t xml:space="preserve"> </w:t>
       </w:r>
     </w:p>
   </w:footnote>
@@ -11621,7 +11739,7 @@
         <w:footnoteRef/>
       </w:r>
       <w:r>
-        <w:t xml:space="preserve"> [Quelle einfügen: Bearbeiter, in: Werk, § … Rn. …; BGH, Urt. v. … – Az. …, Fundstelle …; Bearbeiter, in: Werk, § … Rn. …]</w:t>
+        <w:t xml:space="preserve"> </w:t>
       </w:r>
     </w:p>
   </w:footnote>
@@ -11637,7 +11755,7 @@
         <w:footnoteRef/>
       </w:r>
       <w:r>
-        <w:t xml:space="preserve"> [Quelle einfügen: Bearbeiter, in: Werk, § … Rn. …; BGH, Urt. v. … – Az. …, Fundstelle …; Bearbeiter, in: Werk, § … Rn. …; Bearbeiter, in: Werk, § … Rn. …]</w:t>
+        <w:t xml:space="preserve"> </w:t>
       </w:r>
     </w:p>
   </w:footnote>
@@ -11653,7 +11771,7 @@
         <w:footnoteRef/>
       </w:r>
       <w:r>
-        <w:t xml:space="preserve"> [Quelle einfügen]</w:t>
+        <w:t xml:space="preserve"> </w:t>
       </w:r>
     </w:p>
   </w:footnote>
@@ -11669,7 +11787,7 @@
         <w:footnoteRef/>
       </w:r>
       <w:r>
-        <w:t xml:space="preserve"> [Quelle einfügen]</w:t>
+        <w:t xml:space="preserve"> </w:t>
       </w:r>
     </w:p>
   </w:footnote>
@@ -11685,7 +11803,7 @@
         <w:footnoteRef/>
       </w:r>
       <w:r>
-        <w:t xml:space="preserve"> [Quelle einfügen]</w:t>
+        <w:t xml:space="preserve"> </w:t>
       </w:r>
     </w:p>
   </w:footnote>
@@ -11701,7 +11819,7 @@
         <w:footnoteRef/>
       </w:r>
       <w:r>
-        <w:t xml:space="preserve"> [Quelle einfügen: Bearbeiter, in: Werk, § … Rn. …; BGH, Urt. v. … – Az. …, Fundstelle …; Bearbeiter, in: Werk, § … Rn. …; Bearbeiter, in: Werk, § … Rn. …; BGH, Urt. v. … – Az. …, Fundstelle …]</w:t>
+        <w:t xml:space="preserve"> </w:t>
       </w:r>
     </w:p>
   </w:footnote>
@@ -11717,7 +11835,7 @@
         <w:footnoteRef/>
       </w:r>
       <w:r>
-        <w:t xml:space="preserve"> [Quelle einfügen: Bearbeiter, in: Werk, § … Rn. …; BGH, Urt. v. … – Az. …, Fundstelle …; Bearbeiter, in: Werk, § … Rn. …; Bearbeiter, in: Werk, § … Rn. …]</w:t>
+        <w:t xml:space="preserve"> </w:t>
       </w:r>
     </w:p>
   </w:footnote>
@@ -11733,7 +11851,7 @@
         <w:footnoteRef/>
       </w:r>
       <w:r>
-        <w:t xml:space="preserve"> [Quelle einfügen: Bearbeiter, in: Werk, § … Rn. …; BGH, Urt. v. … – Az. …, Fundstelle …]</w:t>
+        <w:t xml:space="preserve"> </w:t>
       </w:r>
     </w:p>
   </w:footnote>
@@ -11749,7 +11867,7 @@
         <w:footnoteRef/>
       </w:r>
       <w:r>
-        <w:t xml:space="preserve"> [Quelle einfügen]</w:t>
+        <w:t xml:space="preserve"> </w:t>
       </w:r>
     </w:p>
   </w:footnote>
@@ -11765,7 +11883,7 @@
         <w:footnoteRef/>
       </w:r>
       <w:r>
-        <w:t xml:space="preserve"> [Quelle einfügen: Bearbeiter, in: Werk, § … Rn. …; BGH, Urt. v. … – Az. …, Fundstelle …]</w:t>
+        <w:t xml:space="preserve"> </w:t>
       </w:r>
     </w:p>
   </w:footnote>
@@ -11781,7 +11899,7 @@
         <w:footnoteRef/>
       </w:r>
       <w:r>
-        <w:t xml:space="preserve"> [Quelle einfügen: Bearbeiter, in: Werk, § … Rn. …; BGH, Urt. v. … – Az. …, Fundstelle …]</w:t>
+        <w:t xml:space="preserve"> </w:t>
       </w:r>
     </w:p>
   </w:footnote>
@@ -11797,7 +11915,7 @@
         <w:footnoteRef/>
       </w:r>
       <w:r>
-        <w:t xml:space="preserve"> [Quelle einfügen: Bearbeiter, in: Werk, § … Rn. …; BGH, Urt. v. … – Az. …, Fundstelle …; Bearbeiter, in: Werk, § … Rn. …; Bearbeiter, in: Werk, § … Rn. …]</w:t>
+        <w:t xml:space="preserve"> </w:t>
       </w:r>
     </w:p>
   </w:footnote>
@@ -11813,7 +11931,7 @@
         <w:footnoteRef/>
       </w:r>
       <w:r>
-        <w:t xml:space="preserve"> [Quelle einfügen: Bearbeiter, in: Werk, § … Rn. …; BGH, Urt. v. … – Az. …, Fundstelle …]</w:t>
+        <w:t xml:space="preserve"> </w:t>
       </w:r>
     </w:p>
   </w:footnote>
@@ -11829,7 +11947,7 @@
         <w:footnoteRef/>
       </w:r>
       <w:r>
-        <w:t xml:space="preserve"> [Quelle einfügen: Bearbeiter, in: Werk, § … Rn. …; BGH, Urt. v. … – Az. …, Fundstelle …]</w:t>
+        <w:t xml:space="preserve"> </w:t>
       </w:r>
     </w:p>
   </w:footnote>
@@ -11845,7 +11963,7 @@
         <w:footnoteRef/>
       </w:r>
       <w:r>
-        <w:t xml:space="preserve"> [Quelle einfügen: Bearbeiter, in: Werk, § … Rn. …; BGH, Urt. v. … – Az. …, Fundstelle …; Bearbeiter, in: Werk, § … Rn. …]</w:t>
+        <w:t xml:space="preserve"> </w:t>
       </w:r>
     </w:p>
   </w:footnote>
@@ -11861,7 +11979,7 @@
         <w:footnoteRef/>
       </w:r>
       <w:r>
-        <w:t xml:space="preserve"> [Quelle einfügen: Bearbeiter, in: Werk, § … Rn. …; BGH, Urt. v. … – Az. …, Fundstelle …; Bearbeiter, in: Werk, § … Rn. …]</w:t>
+        <w:t xml:space="preserve"> </w:t>
       </w:r>
     </w:p>
   </w:footnote>
@@ -11877,7 +11995,7 @@
         <w:footnoteRef/>
       </w:r>
       <w:r>
-        <w:t xml:space="preserve"> [Quelle einfügen]</w:t>
+        <w:t xml:space="preserve"> </w:t>
       </w:r>
     </w:p>
   </w:footnote>
@@ -11893,7 +12011,7 @@
         <w:footnoteRef/>
       </w:r>
       <w:r>
-        <w:t xml:space="preserve"> [Quelle einfügen: Bearbeiter, in: Werk, § … Rn. …; BGH, Urt. v. … – Az. …, Fundstelle …; Bearbeiter, in: Werk, § … Rn. …]</w:t>
+        <w:t xml:space="preserve"> </w:t>
       </w:r>
     </w:p>
   </w:footnote>
@@ -11909,7 +12027,7 @@
         <w:footnoteRef/>
       </w:r>
       <w:r>
-        <w:t xml:space="preserve"> [Quelle einfügen: Bearbeiter, in: Werk, § … Rn. …; BGH, Urt. v. … – Az. …, Fundstelle …; Bearbeiter, in: Werk, § … Rn. …; Bearbeiter, in: Werk, § … Rn. …; BGH, Urt. v. … – Az. …, Fundstelle …; Bearbeiter, in: Werk, § … Rn. …]</w:t>
+        <w:t xml:space="preserve"> </w:t>
       </w:r>
     </w:p>
   </w:footnote>
@@ -11925,7 +12043,7 @@
         <w:footnoteRef/>
       </w:r>
       <w:r>
-        <w:t xml:space="preserve"> [Quelle einfügen]</w:t>
+        <w:t xml:space="preserve"> </w:t>
       </w:r>
     </w:p>
   </w:footnote>
@@ -11941,7 +12059,7 @@
         <w:footnoteRef/>
       </w:r>
       <w:r>
-        <w:t xml:space="preserve"> [Quelle einfügen: Bearbeiter, in: Werk, § … Rn. …; BGH, Urt. v. … – Az. …, Fundstelle …; Bearbeiter, in: Werk, § … Rn. …]</w:t>
+        <w:t xml:space="preserve"> </w:t>
       </w:r>
     </w:p>
   </w:footnote>
@@ -11957,7 +12075,7 @@
         <w:footnoteRef/>
       </w:r>
       <w:r>
-        <w:t xml:space="preserve"> [Quelle einfügen: Bearbeiter, in: Werk, § … Rn. …; BGH, Urt. v. … – Az. …, Fundstelle …]</w:t>
+        <w:t xml:space="preserve"> </w:t>
       </w:r>
     </w:p>
   </w:footnote>
@@ -11973,7 +12091,7 @@
         <w:footnoteRef/>
       </w:r>
       <w:r>
-        <w:t xml:space="preserve"> [Quelle einfügen]</w:t>
+        <w:t xml:space="preserve"> </w:t>
       </w:r>
     </w:p>
   </w:footnote>
@@ -11989,7 +12107,7 @@
         <w:footnoteRef/>
       </w:r>
       <w:r>
-        <w:t xml:space="preserve"> [Quelle einfügen: Bearbeiter, in: Werk, § … Rn. …; BGH, Urt. v. … – Az. …, Fundstelle …; Bearbeiter, in: Werk, § … Rn. …; Bearbeiter, in: Werk, § … Rn. …; BGH, Urt. v. … – Az. …, Fundstelle …]</w:t>
+        <w:t xml:space="preserve"> </w:t>
       </w:r>
     </w:p>
   </w:footnote>
@@ -12005,7 +12123,7 @@
         <w:footnoteRef/>
       </w:r>
       <w:r>
-        <w:t xml:space="preserve"> [Quelle einfügen]</w:t>
+        <w:t xml:space="preserve"> </w:t>
       </w:r>
     </w:p>
   </w:footnote>
@@ -12021,7 +12139,7 @@
         <w:footnoteRef/>
       </w:r>
       <w:r>
-        <w:t xml:space="preserve"> [Quelle einfügen: Bearbeiter, in: Werk, § … Rn. …; BGH, Urt. v. … – Az. …, Fundstelle …; Bearbeiter, in: Werk, § … Rn. …]</w:t>
+        <w:t xml:space="preserve"> </w:t>
       </w:r>
     </w:p>
   </w:footnote>
@@ -12037,7 +12155,7 @@
         <w:footnoteRef/>
       </w:r>
       <w:r>
-        <w:t xml:space="preserve"> [Quelle einfügen: Bearbeiter, in: Werk, § … Rn. …; BGH, Urt. v. … – Az. …, Fundstelle …; Bearbeiter, in: Werk, § … Rn. …]</w:t>
+        <w:t xml:space="preserve"> </w:t>
       </w:r>
     </w:p>
   </w:footnote>
@@ -12053,7 +12171,7 @@
         <w:footnoteRef/>
       </w:r>
       <w:r>
-        <w:t xml:space="preserve"> [Quelle einfügen]</w:t>
+        <w:t xml:space="preserve"> </w:t>
       </w:r>
     </w:p>
   </w:footnote>
@@ -12069,7 +12187,7 @@
         <w:footnoteRef/>
       </w:r>
       <w:r>
-        <w:t xml:space="preserve"> [Quelle einfügen: Bearbeiter, in: Werk, § … Rn. …; BGH, Urt. v. … – Az. …, Fundstelle …; Bearbeiter, in: Werk, § … Rn. …]</w:t>
+        <w:t xml:space="preserve"> </w:t>
       </w:r>
     </w:p>
   </w:footnote>
@@ -12085,7 +12203,7 @@
         <w:footnoteRef/>
       </w:r>
       <w:r>
-        <w:t xml:space="preserve"> [Quelle einfügen]</w:t>
+        <w:t xml:space="preserve"> </w:t>
       </w:r>
     </w:p>
   </w:footnote>
@@ -12101,7 +12219,7 @@
         <w:footnoteRef/>
       </w:r>
       <w:r>
-        <w:t xml:space="preserve"> [Quelle einfügen]</w:t>
+        <w:t xml:space="preserve"> </w:t>
       </w:r>
     </w:p>
   </w:footnote>
@@ -12117,7 +12235,7 @@
         <w:footnoteRef/>
       </w:r>
       <w:r>
-        <w:t xml:space="preserve"> [Quelle einfügen]</w:t>
+        <w:t xml:space="preserve"> </w:t>
       </w:r>
     </w:p>
   </w:footnote>
@@ -12133,7 +12251,7 @@
         <w:footnoteRef/>
       </w:r>
       <w:r>
-        <w:t xml:space="preserve"> [Quelle einfügen]</w:t>
+        <w:t xml:space="preserve"> </w:t>
       </w:r>
     </w:p>
   </w:footnote>
@@ -12149,7 +12267,7 @@
         <w:footnoteRef/>
       </w:r>
       <w:r>
-        <w:t xml:space="preserve"> [Quelle einfügen]</w:t>
+        <w:t xml:space="preserve"> </w:t>
       </w:r>
     </w:p>
   </w:footnote>
@@ -12165,7 +12283,7 @@
         <w:footnoteRef/>
       </w:r>
       <w:r>
-        <w:t xml:space="preserve"> [Quelle einfügen]</w:t>
+        <w:t xml:space="preserve"> </w:t>
       </w:r>
     </w:p>
   </w:footnote>
@@ -12181,7 +12299,7 @@
         <w:footnoteRef/>
       </w:r>
       <w:r>
-        <w:t xml:space="preserve"> [Quelle einfügen: Bearbeiter, in: Werk, § … Rn. …; BGH, Urt. v. … – Az. …, Fundstelle …; Bearbeiter, in: Werk, § … Rn. …; Bearbeiter, in: Werk, § … Rn. …]</w:t>
+        <w:t xml:space="preserve"> </w:t>
       </w:r>
     </w:p>
   </w:footnote>
@@ -12197,7 +12315,7 @@
         <w:footnoteRef/>
       </w:r>
       <w:r>
-        <w:t xml:space="preserve"> [Quelle einfügen]</w:t>
+        <w:t xml:space="preserve"> </w:t>
       </w:r>
     </w:p>
   </w:footnote>
@@ -12213,7 +12331,7 @@
         <w:footnoteRef/>
       </w:r>
       <w:r>
-        <w:t xml:space="preserve"> [Quelle einfügen: Bearbeiter, in: Werk, § … Rn. …; BGH, Urt. v. … – Az. …, Fundstelle …; Bearbeiter, in: Werk, § … Rn. …; Bearbeiter, in: Werk, § … Rn. …]</w:t>
+        <w:t xml:space="preserve"> </w:t>
       </w:r>
     </w:p>
   </w:footnote>
@@ -12229,7 +12347,7 @@
         <w:footnoteRef/>
       </w:r>
       <w:r>
-        <w:t xml:space="preserve"> [Quelle einfügen: Bearbeiter, in: Werk, § … Rn. …; BGH, Urt. v. … – Az. …, Fundstelle …]</w:t>
+        <w:t xml:space="preserve"> </w:t>
       </w:r>
     </w:p>
   </w:footnote>
@@ -12245,7 +12363,7 @@
         <w:footnoteRef/>
       </w:r>
       <w:r>
-        <w:t xml:space="preserve"> [Quelle einfügen: Bearbeiter, in: Werk, § … Rn. …; BGH, Urt. v. … – Az. …, Fundstelle …; Bearbeiter, in: Werk, § … Rn. …; Bearbeiter, in: Werk, § … Rn. …; BGH, Urt. v. … – Az. …, Fundstelle …]</w:t>
+        <w:t xml:space="preserve"> </w:t>
       </w:r>
     </w:p>
   </w:footnote>
@@ -12261,7 +12379,7 @@
         <w:footnoteRef/>
       </w:r>
       <w:r>
-        <w:t xml:space="preserve"> [Quelle einfügen: Bearbeiter, in: Werk, § … Rn. …; BGH, Urt. v. … – Az. …, Fundstelle …; Bearbeiter, in: Werk, § … Rn. …]</w:t>
+        <w:t xml:space="preserve"> </w:t>
       </w:r>
     </w:p>
   </w:footnote>
@@ -12277,7 +12395,7 @@
         <w:footnoteRef/>
       </w:r>
       <w:r>
-        <w:t xml:space="preserve"> [Quelle einfügen: Bearbeiter, in: Werk, § … Rn. …; BGH, Urt. v. … – Az. …, Fundstelle …; Bearbeiter, in: Werk, § … Rn. …; Bearbeiter, in: Werk, § … Rn. …]</w:t>
+        <w:t xml:space="preserve"> </w:t>
       </w:r>
     </w:p>
   </w:footnote>
@@ -12293,7 +12411,7 @@
         <w:footnoteRef/>
       </w:r>
       <w:r>
-        <w:t xml:space="preserve"> [Quelle einfügen]</w:t>
+        <w:t xml:space="preserve"> </w:t>
       </w:r>
     </w:p>
   </w:footnote>
@@ -12309,7 +12427,7 @@
         <w:footnoteRef/>
       </w:r>
       <w:r>
-        <w:t xml:space="preserve"> [Quelle einfügen]</w:t>
+        <w:t xml:space="preserve"> </w:t>
       </w:r>
     </w:p>
   </w:footnote>
@@ -12325,7 +12443,7 @@
         <w:footnoteRef/>
       </w:r>
       <w:r>
-        <w:t xml:space="preserve"> [Quelle einfügen]</w:t>
+        <w:t xml:space="preserve"> </w:t>
       </w:r>
     </w:p>
   </w:footnote>
@@ -12341,7 +12459,7 @@
         <w:footnoteRef/>
       </w:r>
       <w:r>
-        <w:t xml:space="preserve"> [Quelle einfügen: Bearbeiter, in: Werk, § … Rn. …; BGH, Urt. v. … – Az. …, Fundstelle …; Bearbeiter, in: Werk, § … Rn. …]</w:t>
+        <w:t xml:space="preserve"> </w:t>
       </w:r>
     </w:p>
   </w:footnote>
@@ -12357,7 +12475,7 @@
         <w:footnoteRef/>
       </w:r>
       <w:r>
-        <w:t xml:space="preserve"> [Quelle einfügen]</w:t>
+        <w:t xml:space="preserve"> </w:t>
       </w:r>
     </w:p>
   </w:footnote>
@@ -12373,7 +12491,7 @@
         <w:footnoteRef/>
       </w:r>
       <w:r>
-        <w:t xml:space="preserve"> [Quelle einfügen]</w:t>
+        <w:t xml:space="preserve"> </w:t>
       </w:r>
     </w:p>
   </w:footnote>
@@ -12389,7 +12507,7 @@
         <w:footnoteRef/>
       </w:r>
       <w:r>
-        <w:t xml:space="preserve"> [Quelle einfügen]</w:t>
+        <w:t xml:space="preserve"> </w:t>
       </w:r>
     </w:p>
   </w:footnote>
@@ -12405,7 +12523,7 @@
         <w:footnoteRef/>
       </w:r>
       <w:r>
-        <w:t xml:space="preserve"> [Quelle einfügen]</w:t>
+        <w:t xml:space="preserve"> </w:t>
       </w:r>
     </w:p>
   </w:footnote>
@@ -12421,7 +12539,7 @@
         <w:footnoteRef/>
       </w:r>
       <w:r>
-        <w:t xml:space="preserve"> [Quelle einfügen]</w:t>
+        <w:t xml:space="preserve"> </w:t>
       </w:r>
     </w:p>
   </w:footnote>
@@ -12437,7 +12555,7 @@
         <w:footnoteRef/>
       </w:r>
       <w:r>
-        <w:t xml:space="preserve"> [Quelle einfügen]</w:t>
+        <w:t xml:space="preserve"> </w:t>
       </w:r>
     </w:p>
   </w:footnote>
@@ -12453,7 +12571,7 @@
         <w:footnoteRef/>
       </w:r>
       <w:r>
-        <w:t xml:space="preserve"> [Quelle einfügen]</w:t>
+        <w:t xml:space="preserve"> </w:t>
       </w:r>
     </w:p>
   </w:footnote>
@@ -12469,7 +12587,7 @@
         <w:footnoteRef/>
       </w:r>
       <w:r>
-        <w:t xml:space="preserve"> [Quelle einfügen: Bearbeiter, in: Werk, § … Rn. …; BGH, Urt. v. … – Az. …, Fundstelle …; Bearbeiter, in: Werk, § … Rn. …; Bearbeiter, in: Werk, § … Rn. …]</w:t>
+        <w:t xml:space="preserve"> </w:t>
       </w:r>
     </w:p>
   </w:footnote>
@@ -12485,7 +12603,7 @@
         <w:footnoteRef/>
       </w:r>
       <w:r>
-        <w:t xml:space="preserve"> [Quelle einfügen]</w:t>
+        <w:t xml:space="preserve"> </w:t>
       </w:r>
     </w:p>
   </w:footnote>
@@ -12501,7 +12619,7 @@
         <w:footnoteRef/>
       </w:r>
       <w:r>
-        <w:t xml:space="preserve"> [Quelle einfügen]</w:t>
+        <w:t xml:space="preserve"> </w:t>
       </w:r>
     </w:p>
   </w:footnote>
@@ -12517,7 +12635,7 @@
         <w:footnoteRef/>
       </w:r>
       <w:r>
-        <w:t xml:space="preserve"> [Quelle einfügen: Bearbeiter, in: Werk, § … Rn. …; BGH, Urt. v. … – Az. …, Fundstelle …; Bearbeiter, in: Werk, § … Rn. …]</w:t>
+        <w:t xml:space="preserve"> </w:t>
       </w:r>
     </w:p>
   </w:footnote>
@@ -12533,7 +12651,7 @@
         <w:footnoteRef/>
       </w:r>
       <w:r>
-        <w:t xml:space="preserve"> [Quelle einfügen: Bearbeiter, in: Werk, § … Rn. …; BGH, Urt. v. … – Az. …, Fundstelle …]</w:t>
+        <w:t xml:space="preserve"> </w:t>
       </w:r>
     </w:p>
   </w:footnote>
@@ -12549,7 +12667,7 @@
         <w:footnoteRef/>
       </w:r>
       <w:r>
-        <w:t xml:space="preserve"> [Quelle einfügen]</w:t>
+        <w:t xml:space="preserve"> </w:t>
       </w:r>
     </w:p>
   </w:footnote>
@@ -12565,7 +12683,7 @@
         <w:footnoteRef/>
       </w:r>
       <w:r>
-        <w:t xml:space="preserve"> [Quelle einfügen]</w:t>
+        <w:t xml:space="preserve"> </w:t>
       </w:r>
     </w:p>
   </w:footnote>
@@ -12581,7 +12699,7 @@
         <w:footnoteRef/>
       </w:r>
       <w:r>
-        <w:t xml:space="preserve"> [Quelle einfügen]</w:t>
+        <w:t xml:space="preserve"> </w:t>
       </w:r>
     </w:p>
   </w:footnote>
@@ -12597,7 +12715,7 @@
         <w:footnoteRef/>
       </w:r>
       <w:r>
-        <w:t xml:space="preserve"> [Quelle einfügen: Bearbeiter, in: Werk, § … Rn. …; BGH, Urt. v. … – Az. …, Fundstelle …; Bearbeiter, in: Werk, § … Rn. …; Bearbeiter, in: Werk, § … Rn. …]</w:t>
+        <w:t xml:space="preserve"> </w:t>
       </w:r>
     </w:p>
   </w:footnote>
@@ -12613,7 +12731,7 @@
         <w:footnoteRef/>
       </w:r>
       <w:r>
-        <w:t xml:space="preserve"> [Quelle einfügen]</w:t>
+        <w:t xml:space="preserve"> </w:t>
       </w:r>
     </w:p>
   </w:footnote>
@@ -12629,7 +12747,7 @@
         <w:footnoteRef/>
       </w:r>
       <w:r>
-        <w:t xml:space="preserve"> [Quelle einfügen]</w:t>
+        <w:t xml:space="preserve"> </w:t>
       </w:r>
     </w:p>
   </w:footnote>
@@ -12645,7 +12763,7 @@
         <w:footnoteRef/>
       </w:r>
       <w:r>
-        <w:t xml:space="preserve"> [Quelle einfügen]</w:t>
+        <w:t xml:space="preserve"> </w:t>
       </w:r>
     </w:p>
   </w:footnote>
@@ -12661,7 +12779,7 @@
         <w:footnoteRef/>
       </w:r>
       <w:r>
-        <w:t xml:space="preserve"> [Quelle einfügen]</w:t>
+        <w:t xml:space="preserve"> </w:t>
       </w:r>
     </w:p>
   </w:footnote>
@@ -12677,7 +12795,7 @@
         <w:footnoteRef/>
       </w:r>
       <w:r>
-        <w:t xml:space="preserve"> [Quelle einfügen]</w:t>
+        <w:t xml:space="preserve"> </w:t>
       </w:r>
     </w:p>
   </w:footnote>
@@ -12693,7 +12811,7 @@
         <w:footnoteRef/>
       </w:r>
       <w:r>
-        <w:t xml:space="preserve"> [Quelle einfügen]</w:t>
+        <w:t xml:space="preserve"> </w:t>
       </w:r>
     </w:p>
   </w:footnote>
@@ -12709,7 +12827,7 @@
         <w:footnoteRef/>
       </w:r>
       <w:r>
-        <w:t xml:space="preserve"> [Quelle einfügen]</w:t>
+        <w:t xml:space="preserve"> </w:t>
       </w:r>
     </w:p>
   </w:footnote>
@@ -12725,7 +12843,7 @@
         <w:footnoteRef/>
       </w:r>
       <w:r>
-        <w:t xml:space="preserve"> [Quelle einfügen: Bearbeiter, in: Werk, § … Rn. …; BGH, Urt. v. … – Az. …, Fundstelle …; Bearbeiter, in: Werk, § … Rn. …]</w:t>
+        <w:t xml:space="preserve"> </w:t>
       </w:r>
     </w:p>
   </w:footnote>
@@ -12741,7 +12859,7 @@
         <w:footnoteRef/>
       </w:r>
       <w:r>
-        <w:t xml:space="preserve"> [Quelle einfügen]</w:t>
+        <w:t xml:space="preserve"> </w:t>
       </w:r>
     </w:p>
   </w:footnote>
@@ -12757,7 +12875,7 @@
         <w:footnoteRef/>
       </w:r>
       <w:r>
-        <w:t xml:space="preserve"> [Quelle einfügen: Bearbeiter, in: Werk, § … Rn. …; BGH, Urt. v. … – Az. …, Fundstelle …; Bearbeiter, in: Werk, § … Rn. …]</w:t>
+        <w:t xml:space="preserve"> </w:t>
       </w:r>
     </w:p>
   </w:footnote>
@@ -12773,7 +12891,7 @@
         <w:footnoteRef/>
       </w:r>
       <w:r>
-        <w:t xml:space="preserve"> [Quelle einfügen]</w:t>
+        <w:t xml:space="preserve"> </w:t>
       </w:r>
     </w:p>
   </w:footnote>
@@ -12789,7 +12907,7 @@
         <w:footnoteRef/>
       </w:r>
       <w:r>
-        <w:t xml:space="preserve"> [Quelle einfügen: Bearbeiter, in: Werk, § … Rn. …; BGH, Urt. v. … – Az. …, Fundstelle …]</w:t>
+        <w:t xml:space="preserve"> </w:t>
       </w:r>
     </w:p>
   </w:footnote>
@@ -12805,7 +12923,7 @@
         <w:footnoteRef/>
       </w:r>
       <w:r>
-        <w:t xml:space="preserve"> [Quelle einfügen]</w:t>
+        <w:t xml:space="preserve"> </w:t>
       </w:r>
     </w:p>
   </w:footnote>
@@ -12821,7 +12939,7 @@
         <w:footnoteRef/>
       </w:r>
       <w:r>
-        <w:t xml:space="preserve"> [Quelle einfügen: Bearbeiter, in: Werk, § … Rn. …; BGH, Urt. v. … – Az. …, Fundstelle …; Bearbeiter, in: Werk, § … Rn. …]</w:t>
+        <w:t xml:space="preserve"> </w:t>
       </w:r>
     </w:p>
   </w:footnote>
@@ -12837,7 +12955,7 @@
         <w:footnoteRef/>
       </w:r>
       <w:r>
-        <w:t xml:space="preserve"> [Quelle einfügen]</w:t>
+        <w:t xml:space="preserve"> </w:t>
       </w:r>
     </w:p>
   </w:footnote>
@@ -12853,7 +12971,7 @@
         <w:footnoteRef/>
       </w:r>
       <w:r>
-        <w:t xml:space="preserve"> [Quelle einfügen]</w:t>
+        <w:t xml:space="preserve"> </w:t>
       </w:r>
     </w:p>
   </w:footnote>
@@ -12869,7 +12987,7 @@
         <w:footnoteRef/>
       </w:r>
       <w:r>
-        <w:t xml:space="preserve"> [Quelle einfügen]</w:t>
+        <w:t xml:space="preserve"> </w:t>
       </w:r>
     </w:p>
   </w:footnote>
@@ -12885,7 +13003,7 @@
         <w:footnoteRef/>
       </w:r>
       <w:r>
-        <w:t xml:space="preserve"> [Quelle einfügen: Bearbeiter, in: Werk, § … Rn. …; BGH, Urt. v. … – Az. …, Fundstelle …]</w:t>
+        <w:t xml:space="preserve"> </w:t>
       </w:r>
     </w:p>
   </w:footnote>
@@ -12901,7 +13019,7 @@
         <w:footnoteRef/>
       </w:r>
       <w:r>
-        <w:t xml:space="preserve"> [Quelle einfügen]</w:t>
+        <w:t xml:space="preserve"> </w:t>
       </w:r>
     </w:p>
   </w:footnote>
@@ -12917,7 +13035,7 @@
         <w:footnoteRef/>
       </w:r>
       <w:r>
-        <w:t xml:space="preserve"> [Quelle einfügen]</w:t>
+        <w:t xml:space="preserve"> </w:t>
       </w:r>
     </w:p>
   </w:footnote>
@@ -12933,7 +13051,7 @@
         <w:footnoteRef/>
       </w:r>
       <w:r>
-        <w:t xml:space="preserve"> [Quelle einfügen: Bearbeiter, in: Werk, § … Rn. …; BGH, Urt. v. … – Az. …, Fundstelle …; Bearbeiter, in: Werk, § … Rn. …]</w:t>
+        <w:t xml:space="preserve"> </w:t>
       </w:r>
     </w:p>
   </w:footnote>
@@ -12949,7 +13067,7 @@
         <w:footnoteRef/>
       </w:r>
       <w:r>
-        <w:t xml:space="preserve"> [Quelle einfügen]</w:t>
+        <w:t xml:space="preserve"> </w:t>
       </w:r>
     </w:p>
   </w:footnote>
@@ -12965,7 +13083,7 @@
         <w:footnoteRef/>
       </w:r>
       <w:r>
-        <w:t xml:space="preserve"> [Quelle einfügen]</w:t>
+        <w:t xml:space="preserve"> </w:t>
       </w:r>
     </w:p>
   </w:footnote>
@@ -12981,7 +13099,7 @@
         <w:footnoteRef/>
       </w:r>
       <w:r>
-        <w:t xml:space="preserve"> [Quelle einfügen: Bearbeiter, in: Werk, § … Rn. …; BGH, Urt. v. … – Az. …, Fundstelle …]</w:t>
+        <w:t xml:space="preserve"> </w:t>
       </w:r>
     </w:p>
   </w:footnote>
@@ -12997,7 +13115,7 @@
         <w:footnoteRef/>
       </w:r>
       <w:r>
-        <w:t xml:space="preserve"> [Quelle einfügen]</w:t>
+        <w:t xml:space="preserve"> </w:t>
       </w:r>
     </w:p>
   </w:footnote>
@@ -13013,7 +13131,7 @@
         <w:footnoteRef/>
       </w:r>
       <w:r>
-        <w:t xml:space="preserve"> [Quelle einfügen: Bearbeiter, in: Werk, § … Rn. …; BGH, Urt. v. … – Az. …, Fundstelle …]</w:t>
+        <w:t xml:space="preserve"> </w:t>
       </w:r>
     </w:p>
   </w:footnote>
@@ -13029,7 +13147,7 @@
         <w:footnoteRef/>
       </w:r>
       <w:r>
-        <w:t xml:space="preserve"> [Quelle einfügen]</w:t>
+        <w:t xml:space="preserve"> </w:t>
       </w:r>
     </w:p>
   </w:footnote>
@@ -13045,7 +13163,7 @@
         <w:footnoteRef/>
       </w:r>
       <w:r>
-        <w:t xml:space="preserve"> [Quelle einfügen]</w:t>
+        <w:t xml:space="preserve"> </w:t>
       </w:r>
     </w:p>
   </w:footnote>
@@ -13061,7 +13179,7 @@
         <w:footnoteRef/>
       </w:r>
       <w:r>
-        <w:t xml:space="preserve"> [Quelle einfügen]</w:t>
+        <w:t xml:space="preserve"> </w:t>
       </w:r>
     </w:p>
   </w:footnote>
@@ -13077,7 +13195,7 @@
         <w:footnoteRef/>
       </w:r>
       <w:r>
-        <w:t xml:space="preserve"> [Quelle einfügen]</w:t>
+        <w:t xml:space="preserve"> </w:t>
       </w:r>
     </w:p>
   </w:footnote>
@@ -13093,7 +13211,7 @@
         <w:footnoteRef/>
       </w:r>
       <w:r>
-        <w:t xml:space="preserve"> [Quelle einfügen: Bearbeiter, in: Werk, § … Rn. …; BGH, Urt. v. … – Az. …, Fundstelle …]</w:t>
+        <w:t xml:space="preserve"> </w:t>
       </w:r>
     </w:p>
   </w:footnote>
@@ -13109,7 +13227,7 @@
         <w:footnoteRef/>
       </w:r>
       <w:r>
-        <w:t xml:space="preserve"> [Quelle einfügen: Bearbeiter, in: Werk, § … Rn. …; BGH, Urt. v. … – Az. …, Fundstelle …; Bearbeiter, in: Werk, § … Rn. …; Bearbeiter, in: Werk, § … Rn. …; BGH, Urt. v. … – Az. …, Fundstelle …; Bearbeiter, in: Werk, § … Rn. …; Bearbeiter, in: Werk, § … Rn. …; BGH, Urt. v. … – Az. …, Fundstelle …; Bearbeiter, in: Werk, § … Rn. …; Bearbeiter, in: Werk, § … Rn. …; BGH, Urt. v. … – Az. …, Fundstelle …]</w:t>
+        <w:t xml:space="preserve"> </w:t>
       </w:r>
     </w:p>
   </w:footnote>
@@ -13125,7 +13243,7 @@
         <w:footnoteRef/>
       </w:r>
       <w:r>
-        <w:t xml:space="preserve"> [Quelle einfügen]</w:t>
+        <w:t xml:space="preserve"> </w:t>
       </w:r>
     </w:p>
   </w:footnote>
@@ -13141,7 +13259,7 @@
         <w:footnoteRef/>
       </w:r>
       <w:r>
-        <w:t xml:space="preserve"> [Quelle einfügen]</w:t>
+        <w:t xml:space="preserve"> </w:t>
       </w:r>
     </w:p>
   </w:footnote>
@@ -13157,7 +13275,7 @@
         <w:footnoteRef/>
       </w:r>
       <w:r>
-        <w:t xml:space="preserve"> [Quelle einfügen]</w:t>
+        <w:t xml:space="preserve"> </w:t>
       </w:r>
     </w:p>
   </w:footnote>
@@ -13173,7 +13291,7 @@
         <w:footnoteRef/>
       </w:r>
       <w:r>
-        <w:t xml:space="preserve"> [Quelle einfügen]</w:t>
+        <w:t xml:space="preserve"> </w:t>
       </w:r>
     </w:p>
   </w:footnote>
@@ -13189,7 +13307,7 @@
         <w:footnoteRef/>
       </w:r>
       <w:r>
-        <w:t xml:space="preserve"> [Quelle einfügen]</w:t>
+        <w:t xml:space="preserve"> </w:t>
       </w:r>
     </w:p>
   </w:footnote>
@@ -13205,7 +13323,7 @@
         <w:footnoteRef/>
       </w:r>
       <w:r>
-        <w:t xml:space="preserve"> [Quelle einfügen: Bearbeiter, in: Werk, § … Rn. …; BGH, Urt. v. … – Az. …, Fundstelle …; Bearbeiter, in: Werk, § … Rn. …]</w:t>
+        <w:t xml:space="preserve"> </w:t>
       </w:r>
     </w:p>
   </w:footnote>
@@ -13221,7 +13339,7 @@
         <w:footnoteRef/>
       </w:r>
       <w:r>
-        <w:t xml:space="preserve"> [Quelle einfügen]</w:t>
+        <w:t xml:space="preserve"> </w:t>
       </w:r>
     </w:p>
   </w:footnote>
@@ -13237,7 +13355,7 @@
         <w:footnoteRef/>
       </w:r>
       <w:r>
-        <w:t xml:space="preserve"> [Quelle einfügen]</w:t>
+        <w:t xml:space="preserve"> </w:t>
       </w:r>
     </w:p>
   </w:footnote>
@@ -13253,7 +13371,7 @@
         <w:footnoteRef/>
       </w:r>
       <w:r>
-        <w:t xml:space="preserve"> [Quelle einfügen]</w:t>
+        <w:t xml:space="preserve"> </w:t>
       </w:r>
     </w:p>
   </w:footnote>
@@ -13269,7 +13387,7 @@
         <w:footnoteRef/>
       </w:r>
       <w:r>
-        <w:t xml:space="preserve"> [Quelle einfügen]</w:t>
+        <w:t xml:space="preserve"> </w:t>
       </w:r>
     </w:p>
   </w:footnote>
@@ -13285,7 +13403,7 @@
         <w:footnoteRef/>
       </w:r>
       <w:r>
-        <w:t xml:space="preserve"> [Quelle einfügen: Bearbeiter, in: Werk, § … Rn. …; BGH, Urt. v. … – Az. …, Fundstelle …]</w:t>
+        <w:t xml:space="preserve"> </w:t>
       </w:r>
     </w:p>
   </w:footnote>
@@ -13301,7 +13419,7 @@
         <w:footnoteRef/>
       </w:r>
       <w:r>
-        <w:t xml:space="preserve"> [Quelle einfügen]</w:t>
+        <w:t xml:space="preserve"> </w:t>
       </w:r>
     </w:p>
   </w:footnote>
@@ -13317,7 +13435,7 @@
         <w:footnoteRef/>
       </w:r>
       <w:r>
-        <w:t xml:space="preserve"> [Quelle einfügen: Bearbeiter, in: Werk, § … Rn. …; BGH, Urt. v. … – Az. …, Fundstelle …; Bearbeiter, in: Werk, § … Rn. …]</w:t>
+        <w:t xml:space="preserve"> </w:t>
       </w:r>
     </w:p>
   </w:footnote>
@@ -13333,7 +13451,7 @@
         <w:footnoteRef/>
       </w:r>
       <w:r>
-        <w:t xml:space="preserve"> [Quelle einfügen]</w:t>
+        <w:t xml:space="preserve"> </w:t>
       </w:r>
     </w:p>
   </w:footnote>
@@ -13349,7 +13467,7 @@
         <w:footnoteRef/>
       </w:r>
       <w:r>
-        <w:t xml:space="preserve"> [Quelle einfügen: Bearbeiter, in: Werk, § … Rn. …; BGH, Urt. v. … – Az. …, Fundstelle …]</w:t>
+        <w:t xml:space="preserve"> </w:t>
       </w:r>
     </w:p>
   </w:footnote>
@@ -13365,7 +13483,7 @@
         <w:footnoteRef/>
       </w:r>
       <w:r>
-        <w:t xml:space="preserve"> [Quelle einfügen]</w:t>
+        <w:t xml:space="preserve"> </w:t>
       </w:r>
     </w:p>
   </w:footnote>
@@ -13381,7 +13499,7 @@
         <w:footnoteRef/>
       </w:r>
       <w:r>
-        <w:t xml:space="preserve"> [Quelle einfügen]</w:t>
+        <w:t xml:space="preserve"> </w:t>
       </w:r>
     </w:p>
   </w:footnote>
@@ -13397,7 +13515,71 @@
         <w:footnoteRef/>
       </w:r>
       <w:r>
-        <w:t xml:space="preserve"> [Quelle einfügen]</w:t>
+        <w:t xml:space="preserve"> </w:t>
+      </w:r>
+    </w:p>
+  </w:footnote>
+  <w:footnote w:id="134">
+    <w:p>
+      <w:pPr>
+        <w:pStyle w:val="Funotentext"/>
+      </w:pPr>
+      <w:r>
+        <w:rPr>
+          <w:rStyle w:val="Funotenzeichen"/>
+        </w:rPr>
+        <w:footnoteRef/>
+      </w:r>
+      <w:r>
+        <w:t xml:space="preserve"> </w:t>
+      </w:r>
+    </w:p>
+  </w:footnote>
+  <w:footnote w:id="135">
+    <w:p>
+      <w:pPr>
+        <w:pStyle w:val="Funotentext"/>
+      </w:pPr>
+      <w:r>
+        <w:rPr>
+          <w:rStyle w:val="Funotenzeichen"/>
+        </w:rPr>
+        <w:footnoteRef/>
+      </w:r>
+      <w:r>
+        <w:t xml:space="preserve"> </w:t>
+      </w:r>
+    </w:p>
+  </w:footnote>
+  <w:footnote w:id="136">
+    <w:p>
+      <w:pPr>
+        <w:pStyle w:val="Funotentext"/>
+      </w:pPr>
+      <w:r>
+        <w:rPr>
+          <w:rStyle w:val="Funotenzeichen"/>
+        </w:rPr>
+        <w:footnoteRef/>
+      </w:r>
+      <w:r>
+        <w:t xml:space="preserve"> </w:t>
+      </w:r>
+    </w:p>
+  </w:footnote>
+  <w:footnote w:id="137">
+    <w:p>
+      <w:pPr>
+        <w:pStyle w:val="Funotentext"/>
+      </w:pPr>
+      <w:r>
+        <w:rPr>
+          <w:rStyle w:val="Funotenzeichen"/>
+        </w:rPr>
+        <w:footnoteRef/>
+      </w:r>
+      <w:r>
+        <w:t xml:space="preserve"> </w:t>
       </w:r>
     </w:p>
   </w:footnote>

</xml_diff>